<commit_message>
Re-extract S366 from full text and redo its RoB 2 cluster appraisal; abstract-only extractions 69 -> 68
Co-Authored-By: Claude Sonnet 5.5 <noreply@anthropic.com>
Claude-Session: https://claude.ai/code/session_014MhMGnb8qDcM9MkpTmcbeG
</commit_message>
<xml_diff>
--- a/legal-last-mile-systematic-review/06_outputs/PRELIMINARY_RESULTS_REPORT_2026-09-29.docx
+++ b/legal-last-mile-systematic-review/06_outputs/PRELIMINARY_RESULTS_REPORT_2026-09-29.docx
@@ -414,7 +414,7 @@
               <w:rPr>
                 <w:sz w:val="17"/>
               </w:rPr>
-              <w:t xml:space="preserve">1,159 studies, 92 codebook fields, by the AI; 69 from abstract/metadata only; no second extractor</w:t>
+              <w:t xml:space="preserve">1,159 studies, 92 codebook fields, by the AI; 68 from abstract/metadata only; no second extractor</w:t>
             </w:r>
           </w:p>
         </w:tc>
@@ -1309,7 +1309,7 @@
               <w:rPr>
                 <w:sz w:val="17"/>
               </w:rPr>
-              <w:t xml:space="preserve">439</w:t>
+              <w:t xml:space="preserve">440</w:t>
             </w:r>
           </w:p>
         </w:tc>
@@ -1492,7 +1492,7 @@
               <w:rPr>
                 <w:sz w:val="17"/>
               </w:rPr>
-              <w:t xml:space="preserve">205</w:t>
+              <w:t xml:space="preserve">206</w:t>
             </w:r>
           </w:p>
         </w:tc>
@@ -4756,7 +4756,7 @@
         <w:pStyle w:val="Compact"/>
       </w:pPr>
       <w:r>
-        <w:t xml:space="preserve">69 studies were extracted from abstract or metadata only (6.0%); none has an effect-size row, so the SWiM syntheses are unaffected, but descriptive counts and ratings include them. There is no second extractor: extracted values have not been checked against the source papers.</w:t>
+        <w:t xml:space="preserve">68 studies were extracted from abstract or metadata only (5.9%); none has an effect-size row, so the SWiM syntheses are unaffected, but descriptive counts and ratings include them. There is no second extractor: extracted values have not been checked against the source papers.</w:t>
       </w:r>
     </w:p>
     <w:p>
@@ -5006,7 +5006,7 @@
           <w:bCs/>
           <w:b/>
         </w:rPr>
-        <w:t xml:space="preserve">Do the randomised trials need the cluster version of RoB 2? Yes for all five — but one is inferred and one is unverified.</w:t>
+        <w:t xml:space="preserve">Do the randomised trials need the cluster version of RoB 2? Yes for all five — one unit is inferred, and S366 has now been re-read in full.</w:t>
       </w:r>
     </w:p>
     <w:p>
@@ -5100,7 +5100,7 @@
         <w:t xml:space="preserve"> </w:t>
       </w:r>
       <w:r>
-        <w:t xml:space="preserve">was extracted from abstract/introduction text only, and its RoB 2 rating is labelled LOW-CONFIDENCE in its own rating field. S366 and S294 report the same DRC cluster trial, so the 5 RoB 2 studies are</w:t>
+        <w:t xml:space="preserve">was re-extracted and re-appraised on 2026-09-29 from the full-text PDF you supplied (its earlier abstract-only, low-confidence rating is superseded): Domains 1 and 3 Low, Domains 2 and 5 Some concerns, Domain 4 Some concerns for the primary outcomes and High for the self-reported satisfaction/behaviour indices; Figure 1 and the supplement were not read. S366 and S294 report the same DRC cluster trial, so the 5 RoB 2 studies are</w:t>
       </w:r>
       <w:r>
         <w:t xml:space="preserve"> </w:t>
@@ -5113,7 +5113,10 @@
         <w:t xml:space="preserve">4 distinct trials</w:t>
       </w:r>
       <w:r>
-        <w:t xml:space="preserve">. All five rate "Some concerns"; ratings use many "No information" answers because extraction did not capture trial-conduct details.</w:t>
+        <w:t xml:space="preserve"> </w:t>
+      </w:r>
+      <w:r>
+        <w:t xml:space="preserve">(but different surveys: 1,312 households in S366, 3,283 in S294). All five rate "Some concerns" overall; S057, S085, S294 and S879 still use many "No information" answers because extraction did not capture trial-conduct details.</w:t>
       </w:r>
     </w:p>
     <w:p>
@@ -5361,7 +5364,16 @@
         <w:t xml:space="preserve">Obtain the full text of the abstract-only studies that carry the most weight</w:t>
       </w:r>
       <w:r>
-        <w:t xml:space="preserve">: S366 (RoB 2), the five AMSTAR 2 reviews extracted from abstracts (S319, S324, S325, S326, S344), then the rest of the 69; re-extract.</w:t>
+        <w:t xml:space="preserve">: (S366, the RoB 2 study, was re-extracted 2026-09-29), the five AMSTAR 2 reviews extracted from abstracts (S319, S324, S325, S326, S344), then the rest of the 68; re-extract (</w:t>
+      </w:r>
+      <w:r>
+        <w:rPr>
+          <w:rStyle w:val="VerbatimChar"/>
+        </w:rPr>
+        <w:t xml:space="preserve">03_extraction/extracted_data/abstract_only_fulltext_request_list_2026-09-29.csv</w:t>
+      </w:r>
+      <w:r>
+        <w:t xml:space="preserve">).</w:t>
       </w:r>
     </w:p>
     <w:p>

</xml_diff>

<commit_message>
Re-extract S277 from full text (MMAT re-appraised); abstract-only extractions 67 -> 66
Co-Authored-By: Claude Sonnet 5.5 <noreply@anthropic.com>
Claude-Session: https://claude.ai/code/session_014MhMGnb8qDcM9MkpTmcbeG
</commit_message>
<xml_diff>
--- a/legal-last-mile-systematic-review/06_outputs/PRELIMINARY_RESULTS_REPORT_2026-09-29.docx
+++ b/legal-last-mile-systematic-review/06_outputs/PRELIMINARY_RESULTS_REPORT_2026-09-29.docx
@@ -414,7 +414,7 @@
               <w:rPr>
                 <w:sz w:val="17"/>
               </w:rPr>
-              <w:t xml:space="preserve">1,159 studies, 92 codebook fields, by the AI; 68 from abstract/metadata only; no second extractor</w:t>
+              <w:t xml:space="preserve">1,159 studies, 92 codebook fields, by the AI; 66 from abstract/metadata only; no second extractor</w:t>
             </w:r>
           </w:p>
         </w:tc>
@@ -446,7 +446,7 @@
               <w:rPr>
                 <w:sz w:val="17"/>
               </w:rPr>
-              <w:t xml:space="preserve">Rule-based batch ratings from extracted fields with design-matched tools: RoB 2 5, ROBINS-I 63, JBI Cross-Sectional 140, MMAT 205, CASP Qualitative 263, AMSTAR 2 24, Legal Framework 447, NONE 12. Legal Framework is the project's own</w:t>
+              <w:t xml:space="preserve">Rule-based batch ratings from extracted fields with design-matched tools: RoB 2 5, ROBINS-I 63, JBI Cross-Sectional 140, MMAT 205, CASP Qualitative 263, AMSTAR 2 23, Legal Framework 447, NONE 13. Legal Framework is the project's own</w:t>
             </w:r>
             <w:r>
               <w:rPr>
@@ -582,7 +582,7 @@
         <w:t xml:space="preserve">study_design_class</w:t>
       </w:r>
       <w:r>
-        <w:t xml:space="preserve">; 349 studies carry free-text values outside the 8-value enum — the commonest are variants of "case study", e.g. ethnographic case study (16); qualitative case study (10); they are not in the counts that follow): qualitative 267, mixed-methods 207, observational 147, quasi-experimental 65, doctrinal 44, jurimetric 39, secondary systematic reviews 36, experimental 5. By appraisal tool: RoB 2 5, ROBINS-I 63, JBI Cross-Sectional 140, MMAT 205, CASP Qualitative 263, AMSTAR 2 24, Legal Framework 447, NONE 12.</w:t>
+        <w:t xml:space="preserve">; 349 studies carry free-text values outside the 8-value enum — the commonest are variants of "case study", e.g. ethnographic case study (16); qualitative case study (10); they are not in the counts that follow): qualitative 267, mixed-methods 207, observational 147, quasi-experimental 65, doctrinal 44, jurimetric 39, secondary systematic reviews 36, experimental 5. By appraisal tool: RoB 2 5, ROBINS-I 63, JBI Cross-Sectional 140, MMAT 205, CASP Qualitative 263, AMSTAR 2 23, Legal Framework 447, NONE 13.</w:t>
       </w:r>
     </w:p>
     <w:p>
@@ -638,7 +638,7 @@
         <w:t xml:space="preserve"> </w:t>
       </w:r>
       <w:r>
-        <w:t xml:space="preserve">is free text; 122 studies name several countries or a region and are not counted below): India 133, Brazil 87, South Africa 84, United States 71, Ghana 53, Kenya 49, Mexico 37, Indonesia 30, Nigeria 28, Bangladesh 27. The dissertation's comparison countries are unevenly covered:</w:t>
+        <w:t xml:space="preserve">is free text; 123 studies name several countries or a region and are not counted below): India 133, Brazil 87, South Africa 84, United States 71, Ghana 53, Kenya 49, Mexico 37, Indonesia 30, Nigeria 28, Bangladesh 27. The dissertation's comparison countries are unevenly covered:</w:t>
       </w:r>
       <w:r>
         <w:t xml:space="preserve"> </w:t>
@@ -1021,7 +1021,7 @@
               <w:rPr>
                 <w:sz w:val="17"/>
               </w:rPr>
-              <w:t xml:space="preserve">541</w:t>
+              <w:t xml:space="preserve">542</w:t>
             </w:r>
           </w:p>
         </w:tc>
@@ -1060,7 +1060,7 @@
               <w:rPr>
                 <w:sz w:val="17"/>
               </w:rPr>
-              <w:t xml:space="preserve">563</w:t>
+              <w:t xml:space="preserve">564</w:t>
             </w:r>
           </w:p>
         </w:tc>
@@ -1237,7 +1237,7 @@
               <w:rPr>
                 <w:sz w:val="17"/>
               </w:rPr>
-              <w:t xml:space="preserve">454</w:t>
+              <w:t xml:space="preserve">455</w:t>
             </w:r>
           </w:p>
         </w:tc>
@@ -1381,7 +1381,7 @@
               <w:rPr>
                 <w:sz w:val="17"/>
               </w:rPr>
-              <w:t xml:space="preserve">422</w:t>
+              <w:t xml:space="preserve">423</w:t>
             </w:r>
           </w:p>
         </w:tc>
@@ -1420,7 +1420,7 @@
               <w:rPr>
                 <w:sz w:val="17"/>
               </w:rPr>
-              <w:t xml:space="preserve">249</w:t>
+              <w:t xml:space="preserve">250</w:t>
             </w:r>
           </w:p>
         </w:tc>
@@ -1947,7 +1947,7 @@
         <w:pStyle w:val="BodyText"/>
       </w:pPr>
       <w:r>
-        <w:t xml:space="preserve">Institutional fragmentation (663), official discretion/accommodation (597) and fees/tariffs (541) are the most frequently coded mechanisms; formal-connection (577) and affordability (507) outcomes are well represented, while sanitation access (457) is coded about half as often as water access (1,013). Mechanisms concerning redress and review — administrative review (69), judicial review (65), complaint (124), reconnection (23) — and application outcomes (refusal 107, delay 95, success 75) are coded far less often.</w:t>
+        <w:t xml:space="preserve">Institutional fragmentation (663), official discretion/accommodation (597) and fees/tariffs (542) are the most frequently coded mechanisms; formal-connection (577) and affordability (507) outcomes are well represented, while sanitation access (457) is coded about half as often as water access (1,013). Mechanisms concerning redress and review — administrative review (69), judicial review (65), complaint (124), reconnection (23) — and application outcomes (refusal 107, delay 95, success 75) are coded far less often.</w:t>
       </w:r>
     </w:p>
     <w:bookmarkEnd w:id="22"/>
@@ -4756,7 +4756,7 @@
         <w:pStyle w:val="Compact"/>
       </w:pPr>
       <w:r>
-        <w:t xml:space="preserve">68 studies were extracted from abstract or metadata only (5.9%); none has an effect-size row, so the SWiM syntheses are unaffected, but descriptive counts and ratings include them. There is no second extractor: extracted values have not been checked against the source papers.</w:t>
+        <w:t xml:space="preserve">66 studies were extracted from abstract or metadata only (5.7%); none has an effect-size row, so the SWiM syntheses are unaffected, but descriptive counts and ratings include them. There is no second extractor: extracted values have not been checked against the source papers.</w:t>
       </w:r>
     </w:p>
     <w:p>
@@ -4814,7 +4814,7 @@
         <w:pStyle w:val="Compact"/>
       </w:pPr>
       <w:r>
-        <w:t xml:space="preserve">24 studies carry AMSTAR 2; another 12 studies also had a secondary-review design class but were</w:t>
+        <w:t xml:space="preserve">23 studies carry AMSTAR 2; another 13 studies also had a secondary-review design class but were</w:t>
       </w:r>
       <w:r>
         <w:t xml:space="preserve"> </w:t>
@@ -4845,7 +4845,7 @@
         <w:t xml:space="preserve"> </w:t>
       </w:r>
       <w:r>
-        <w:t xml:space="preserve">after an eligibility check found them to be self-described narrative, conceptual or documentary reviews that never claim a systematic search (S079, S320, S321, S322, S429, S430, S436, S440, S466, S479, S480, S482;</w:t>
+        <w:t xml:space="preserve">after an eligibility check found them to be self-described narrative, conceptual or documentary reviews that never claim a systematic search (S079, S320, S321, S322, S326, S429, S430, S436, S440, S466, S479, S480, S482;</w:t>
       </w:r>
       <w:r>
         <w:t xml:space="preserve"> </w:t>
@@ -4860,7 +4860,7 @@
         <w:t xml:space="preserve"> </w:t>
       </w:r>
       <w:r>
-        <w:t xml:space="preserve">§4). AMSTAR 2 was not applied to those, and the project has</w:t>
+        <w:t xml:space="preserve">§4; S326 joined them on 2026-09-29 after its full text, supplied by you, showed no stated search, selection or appraisal method). AMSTAR 2 was not applied to those, and the project has</w:t>
       </w:r>
       <w:r>
         <w:t xml:space="preserve"> </w:t>
@@ -4888,7 +4888,7 @@
         <w:pStyle w:val="Compact"/>
       </w:pPr>
       <w:r>
-        <w:t xml:space="preserve">Of the 24 that kept AMSTAR 2, each was classed as a secondary systematic review — but the evidence for that is thin: only 12 of the 24 records carry a method label in</w:t>
+        <w:t xml:space="preserve">Of the 23 that kept AMSTAR 2, each was classed as a secondary systematic review — but the evidence for that is thin: only 12 of the 23 records carry a method label in</w:t>
       </w:r>
       <w:r>
         <w:t xml:space="preserve"> </w:t>
@@ -4903,7 +4903,7 @@
         <w:t xml:space="preserve"> </w:t>
       </w:r>
       <w:r>
-        <w:t xml:space="preserve">(systematic, PRISMA, realist, scoping, mapping or meta-analysis); the other 12 (S052, S319, S323, S324, S325, S326, S327, S328, S329, S344, S350, S537) carry only the bare class label</w:t>
+        <w:t xml:space="preserve">(systematic, PRISMA, realist, scoping, mapping or meta-analysis); the other 11 (S052, S319, S323, S324, S325, S327, S328, S329, S344, S350, S537) carry only the bare class label</w:t>
       </w:r>
       <w:r>
         <w:t xml:space="preserve"> </w:t>
@@ -4925,10 +4925,25 @@
           <w:bCs/>
           <w:b/>
         </w:rPr>
-        <w:t xml:space="preserve">5 of them (S319, S324, S325, S326, S344) were extracted from abstract or metadata only, so their eligibility was never confirmed from the full text</w:t>
-      </w:r>
-      <w:r>
-        <w:t xml:space="preserve">; S326 is described as an "evidence survey" and S329 as a "narrative review with systematic search" (hybrids kept eligible with a noted caveat); S697's number of included studies was not extracted.</w:t>
+        <w:t xml:space="preserve">4 of them (S319, S324, S325, S344) were extracted from abstract or metadata only, so their eligibility was never confirmed from the full text</w:t>
+      </w:r>
+      <w:r>
+        <w:t xml:space="preserve">; S329 is described as a "narrative review with systematic search" (a hybrid kept eligible with a noted caveat); S326, first flagged as an "evidence survey", was moved to</w:t>
+      </w:r>
+      <w:r>
+        <w:t xml:space="preserve"> </w:t>
+      </w:r>
+      <w:r>
+        <w:rPr>
+          <w:rStyle w:val="VerbatimChar"/>
+        </w:rPr>
+        <w:t xml:space="preserve">NONE</w:t>
+      </w:r>
+      <w:r>
+        <w:t xml:space="preserve"> </w:t>
+      </w:r>
+      <w:r>
+        <w:t xml:space="preserve">once its full text was read; S697's number of included studies was not extracted.</w:t>
       </w:r>
     </w:p>
     <w:p>
@@ -4944,13 +4959,13 @@
           <w:bCs/>
           <w:b/>
         </w:rPr>
-        <w:t xml:space="preserve">Only 2 of the 24 received a formal AMSTAR 2 confidence rating</w:t>
-      </w:r>
-      <w:r>
-        <w:t xml:space="preserve"> </w:t>
-      </w:r>
-      <w:r>
-        <w:t xml:space="preserve">(S370, S372: Critically Low, because the review authors state they did no critical appraisal); the other 22 are "Not ratable" because the extraction lacks the information for the critical items.</w:t>
+        <w:t xml:space="preserve">Only 2 of the 23 received a formal AMSTAR 2 confidence rating</w:t>
+      </w:r>
+      <w:r>
+        <w:t xml:space="preserve"> </w:t>
+      </w:r>
+      <w:r>
+        <w:t xml:space="preserve">(S370, S372: Critically Low, because the review authors state they did no critical appraisal); the other 21 are "Not ratable" because the extraction lacks the information for the critical items.</w:t>
       </w:r>
       <w:r>
         <w:t xml:space="preserve"> </w:t>
@@ -5364,7 +5379,7 @@
         <w:t xml:space="preserve">Obtain the full text of the abstract-only studies that carry the most weight</w:t>
       </w:r>
       <w:r>
-        <w:t xml:space="preserve">: (S366, the RoB 2 study, was re-extracted 2026-09-29), the five AMSTAR 2 reviews extracted from abstracts (S319, S324, S325, S326, S344), then the rest of the 68; re-extract (</w:t>
+        <w:t xml:space="preserve">: (S366, the RoB 2 study, was re-extracted 2026-09-29), the five AMSTAR 2 reviews extracted from abstracts (S319, S324, S325, S344), then the rest of the 66; re-extract (</w:t>
       </w:r>
       <w:r>
         <w:rPr>

</xml_diff>

<commit_message>
Add data-quality audits, second-extractor sample and scoring script, AMSTAR 2 sweep; extend verifier to 113 checks
Co-Authored-By: Claude Sonnet 5.5 <noreply@anthropic.com>
Claude-Session: https://claude.ai/code/session_014MhMGnb8qDcM9MkpTmcbeG
</commit_message>
<xml_diff>
--- a/legal-last-mile-systematic-review/06_outputs/PRELIMINARY_RESULTS_REPORT_2026-09-29.docx
+++ b/legal-last-mile-systematic-review/06_outputs/PRELIMINARY_RESULTS_REPORT_2026-09-29.docx
@@ -4888,34 +4888,19 @@
         <w:pStyle w:val="Compact"/>
       </w:pPr>
       <w:r>
-        <w:t xml:space="preserve">Of the 23 that kept AMSTAR 2, each was classed as a secondary systematic review — but the evidence for that is thin: only 12 of the 23 records carry a method label in</w:t>
-      </w:r>
-      <w:r>
-        <w:t xml:space="preserve"> </w:t>
+        <w:t xml:space="preserve">Of the 23 that kept AMSTAR 2, each was classed as a secondary systematic review. The recorded fields (publication type, design, method text, sample) support that unevenly: 9 name a registration, PRISMA or JBI method, 9 state a count of included studies, and 6 (S052, S327, S344, S418, S438, S697) show at most one weak signal (the word "systematic" or a review type) — a way to order full-text checks, not a finding (</w:t>
       </w:r>
       <w:r>
         <w:rPr>
           <w:rStyle w:val="VerbatimChar"/>
         </w:rPr>
-        <w:t xml:space="preserve">study_design</w:t>
-      </w:r>
-      <w:r>
-        <w:t xml:space="preserve"> </w:t>
-      </w:r>
-      <w:r>
-        <w:t xml:space="preserve">(systematic, PRISMA, realist, scoping, mapping or meta-analysis); the other 11 (S052, S319, S323, S324, S325, S327, S328, S329, S344, S350, S537) carry only the bare class label</w:t>
-      </w:r>
-      <w:r>
-        <w:t xml:space="preserve"> </w:t>
-      </w:r>
-      <w:r>
-        <w:rPr>
-          <w:rStyle w:val="VerbatimChar"/>
-        </w:rPr>
-        <w:t xml:space="preserve">systematic_review_secondary</w:t>
-      </w:r>
-      <w:r>
-        <w:t xml:space="preserve">, so their systematic character rests on the AI's earlier classification, not on a recorded method statement.</w:t>
+        <w:t xml:space="preserve">05_analysis/descriptive/DATA_QUALITY_AUDIT_2026-09-29.md</w:t>
+      </w:r>
+      <w:r>
+        <w:t xml:space="preserve"> </w:t>
+      </w:r>
+      <w:r>
+        <w:t xml:space="preserve">§3).</w:t>
       </w:r>
       <w:r>
         <w:t xml:space="preserve"> </w:t>
@@ -4928,7 +4913,7 @@
         <w:t xml:space="preserve">4 of them (S319, S324, S325, S344) were extracted from abstract or metadata only, so their eligibility was never confirmed from the full text</w:t>
       </w:r>
       <w:r>
-        <w:t xml:space="preserve">; S329 is described as a "narrative review with systematic search" (a hybrid kept eligible with a noted caveat); S326, first flagged as an "evidence survey", was moved to</w:t>
+        <w:t xml:space="preserve">; S329 is described as a "narrative review with systematic search" and S418 as a narrative/scoping review with a documented search (hybrids kept eligible with a noted caveat); S326, first flagged as an "evidence survey", was moved to</w:t>
       </w:r>
       <w:r>
         <w:t xml:space="preserve"> </w:t>
@@ -5294,6 +5279,62 @@
       </w:r>
       <w:r>
         <w:t xml:space="preserve">in the SWiM documents is a judgment by the same AI; sign and valence differ for several studies.</w:t>
+      </w:r>
+    </w:p>
+    <w:p>
+      <w:pPr>
+        <w:numPr>
+          <w:ilvl w:val="0"/>
+          <w:numId w:val="1009"/>
+        </w:numPr>
+        <w:pStyle w:val="Compact"/>
+      </w:pPr>
+      <w:r>
+        <w:rPr>
+          <w:bCs/>
+          <w:b/>
+        </w:rPr>
+        <w:t xml:space="preserve">The "quantitative-synthesis-eligible" flag looks generous.</w:t>
+      </w:r>
+      <w:r>
+        <w:t xml:space="preserve"> </w:t>
+      </w:r>
+      <w:r>
+        <w:t xml:space="preserve">Of 247 studies flagged, 114 show nothing inferential in their extraction (descriptive or unclear), 29 name an inferential model but hold no interval, SE or p-value, and 104 carry some uncertainty information (heuristic;</w:t>
+      </w:r>
+      <w:r>
+        <w:t xml:space="preserve"> </w:t>
+      </w:r>
+      <w:r>
+        <w:rPr>
+          <w:rStyle w:val="VerbatimChar"/>
+        </w:rPr>
+        <w:t xml:space="preserve">05_analysis/descriptive/quantitative_flag_audit_2026-09-29.csv</w:t>
+      </w:r>
+      <w:r>
+        <w:t xml:space="preserve">). Only 62 studies have an effect-size row and none is pooled, so no synthesis result depends on the flag. No flag was changed.</w:t>
+      </w:r>
+    </w:p>
+    <w:p>
+      <w:pPr>
+        <w:numPr>
+          <w:ilvl w:val="0"/>
+          <w:numId w:val="1009"/>
+        </w:numPr>
+        <w:pStyle w:val="Compact"/>
+      </w:pPr>
+      <w:r>
+        <w:rPr>
+          <w:bCs/>
+          <w:b/>
+        </w:rPr>
+        <w:t xml:space="preserve">Consistency scan of the effect-size rows</w:t>
+      </w:r>
+      <w:r>
+        <w:t xml:space="preserve"> </w:t>
+      </w:r>
+      <w:r>
+        <w:t xml:space="preserve">found 1 new item(s) besides the known S589 row (S312 adjusted_blank); but an interval could be checked for only 5 of 62 rows, so this is weak assurance.</w:t>
       </w:r>
     </w:p>
     <w:p>

</xml_diff>

<commit_message>
File slide copy of the preliminary report with provenance note; add certainty-vs-design audit; correct report wording; verifier 115 checks
Co-Authored-By: Claude Sonnet 5.5 <noreply@anthropic.com>
Claude-Session: https://claude.ai/code/session_014MhMGnb8qDcM9MkpTmcbeG
</commit_message>
<xml_diff>
--- a/legal-last-mile-systematic-review/06_outputs/PRELIMINARY_RESULTS_REPORT_2026-09-29.docx
+++ b/legal-last-mile-systematic-review/06_outputs/PRELIMINARY_RESULTS_REPORT_2026-09-29.docx
@@ -604,7 +604,35 @@
         <w:t xml:space="preserve"> </w:t>
       </w:r>
       <w:r>
-        <w:t xml:space="preserve">68 (6%) — 63 quasi-experimental studies and 5 randomised trials (which are 4 distinct trials, see §3.4). Only 35 studies carry a numeric mechanism-certainty of 3 or 4 (quasi-experimental or experimental evidence); 238 sit at level 1 (documented association) and 286 at level 2; 596 carry narrative text instead of a 0–4 code.</w:t>
+        <w:t xml:space="preserve">68 (6%) — 63 quasi-experimental studies and 5 randomised trials (which are 4 distinct trials, see §3.4). 35 studies carry a numeric mechanism-certainty of 3 or 4 (the codebook's quasi-experimental or experimental evidence),</w:t>
+      </w:r>
+      <w:r>
+        <w:t xml:space="preserve"> </w:t>
+      </w:r>
+      <w:r>
+        <w:rPr>
+          <w:bCs/>
+          <w:b/>
+        </w:rPr>
+        <w:t xml:space="preserve">but only 10 of them are among the 68 ROBINS-I/RoB 2 studies; the other 25 are other designs, a coding inconsistency the audit flags</w:t>
+      </w:r>
+      <w:r>
+        <w:t xml:space="preserve"> </w:t>
+      </w:r>
+      <w:r>
+        <w:t xml:space="preserve">(</w:t>
+      </w:r>
+      <w:r>
+        <w:rPr>
+          <w:rStyle w:val="VerbatimChar"/>
+        </w:rPr>
+        <w:t xml:space="preserve">DATA_QUALITY_AUDIT_2026-09-29.md</w:t>
+      </w:r>
+      <w:r>
+        <w:t xml:space="preserve"> </w:t>
+      </w:r>
+      <w:r>
+        <w:t xml:space="preserve">§5); 238 sit at level 1 (documented association) and 286 at level 2; 596 carry narrative text instead of a 0–4 code.</w:t>
       </w:r>
     </w:p>
     <w:p>
@@ -4449,7 +4477,7 @@
         <w:t xml:space="preserve"> </w:t>
       </w:r>
       <w:r>
-        <w:t xml:space="preserve">With 68 (6%) causal-capable designs and 35 studies at certainty 3–4, the base can say that legal/administrative features and access outcomes are associated across many settings, but rarely that one causes the other.</w:t>
+        <w:t xml:space="preserve">With 68 (6%) causal-capable designs (and a certainty-3–4 coding that does not line up with them, see §2A.1), the base can say that legal/administrative features and access outcomes are associated across many settings, but rarely that one causes the other.</w:t>
       </w:r>
       <w:r>
         <w:t xml:space="preserve"> </w:t>

</xml_diff>

<commit_message>
Re-extract S319, S324, S325, S344 from full text with item-level AMSTAR 2 appraisals; ratings 2 -> 6; abstract-only 66 -> 62
Co-Authored-By: Claude Sonnet 5.5 <noreply@anthropic.com>
Claude-Session: https://claude.ai/code/session_014MhMGnb8qDcM9MkpTmcbeG
</commit_message>
<xml_diff>
--- a/legal-last-mile-systematic-review/06_outputs/PRELIMINARY_RESULTS_REPORT_2026-09-29.docx
+++ b/legal-last-mile-systematic-review/06_outputs/PRELIMINARY_RESULTS_REPORT_2026-09-29.docx
@@ -414,7 +414,7 @@
               <w:rPr>
                 <w:sz w:val="17"/>
               </w:rPr>
-              <w:t xml:space="preserve">1,159 studies, 92 codebook fields, by the AI; 66 from abstract/metadata only; no second extractor</w:t>
+              <w:t xml:space="preserve">1,159 studies, 92 codebook fields, by the AI; 62 from abstract/metadata only; no second extractor</w:t>
             </w:r>
           </w:p>
         </w:tc>
@@ -666,7 +666,7 @@
         <w:t xml:space="preserve"> </w:t>
       </w:r>
       <w:r>
-        <w:t xml:space="preserve">is free text; 123 studies name several countries or a region and are not counted below): India 133, Brazil 87, South Africa 84, United States 71, Ghana 53, Kenya 49, Mexico 37, Indonesia 30, Nigeria 28, Bangladesh 27. The dissertation's comparison countries are unevenly covered:</w:t>
+        <w:t xml:space="preserve">is free text; 125 studies name several countries or a region and are not counted below): India 133, Brazil 87, South Africa 84, United States 71, Ghana 53, Kenya 49, Mexico 37, Indonesia 30, Nigeria 28, Bangladesh 27. The dissertation's comparison countries are unevenly covered:</w:t>
       </w:r>
       <w:r>
         <w:t xml:space="preserve"> </w:t>
@@ -4784,7 +4784,7 @@
         <w:pStyle w:val="Compact"/>
       </w:pPr>
       <w:r>
-        <w:t xml:space="preserve">66 studies were extracted from abstract or metadata only (5.7%); none has an effect-size row, so the SWiM syntheses are unaffected, but descriptive counts and ratings include them. There is no second extractor: extracted values have not been checked against the source papers.</w:t>
+        <w:t xml:space="preserve">62 studies were extracted from abstract or metadata only (5.3%); none has an effect-size row, so the SWiM syntheses are unaffected, but descriptive counts and ratings include them. There is no second extractor: extracted values have not been checked against the source papers.</w:t>
       </w:r>
     </w:p>
     <w:p>
@@ -4916,7 +4916,7 @@
         <w:pStyle w:val="Compact"/>
       </w:pPr>
       <w:r>
-        <w:t xml:space="preserve">Of the 23 that kept AMSTAR 2, each was classed as a secondary systematic review. The recorded fields (publication type, design, method text, sample) support that unevenly: 9 name a registration, PRISMA or JBI method, 9 state a count of included studies, and 6 (S052, S327, S344, S418, S438, S697) show at most one weak signal (the word "systematic" or a review type) — a way to order full-text checks, not a finding (</w:t>
+        <w:t xml:space="preserve">Of the 23 that kept AMSTAR 2, each was classed as a secondary systematic review. The recorded fields (publication type, design, method text, sample) support that unevenly: 9 name a registration, PRISMA or JBI method, 13 state a count of included studies, and 5 (S052, S327, S418, S438, S697) show at most one weak signal (the word "systematic" or a review type) — a way to order full-text checks, not a finding (</w:t>
       </w:r>
       <w:r>
         <w:rPr>
@@ -4928,20 +4928,7 @@
         <w:t xml:space="preserve"> </w:t>
       </w:r>
       <w:r>
-        <w:t xml:space="preserve">§3).</w:t>
-      </w:r>
-      <w:r>
-        <w:t xml:space="preserve"> </w:t>
-      </w:r>
-      <w:r>
-        <w:rPr>
-          <w:bCs/>
-          <w:b/>
-        </w:rPr>
-        <w:t xml:space="preserve">4 of them (S319, S324, S325, S344) were extracted from abstract or metadata only, so their eligibility was never confirmed from the full text</w:t>
-      </w:r>
-      <w:r>
-        <w:t xml:space="preserve">; S329 is described as a "narrative review with systematic search" and S418 as a narrative/scoping review with a documented search (hybrids kept eligible with a noted caveat); S326, first flagged as an "evidence survey", was moved to</w:t>
+        <w:t xml:space="preserve">§3). None of them is now extracted from abstract or metadata only; S319, S324, S325 and S344 were read in full text on 2026-10-02 (S324 is a registered, well-reported review; S319 searched one database; S325 and S344 are single-author reviews with weak methods, but all four state a search, a selection process and a synthesis, so all keep AMSTAR 2); S329 is described as a "narrative review with systematic search" and S418 as a narrative/scoping review with a documented search (hybrids kept eligible with a noted caveat); S326, first flagged as an "evidence survey", was moved to</w:t>
       </w:r>
       <w:r>
         <w:t xml:space="preserve"> </w:t>
@@ -4972,13 +4959,13 @@
           <w:bCs/>
           <w:b/>
         </w:rPr>
-        <w:t xml:space="preserve">Only 2 of the 23 received a formal AMSTAR 2 confidence rating</w:t>
-      </w:r>
-      <w:r>
-        <w:t xml:space="preserve"> </w:t>
-      </w:r>
-      <w:r>
-        <w:t xml:space="preserve">(S370, S372: Critically Low, because the review authors state they did no critical appraisal); the other 21 are "Not ratable" because the extraction lacks the information for the critical items.</w:t>
+        <w:t xml:space="preserve">Only 6 of the 23 received a formal AMSTAR 2 confidence rating</w:t>
+      </w:r>
+      <w:r>
+        <w:t xml:space="preserve"> </w:t>
+      </w:r>
+      <w:r>
+        <w:t xml:space="preserve">(S319 Critically Low, S324 Critically Low, S325 Critically Low, S344 Critically Low, S370 Critically Low, S372 Critically Low; every rating given so far is Critically Low, or provisionally so, because of missing protocols, single-database searches, no list of excluded studies or no appraisal of the included studies); the other 17 are "Not ratable" because their extraction lacks the information for the critical items.</w:t>
       </w:r>
       <w:r>
         <w:t xml:space="preserve"> </w:t>
@@ -4988,7 +4975,7 @@
           <w:bCs/>
           <w:b/>
         </w:rPr>
-        <w:t xml:space="preserve">So AMSTAR 2 currently tells the reader almost nothing about the reviews' confidence.</w:t>
+        <w:t xml:space="preserve">So AMSTAR 2 so far tells the reader little beyond "low confidence"; the 17 unrated reviews need their full texts.</w:t>
       </w:r>
     </w:p>
     <w:p>
@@ -5448,7 +5435,22 @@
         <w:t xml:space="preserve">Obtain the full text of the abstract-only studies that carry the most weight</w:t>
       </w:r>
       <w:r>
-        <w:t xml:space="preserve">: (S366, the RoB 2 study, was re-extracted 2026-09-29), the five AMSTAR 2 reviews extracted from abstracts (S319, S324, S325, S344), then the rest of the 66; re-extract (</w:t>
+        <w:t xml:space="preserve">: (S366, the RoB 2 study, was re-extracted 2026-09-29; the four abstract-only AMSTAR 2 reviews on 2026-10-02), the 17 AMSTAR 2 reviews still unrated (start with the weakest-evidenced in the audit,</w:t>
+      </w:r>
+      <w:r>
+        <w:t xml:space="preserve"> </w:t>
+      </w:r>
+      <w:r>
+        <w:rPr>
+          <w:rStyle w:val="VerbatimChar"/>
+        </w:rPr>
+        <w:t xml:space="preserve">DATA_QUALITY_AUDIT_2026-09-29.md</w:t>
+      </w:r>
+      <w:r>
+        <w:t xml:space="preserve"> </w:t>
+      </w:r>
+      <w:r>
+        <w:t xml:space="preserve">§3), then the 62 remaining abstract-only studies; re-extract (</w:t>
       </w:r>
       <w:r>
         <w:rPr>

</xml_diff>

<commit_message>
AMSTAR 2-appraise S418 from full text (Critically Low; narrative review with stated search); ratings 7 of 23
Co-Authored-By: Claude Sonnet 5.5 <noreply@anthropic.com>
Claude-Session: https://claude.ai/code/session_014MhMGnb8qDcM9MkpTmcbeG
</commit_message>
<xml_diff>
--- a/legal-last-mile-systematic-review/06_outputs/PRELIMINARY_RESULTS_REPORT_2026-09-29.docx
+++ b/legal-last-mile-systematic-review/06_outputs/PRELIMINARY_RESULTS_REPORT_2026-09-29.docx
@@ -4916,7 +4916,7 @@
         <w:pStyle w:val="Compact"/>
       </w:pPr>
       <w:r>
-        <w:t xml:space="preserve">Of the 23 that kept AMSTAR 2, each was classed as a secondary systematic review. The recorded fields (publication type, design, method text, sample) support that unevenly: 9 name a registration, PRISMA or JBI method, 13 state a count of included studies, and 5 (S052, S327, S418, S438, S697) show at most one weak signal (the word "systematic" or a review type) — a way to order full-text checks, not a finding (</w:t>
+        <w:t xml:space="preserve">Of the 23 that kept AMSTAR 2, each was classed as a secondary systematic review. The recorded fields (publication type, design, method text, sample) support that unevenly: 9 name a registration, PRISMA or JBI method, 14 state a count of included studies, and 4 (S052, S327, S438, S697) show at most one weak signal (the word "systematic" or a review type) — a way to order full-text checks, not a finding (</w:t>
       </w:r>
       <w:r>
         <w:rPr>
@@ -4959,13 +4959,13 @@
           <w:bCs/>
           <w:b/>
         </w:rPr>
-        <w:t xml:space="preserve">Only 6 of the 23 received a formal AMSTAR 2 confidence rating</w:t>
-      </w:r>
-      <w:r>
-        <w:t xml:space="preserve"> </w:t>
-      </w:r>
-      <w:r>
-        <w:t xml:space="preserve">(S319 Critically Low, S324 Critically Low, S325 Critically Low, S344 Critically Low, S370 Critically Low, S372 Critically Low; every rating given so far is Critically Low, or provisionally so, because of missing protocols, single-database searches, no list of excluded studies or no appraisal of the included studies); the other 17 are "Not ratable" because their extraction lacks the information for the critical items.</w:t>
+        <w:t xml:space="preserve">Only 7 of the 23 received a formal AMSTAR 2 confidence rating</w:t>
+      </w:r>
+      <w:r>
+        <w:t xml:space="preserve"> </w:t>
+      </w:r>
+      <w:r>
+        <w:t xml:space="preserve">(S319 Critically Low, S324 Critically Low, S325 Critically Low, S344 Critically Low, S370 Critically Low, S372 Critically Low, S418 Critically Low; every rating given so far is Critically Low, or provisionally so, because of missing protocols, single-database searches, no list of excluded studies or no appraisal of the included studies); the other 16 are "Not ratable" because their extraction lacks the information for the critical items.</w:t>
       </w:r>
       <w:r>
         <w:t xml:space="preserve"> </w:t>
@@ -4975,7 +4975,7 @@
           <w:bCs/>
           <w:b/>
         </w:rPr>
-        <w:t xml:space="preserve">So AMSTAR 2 so far tells the reader little beyond "low confidence"; the 17 unrated reviews need their full texts.</w:t>
+        <w:t xml:space="preserve">So AMSTAR 2 so far tells the reader little beyond "low confidence"; the 16 unrated reviews need their full texts.</w:t>
       </w:r>
     </w:p>
     <w:p>
@@ -5435,7 +5435,7 @@
         <w:t xml:space="preserve">Obtain the full text of the abstract-only studies that carry the most weight</w:t>
       </w:r>
       <w:r>
-        <w:t xml:space="preserve">: (S366, the RoB 2 study, was re-extracted 2026-09-29; the four abstract-only AMSTAR 2 reviews on 2026-10-02), the 17 AMSTAR 2 reviews still unrated (start with the weakest-evidenced in the audit,</w:t>
+        <w:t xml:space="preserve">: (S366, the RoB 2 study, was re-extracted 2026-09-29; the four abstract-only AMSTAR 2 reviews on 2026-10-02), the 16 AMSTAR 2 reviews still unrated (start with the weakest-evidenced in the audit,</w:t>
       </w:r>
       <w:r>
         <w:t xml:space="preserve"> </w:t>

</xml_diff>

<commit_message>
AMSTAR 2-appraise S697 (meta-analysis) and S438 from full text: both Critically Low; ratings 9 of 23
Co-Authored-By: Claude Sonnet 5.5 <noreply@anthropic.com>
Claude-Session: https://claude.ai/code/session_014MhMGnb8qDcM9MkpTmcbeG
</commit_message>
<xml_diff>
--- a/legal-last-mile-systematic-review/06_outputs/PRELIMINARY_RESULTS_REPORT_2026-09-29.docx
+++ b/legal-last-mile-systematic-review/06_outputs/PRELIMINARY_RESULTS_REPORT_2026-09-29.docx
@@ -4916,7 +4916,7 @@
         <w:pStyle w:val="Compact"/>
       </w:pPr>
       <w:r>
-        <w:t xml:space="preserve">Of the 23 that kept AMSTAR 2, each was classed as a secondary systematic review. The recorded fields (publication type, design, method text, sample) support that unevenly: 9 name a registration, PRISMA or JBI method, 14 state a count of included studies, and 4 (S052, S327, S438, S697) show at most one weak signal (the word "systematic" or a review type) — a way to order full-text checks, not a finding (</w:t>
+        <w:t xml:space="preserve">Of the 23 that kept AMSTAR 2, each was classed as a secondary systematic review. The recorded fields (publication type, design, method text, sample) support that unevenly: 10 name a registration, PRISMA or JBI method, 16 state a count of included studies, and 2 (S052, S327) show at most one weak signal (the word "systematic" or a review type) — a way to order full-text checks, not a finding (</w:t>
       </w:r>
       <w:r>
         <w:rPr>
@@ -4959,13 +4959,13 @@
           <w:bCs/>
           <w:b/>
         </w:rPr>
-        <w:t xml:space="preserve">Only 7 of the 23 received a formal AMSTAR 2 confidence rating</w:t>
-      </w:r>
-      <w:r>
-        <w:t xml:space="preserve"> </w:t>
-      </w:r>
-      <w:r>
-        <w:t xml:space="preserve">(S319 Critically Low, S324 Critically Low, S325 Critically Low, S344 Critically Low, S370 Critically Low, S372 Critically Low, S418 Critically Low; every rating given so far is Critically Low, or provisionally so, because of missing protocols, single-database searches, no list of excluded studies or no appraisal of the included studies); the other 16 are "Not ratable" because their extraction lacks the information for the critical items.</w:t>
+        <w:t xml:space="preserve">Only 9 of the 23 received a formal AMSTAR 2 confidence rating</w:t>
+      </w:r>
+      <w:r>
+        <w:t xml:space="preserve"> </w:t>
+      </w:r>
+      <w:r>
+        <w:t xml:space="preserve">(S319 Critically Low, S324 Critically Low, S325 Critically Low, S344 Critically Low, S370 Critically Low, S372 Critically Low, S418 Critically Low, S438 Critically Low, S697 Critically Low; every rating given so far is Critically Low, or provisionally so, because of missing protocols, single-database searches, no list of excluded studies or no appraisal of the included studies); the other 14 are "Not ratable" because their extraction lacks the information for the critical items.</w:t>
       </w:r>
       <w:r>
         <w:t xml:space="preserve"> </w:t>
@@ -4975,7 +4975,7 @@
           <w:bCs/>
           <w:b/>
         </w:rPr>
-        <w:t xml:space="preserve">So AMSTAR 2 so far tells the reader little beyond "low confidence"; the 16 unrated reviews need their full texts.</w:t>
+        <w:t xml:space="preserve">So AMSTAR 2 so far tells the reader little beyond "low confidence"; the 14 unrated reviews need their full texts.</w:t>
       </w:r>
     </w:p>
     <w:p>
@@ -5435,7 +5435,7 @@
         <w:t xml:space="preserve">Obtain the full text of the abstract-only studies that carry the most weight</w:t>
       </w:r>
       <w:r>
-        <w:t xml:space="preserve">: (S366, the RoB 2 study, was re-extracted 2026-09-29; the four abstract-only AMSTAR 2 reviews on 2026-10-02), the 16 AMSTAR 2 reviews still unrated (start with the weakest-evidenced in the audit,</w:t>
+        <w:t xml:space="preserve">: (S366, the RoB 2 study, was re-extracted 2026-09-29; the four abstract-only AMSTAR 2 reviews on 2026-10-02), the 14 AMSTAR 2 reviews still unrated (start with the weakest-evidenced in the audit,</w:t>
       </w:r>
       <w:r>
         <w:t xml:space="preserve"> </w:t>

</xml_diff>

<commit_message>
AMSTAR 2-appraise S052 (Critically Low) and S327 (Low, borderline) from full text; correct S052 abstract-level misstatements; ratings 11 of 23
Co-Authored-By: Claude Sonnet 5.5 <noreply@anthropic.com>
Claude-Session: https://claude.ai/code/session_014MhMGnb8qDcM9MkpTmcbeG
</commit_message>
<xml_diff>
--- a/legal-last-mile-systematic-review/06_outputs/PRELIMINARY_RESULTS_REPORT_2026-09-29.docx
+++ b/legal-last-mile-systematic-review/06_outputs/PRELIMINARY_RESULTS_REPORT_2026-09-29.docx
@@ -110,14 +110,6 @@
         <w:tblW w:type="auto" w:w="0"/>
         <w:tblLook w:firstRow="1" w:lastRow="0" w:firstColumn="0" w:lastColumn="0" w:noHBand="0" w:noVBand="0" w:val="0020"/>
         <w:jc w:val="start"/>
-        <w:tblBorders>
-          <w:top w:val="single" w:sz="4" w:color="999999"/>
-          <w:left w:val="single" w:sz="4" w:color="999999"/>
-          <w:bottom w:val="single" w:sz="4" w:color="999999"/>
-          <w:right w:val="single" w:sz="4" w:color="999999"/>
-          <w:insideH w:val="single" w:sz="4" w:color="999999"/>
-          <w:insideV w:val="single" w:sz="4" w:color="999999"/>
-        </w:tblBorders>
       </w:tblPr>
       <w:tblGrid>
         <w:gridCol w:w="3960"/>
@@ -135,10 +127,6 @@
               <w:jc w:val="left"/>
             </w:pPr>
             <w:r>
-              <w:rPr>
-                <w:b/>
-                <w:sz w:val="17"/>
-              </w:rPr>
               <w:t xml:space="preserve">Step</w:t>
             </w:r>
           </w:p>
@@ -151,10 +139,6 @@
               <w:jc w:val="left"/>
             </w:pPr>
             <w:r>
-              <w:rPr>
-                <w:b/>
-                <w:sz w:val="17"/>
-              </w:rPr>
               <w:t xml:space="preserve">Status</w:t>
             </w:r>
           </w:p>
@@ -169,9 +153,6 @@
               <w:jc w:val="left"/>
             </w:pPr>
             <w:r>
-              <w:rPr>
-                <w:sz w:val="17"/>
-              </w:rPr>
               <w:t xml:space="preserve">Question</w:t>
             </w:r>
           </w:p>
@@ -184,22 +165,15 @@
               <w:jc w:val="left"/>
             </w:pPr>
             <w:r>
-              <w:rPr>
-                <w:sz w:val="17"/>
-              </w:rPr>
               <w:t xml:space="preserve">How legal and administrative institutions shape the translation of physical water/sanitation infrastructure into effective household access (</w:t>
             </w:r>
             <w:r>
               <w:rPr>
                 <w:rStyle w:val="VerbatimChar"/>
-                <w:sz w:val="17"/>
               </w:rPr>
               <w:t xml:space="preserve">PROTOCOL.md</w:t>
             </w:r>
             <w:r>
-              <w:rPr>
-                <w:sz w:val="17"/>
-              </w:rPr>
               <w:t xml:space="preserve">)</w:t>
             </w:r>
           </w:p>
@@ -214,9 +188,6 @@
               <w:jc w:val="left"/>
             </w:pPr>
             <w:r>
-              <w:rPr>
-                <w:sz w:val="17"/>
-              </w:rPr>
               <w:t xml:space="preserve">Search</w:t>
             </w:r>
           </w:p>
@@ -229,9 +200,6 @@
               <w:jc w:val="left"/>
             </w:pPr>
             <w:r>
-              <w:rPr>
-                <w:sz w:val="17"/>
-              </w:rPr>
               <w:t xml:space="preserve">Closed 2026-09-11; 34,594 raw records → 27,481 unique (SSRN and Westlaw/Lexis never searched)</w:t>
             </w:r>
           </w:p>
@@ -246,9 +214,6 @@
               <w:jc w:val="left"/>
             </w:pPr>
             <w:r>
-              <w:rPr>
-                <w:sz w:val="17"/>
-              </w:rPr>
               <w:t xml:space="preserve">Title/abstract screening</w:t>
             </w:r>
           </w:p>
@@ -261,29 +226,19 @@
               <w:jc w:val="left"/>
             </w:pPr>
             <w:r>
-              <w:rPr>
-                <w:sz w:val="17"/>
-              </w:rPr>
               <w:t xml:space="preserve">Final 3,659 include / 6 exclude: 26,222 of 27,481 screened by AI first pass (3,062 include / 22,557 exclude / 603 unsure; 1,259 without an abstract left undecided); a human second pass covered the 3,665 include-plus-unsure records,</w:t>
             </w:r>
             <w:r>
-              <w:rPr>
-                <w:sz w:val="17"/>
-              </w:rPr>
               <w:t xml:space="preserve"> </w:t>
             </w:r>
             <w:r>
               <w:rPr>
                 <w:bCs/>
                 <w:b/>
-                <w:sz w:val="17"/>
               </w:rPr>
               <w:t xml:space="preserve">not the 22,557 AI excludes</w:t>
             </w:r>
             <w:r>
-              <w:rPr>
-                <w:sz w:val="17"/>
-              </w:rPr>
               <w:t xml:space="preserve">; 99.8% agreement, flagged by the project as unusually high</w:t>
             </w:r>
           </w:p>
@@ -298,9 +253,6 @@
               <w:jc w:val="left"/>
             </w:pPr>
             <w:r>
-              <w:rPr>
-                <w:sz w:val="17"/>
-              </w:rPr>
               <w:t xml:space="preserve">Full-text screening</w:t>
             </w:r>
           </w:p>
@@ -313,75 +265,48 @@
               <w:jc w:val="left"/>
             </w:pPr>
             <w:r>
-              <w:rPr>
-                <w:sz w:val="17"/>
-              </w:rPr>
               <w:t xml:space="preserve">Closed by researcher decision at</w:t>
             </w:r>
             <w:r>
-              <w:rPr>
-                <w:sz w:val="17"/>
-              </w:rPr>
               <w:t xml:space="preserve"> </w:t>
             </w:r>
             <w:r>
               <w:rPr>
                 <w:bCs/>
                 <w:b/>
-                <w:sz w:val="17"/>
               </w:rPr>
               <w:t xml:space="preserve">2,276 of 3,659 assessed (62.2%)</w:t>
             </w:r>
             <w:r>
-              <w:rPr>
-                <w:sz w:val="17"/>
-              </w:rPr>
               <w:t xml:space="preserve">:</w:t>
             </w:r>
             <w:r>
-              <w:rPr>
-                <w:sz w:val="17"/>
-              </w:rPr>
               <w:t xml:space="preserve"> </w:t>
             </w:r>
             <w:r>
               <w:rPr>
                 <w:bCs/>
                 <w:b/>
-                <w:sz w:val="17"/>
               </w:rPr>
               <w:t xml:space="preserve">1,159 include / 1,117 exclude</w:t>
             </w:r>
             <w:r>
-              <w:rPr>
-                <w:sz w:val="17"/>
-              </w:rPr>
               <w:t xml:space="preserve">; 1,383 never assessed. 151 of the excludes are E10 ("full text inaccessible"), so only</w:t>
             </w:r>
             <w:r>
-              <w:rPr>
-                <w:sz w:val="17"/>
-              </w:rPr>
               <w:t xml:space="preserve"> </w:t>
             </w:r>
             <w:r>
               <w:rPr>
                 <w:bCs/>
                 <w:b/>
-                <w:sz w:val="17"/>
               </w:rPr>
               <w:t xml:space="preserve">2,125</w:t>
             </w:r>
             <w:r>
-              <w:rPr>
-                <w:sz w:val="17"/>
-              </w:rPr>
               <w:t xml:space="preserve"> </w:t>
             </w:r>
             <w:r>
-              <w:rPr>
-                <w:sz w:val="17"/>
-              </w:rPr>
               <w:t xml:space="preserve">were judged on content. AI decisions; a human confirmed 100 includes and no excludes</w:t>
             </w:r>
           </w:p>
@@ -396,9 +321,6 @@
               <w:jc w:val="left"/>
             </w:pPr>
             <w:r>
-              <w:rPr>
-                <w:sz w:val="17"/>
-              </w:rPr>
               <w:t xml:space="preserve">Extraction</w:t>
             </w:r>
           </w:p>
@@ -411,9 +333,6 @@
               <w:jc w:val="left"/>
             </w:pPr>
             <w:r>
-              <w:rPr>
-                <w:sz w:val="17"/>
-              </w:rPr>
               <w:t xml:space="preserve">1,159 studies, 92 codebook fields, by the AI; 62 from abstract/metadata only; no second extractor</w:t>
             </w:r>
           </w:p>
@@ -428,9 +347,6 @@
               <w:jc w:val="left"/>
             </w:pPr>
             <w:r>
-              <w:rPr>
-                <w:sz w:val="17"/>
-              </w:rPr>
               <w:t xml:space="preserve">Appraisal</w:t>
             </w:r>
           </w:p>
@@ -443,35 +359,22 @@
               <w:jc w:val="left"/>
             </w:pPr>
             <w:r>
-              <w:rPr>
-                <w:sz w:val="17"/>
-              </w:rPr>
               <w:t xml:space="preserve">Rule-based batch ratings from extracted fields with design-matched tools: RoB 2 5, ROBINS-I 63, JBI Cross-Sectional 140, MMAT 205, CASP Qualitative 263, AMSTAR 2 23, Legal Framework 447, NONE 13. Legal Framework is the project's own</w:t>
             </w:r>
             <w:r>
-              <w:rPr>
-                <w:sz w:val="17"/>
-              </w:rPr>
               <w:t xml:space="preserve"> </w:t>
             </w:r>
             <w:r>
               <w:rPr>
                 <w:bCs/>
                 <w:b/>
-                <w:sz w:val="17"/>
               </w:rPr>
               <w:t xml:space="preserve">non-validated</w:t>
             </w:r>
             <w:r>
-              <w:rPr>
-                <w:sz w:val="17"/>
-              </w:rPr>
               <w:t xml:space="preserve"> </w:t>
             </w:r>
             <w:r>
-              <w:rPr>
-                <w:sz w:val="17"/>
-              </w:rPr>
               <w:t xml:space="preserve">instrument. No human review of ratings</w:t>
             </w:r>
           </w:p>
@@ -486,9 +389,6 @@
               <w:jc w:val="left"/>
             </w:pPr>
             <w:r>
-              <w:rPr>
-                <w:sz w:val="17"/>
-              </w:rPr>
               <w:t xml:space="preserve">Synthesis</w:t>
             </w:r>
           </w:p>
@@ -501,9 +401,6 @@
               <w:jc w:val="left"/>
             </w:pPr>
             <w:r>
-              <w:rPr>
-                <w:sz w:val="17"/>
-              </w:rPr>
               <w:t xml:space="preserve">Phase 11: no family clears the bar for meta-analysis. 62 effect-size rows (A 20, B 6, C 20, 16 reasoned non-fits), none pooled; three structured (SWiM) direction-of-association syntheses</w:t>
             </w:r>
           </w:p>
@@ -666,7 +563,7 @@
         <w:t xml:space="preserve"> </w:t>
       </w:r>
       <w:r>
-        <w:t xml:space="preserve">is free text; 125 studies name several countries or a region and are not counted below): India 133, Brazil 87, South Africa 84, United States 71, Ghana 53, Kenya 49, Mexico 37, Indonesia 30, Nigeria 28, Bangladesh 27. The dissertation's comparison countries are unevenly covered:</w:t>
+        <w:t xml:space="preserve">is free text; 126 studies name several countries or a region and are not counted below): India 133, Brazil 87, South Africa 84, United States 71, Ghana 53, Kenya 49, Mexico 37, Indonesia 30, Nigeria 28, Bangladesh 27. The dissertation's comparison countries are unevenly covered:</w:t>
       </w:r>
       <w:r>
         <w:t xml:space="preserve"> </w:t>
@@ -784,14 +681,6 @@
         <w:tblW w:type="auto" w:w="0"/>
         <w:tblLook w:firstRow="1" w:lastRow="0" w:firstColumn="0" w:lastColumn="0" w:noHBand="0" w:noVBand="0" w:val="0020"/>
         <w:jc w:val="start"/>
-        <w:tblBorders>
-          <w:top w:val="single" w:sz="4" w:color="999999"/>
-          <w:left w:val="single" w:sz="4" w:color="999999"/>
-          <w:bottom w:val="single" w:sz="4" w:color="999999"/>
-          <w:right w:val="single" w:sz="4" w:color="999999"/>
-          <w:insideH w:val="single" w:sz="4" w:color="999999"/>
-          <w:insideV w:val="single" w:sz="4" w:color="999999"/>
-        </w:tblBorders>
       </w:tblPr>
       <w:tblGrid>
         <w:gridCol w:w="1584"/>
@@ -812,10 +701,6 @@
               <w:jc w:val="left"/>
             </w:pPr>
             <w:r>
-              <w:rPr>
-                <w:b/>
-                <w:sz w:val="17"/>
-              </w:rPr>
               <w:t xml:space="preserve">Mechanism coded</w:t>
             </w:r>
           </w:p>
@@ -828,10 +713,6 @@
               <w:jc w:val="left"/>
             </w:pPr>
             <w:r>
-              <w:rPr>
-                <w:b/>
-                <w:sz w:val="17"/>
-              </w:rPr>
               <w:t xml:space="preserve">Studies</w:t>
             </w:r>
           </w:p>
@@ -852,10 +733,6 @@
               <w:jc w:val="left"/>
             </w:pPr>
             <w:r>
-              <w:rPr>
-                <w:b/>
-                <w:sz w:val="17"/>
-              </w:rPr>
               <w:t xml:space="preserve">Outcome coded</w:t>
             </w:r>
           </w:p>
@@ -868,10 +745,6 @@
               <w:jc w:val="left"/>
             </w:pPr>
             <w:r>
-              <w:rPr>
-                <w:b/>
-                <w:sz w:val="17"/>
-              </w:rPr>
               <w:t xml:space="preserve">Studies</w:t>
             </w:r>
           </w:p>
@@ -888,7 +761,6 @@
             <w:r>
               <w:rPr>
                 <w:rStyle w:val="VerbatimChar"/>
-                <w:sz w:val="17"/>
               </w:rPr>
               <w:t xml:space="preserve">institutional_fragmentation</w:t>
             </w:r>
@@ -902,9 +774,6 @@
               <w:jc w:val="left"/>
             </w:pPr>
             <w:r>
-              <w:rPr>
-                <w:sz w:val="17"/>
-              </w:rPr>
               <w:t xml:space="preserve">663</w:t>
             </w:r>
           </w:p>
@@ -927,7 +796,6 @@
             <w:r>
               <w:rPr>
                 <w:rStyle w:val="VerbatimChar"/>
-                <w:sz w:val="17"/>
               </w:rPr>
               <w:t xml:space="preserve">water_access</w:t>
             </w:r>
@@ -941,9 +809,6 @@
               <w:jc w:val="left"/>
             </w:pPr>
             <w:r>
-              <w:rPr>
-                <w:sz w:val="17"/>
-              </w:rPr>
               <w:t xml:space="preserve">1,013</w:t>
             </w:r>
           </w:p>
@@ -960,7 +825,6 @@
             <w:r>
               <w:rPr>
                 <w:rStyle w:val="VerbatimChar"/>
-                <w:sz w:val="17"/>
               </w:rPr>
               <w:t xml:space="preserve">discretion_accommodation</w:t>
             </w:r>
@@ -974,9 +838,6 @@
               <w:jc w:val="left"/>
             </w:pPr>
             <w:r>
-              <w:rPr>
-                <w:sz w:val="17"/>
-              </w:rPr>
               <w:t xml:space="preserve">597</w:t>
             </w:r>
           </w:p>
@@ -999,7 +860,6 @@
             <w:r>
               <w:rPr>
                 <w:rStyle w:val="VerbatimChar"/>
-                <w:sz w:val="17"/>
               </w:rPr>
               <w:t xml:space="preserve">formal_connection</w:t>
             </w:r>
@@ -1013,9 +873,6 @@
               <w:jc w:val="left"/>
             </w:pPr>
             <w:r>
-              <w:rPr>
-                <w:sz w:val="17"/>
-              </w:rPr>
               <w:t xml:space="preserve">577</w:t>
             </w:r>
           </w:p>
@@ -1032,7 +889,6 @@
             <w:r>
               <w:rPr>
                 <w:rStyle w:val="VerbatimChar"/>
-                <w:sz w:val="17"/>
               </w:rPr>
               <w:t xml:space="preserve">fees</w:t>
             </w:r>
@@ -1046,9 +902,6 @@
               <w:jc w:val="left"/>
             </w:pPr>
             <w:r>
-              <w:rPr>
-                <w:sz w:val="17"/>
-              </w:rPr>
               <w:t xml:space="preserve">542</w:t>
             </w:r>
           </w:p>
@@ -1071,7 +924,6 @@
             <w:r>
               <w:rPr>
                 <w:rStyle w:val="VerbatimChar"/>
-                <w:sz w:val="17"/>
               </w:rPr>
               <w:t xml:space="preserve">service_coverage</w:t>
             </w:r>
@@ -1085,9 +937,6 @@
               <w:jc w:val="left"/>
             </w:pPr>
             <w:r>
-              <w:rPr>
-                <w:sz w:val="17"/>
-              </w:rPr>
               <w:t xml:space="preserve">564</w:t>
             </w:r>
           </w:p>
@@ -1104,7 +953,6 @@
             <w:r>
               <w:rPr>
                 <w:rStyle w:val="VerbatimChar"/>
-                <w:sz w:val="17"/>
               </w:rPr>
               <w:t xml:space="preserve">service_area</w:t>
             </w:r>
@@ -1118,9 +966,6 @@
               <w:jc w:val="left"/>
             </w:pPr>
             <w:r>
-              <w:rPr>
-                <w:sz w:val="17"/>
-              </w:rPr>
               <w:t xml:space="preserve">482</w:t>
             </w:r>
           </w:p>
@@ -1143,7 +988,6 @@
             <w:r>
               <w:rPr>
                 <w:rStyle w:val="VerbatimChar"/>
-                <w:sz w:val="17"/>
               </w:rPr>
               <w:t xml:space="preserve">affordability</w:t>
             </w:r>
@@ -1157,9 +1001,6 @@
               <w:jc w:val="left"/>
             </w:pPr>
             <w:r>
-              <w:rPr>
-                <w:sz w:val="17"/>
-              </w:rPr>
               <w:t xml:space="preserve">507</w:t>
             </w:r>
           </w:p>
@@ -1176,7 +1017,6 @@
             <w:r>
               <w:rPr>
                 <w:rStyle w:val="VerbatimChar"/>
-                <w:sz w:val="17"/>
               </w:rPr>
               <w:t xml:space="preserve">political_coordination</w:t>
             </w:r>
@@ -1190,9 +1030,6 @@
               <w:jc w:val="left"/>
             </w:pPr>
             <w:r>
-              <w:rPr>
-                <w:sz w:val="17"/>
-              </w:rPr>
               <w:t xml:space="preserve">475</w:t>
             </w:r>
           </w:p>
@@ -1215,7 +1052,6 @@
             <w:r>
               <w:rPr>
                 <w:rStyle w:val="VerbatimChar"/>
-                <w:sz w:val="17"/>
               </w:rPr>
               <w:t xml:space="preserve">sanitation_access</w:t>
             </w:r>
@@ -1229,9 +1065,6 @@
               <w:jc w:val="left"/>
             </w:pPr>
             <w:r>
-              <w:rPr>
-                <w:sz w:val="17"/>
-              </w:rPr>
               <w:t xml:space="preserve">457</w:t>
             </w:r>
           </w:p>
@@ -1248,7 +1081,6 @@
             <w:r>
               <w:rPr>
                 <w:rStyle w:val="VerbatimChar"/>
-                <w:sz w:val="17"/>
               </w:rPr>
               <w:t xml:space="preserve">enforcement</w:t>
             </w:r>
@@ -1262,9 +1094,6 @@
               <w:jc w:val="left"/>
             </w:pPr>
             <w:r>
-              <w:rPr>
-                <w:sz w:val="17"/>
-              </w:rPr>
               <w:t xml:space="preserve">455</w:t>
             </w:r>
           </w:p>
@@ -1287,7 +1116,6 @@
             <w:r>
               <w:rPr>
                 <w:rStyle w:val="VerbatimChar"/>
-                <w:sz w:val="17"/>
               </w:rPr>
               <w:t xml:space="preserve">service_reliability</w:t>
             </w:r>
@@ -1301,9 +1129,6 @@
               <w:jc w:val="left"/>
             </w:pPr>
             <w:r>
-              <w:rPr>
-                <w:sz w:val="17"/>
-              </w:rPr>
               <w:t xml:space="preserve">381</w:t>
             </w:r>
           </w:p>
@@ -1320,7 +1145,6 @@
             <w:r>
               <w:rPr>
                 <w:rStyle w:val="VerbatimChar"/>
-                <w:sz w:val="17"/>
               </w:rPr>
               <w:t xml:space="preserve">participation</w:t>
             </w:r>
@@ -1334,9 +1158,6 @@
               <w:jc w:val="left"/>
             </w:pPr>
             <w:r>
-              <w:rPr>
-                <w:sz w:val="17"/>
-              </w:rPr>
               <w:t xml:space="preserve">440</w:t>
             </w:r>
           </w:p>
@@ -1359,7 +1180,6 @@
             <w:r>
               <w:rPr>
                 <w:rStyle w:val="VerbatimChar"/>
-                <w:sz w:val="17"/>
               </w:rPr>
               <w:t xml:space="preserve">service_quality</w:t>
             </w:r>
@@ -1373,9 +1193,6 @@
               <w:jc w:val="left"/>
             </w:pPr>
             <w:r>
-              <w:rPr>
-                <w:sz w:val="17"/>
-              </w:rPr>
               <w:t xml:space="preserve">301</w:t>
             </w:r>
           </w:p>
@@ -1392,7 +1209,6 @@
             <w:r>
               <w:rPr>
                 <w:rStyle w:val="VerbatimChar"/>
-                <w:sz w:val="17"/>
               </w:rPr>
               <w:t xml:space="preserve">eligibility</w:t>
             </w:r>
@@ -1406,9 +1222,6 @@
               <w:jc w:val="left"/>
             </w:pPr>
             <w:r>
-              <w:rPr>
-                <w:sz w:val="17"/>
-              </w:rPr>
               <w:t xml:space="preserve">423</w:t>
             </w:r>
           </w:p>
@@ -1431,7 +1244,6 @@
             <w:r>
               <w:rPr>
                 <w:rStyle w:val="VerbatimChar"/>
-                <w:sz w:val="17"/>
               </w:rPr>
               <w:t xml:space="preserve">service_continuity</w:t>
             </w:r>
@@ -1445,9 +1257,6 @@
               <w:jc w:val="left"/>
             </w:pPr>
             <w:r>
-              <w:rPr>
-                <w:sz w:val="17"/>
-              </w:rPr>
               <w:t xml:space="preserve">250</w:t>
             </w:r>
           </w:p>
@@ -1464,7 +1273,6 @@
             <w:r>
               <w:rPr>
                 <w:rStyle w:val="VerbatimChar"/>
-                <w:sz w:val="17"/>
               </w:rPr>
               <w:t xml:space="preserve">burden</w:t>
             </w:r>
@@ -1478,9 +1286,6 @@
               <w:jc w:val="left"/>
             </w:pPr>
             <w:r>
-              <w:rPr>
-                <w:sz w:val="17"/>
-              </w:rPr>
               <w:t xml:space="preserve">419</w:t>
             </w:r>
           </w:p>
@@ -1503,7 +1308,6 @@
             <w:r>
               <w:rPr>
                 <w:rStyle w:val="VerbatimChar"/>
-                <w:sz w:val="17"/>
               </w:rPr>
               <w:t xml:space="preserve">service_quantity</w:t>
             </w:r>
@@ -1517,9 +1321,6 @@
               <w:jc w:val="left"/>
             </w:pPr>
             <w:r>
-              <w:rPr>
-                <w:sz w:val="17"/>
-              </w:rPr>
               <w:t xml:space="preserve">206</w:t>
             </w:r>
           </w:p>
@@ -1536,7 +1337,6 @@
             <w:r>
               <w:rPr>
                 <w:rStyle w:val="VerbatimChar"/>
-                <w:sz w:val="17"/>
               </w:rPr>
               <w:t xml:space="preserve">documentation</w:t>
             </w:r>
@@ -1550,9 +1350,6 @@
               <w:jc w:val="left"/>
             </w:pPr>
             <w:r>
-              <w:rPr>
-                <w:sz w:val="17"/>
-              </w:rPr>
               <w:t xml:space="preserve">260</w:t>
             </w:r>
           </w:p>
@@ -1575,7 +1372,6 @@
             <w:r>
               <w:rPr>
                 <w:rStyle w:val="VerbatimChar"/>
-                <w:sz w:val="17"/>
               </w:rPr>
               <w:t xml:space="preserve">refusal</w:t>
             </w:r>
@@ -1589,9 +1385,6 @@
               <w:jc w:val="left"/>
             </w:pPr>
             <w:r>
-              <w:rPr>
-                <w:sz w:val="17"/>
-              </w:rPr>
               <w:t xml:space="preserve">107</w:t>
             </w:r>
           </w:p>
@@ -1608,7 +1401,6 @@
             <w:r>
               <w:rPr>
                 <w:rStyle w:val="VerbatimChar"/>
-                <w:sz w:val="17"/>
               </w:rPr>
               <w:t xml:space="preserve">bureaucratic_assistance</w:t>
             </w:r>
@@ -1622,9 +1414,6 @@
               <w:jc w:val="left"/>
             </w:pPr>
             <w:r>
-              <w:rPr>
-                <w:sz w:val="17"/>
-              </w:rPr>
               <w:t xml:space="preserve">215</w:t>
             </w:r>
           </w:p>
@@ -1647,7 +1436,6 @@
             <w:r>
               <w:rPr>
                 <w:rStyle w:val="VerbatimChar"/>
-                <w:sz w:val="17"/>
               </w:rPr>
               <w:t xml:space="preserve">delay_outcome</w:t>
             </w:r>
@@ -1661,9 +1449,6 @@
               <w:jc w:val="left"/>
             </w:pPr>
             <w:r>
-              <w:rPr>
-                <w:sz w:val="17"/>
-              </w:rPr>
               <w:t xml:space="preserve">95</w:t>
             </w:r>
           </w:p>
@@ -1680,7 +1465,6 @@
             <w:r>
               <w:rPr>
                 <w:rStyle w:val="VerbatimChar"/>
-                <w:sz w:val="17"/>
               </w:rPr>
               <w:t xml:space="preserve">administrative_review</w:t>
             </w:r>
@@ -1694,9 +1478,6 @@
               <w:jc w:val="left"/>
             </w:pPr>
             <w:r>
-              <w:rPr>
-                <w:sz w:val="17"/>
-              </w:rPr>
               <w:t xml:space="preserve">69</w:t>
             </w:r>
           </w:p>
@@ -1719,7 +1500,6 @@
             <w:r>
               <w:rPr>
                 <w:rStyle w:val="VerbatimChar"/>
-                <w:sz w:val="17"/>
               </w:rPr>
               <w:t xml:space="preserve">application_success</w:t>
             </w:r>
@@ -1733,9 +1513,6 @@
               <w:jc w:val="left"/>
             </w:pPr>
             <w:r>
-              <w:rPr>
-                <w:sz w:val="17"/>
-              </w:rPr>
               <w:t xml:space="preserve">75</w:t>
             </w:r>
           </w:p>
@@ -1752,7 +1529,6 @@
             <w:r>
               <w:rPr>
                 <w:rStyle w:val="VerbatimChar"/>
-                <w:sz w:val="17"/>
               </w:rPr>
               <w:t xml:space="preserve">complaint</w:t>
             </w:r>
@@ -1766,9 +1542,6 @@
               <w:jc w:val="left"/>
             </w:pPr>
             <w:r>
-              <w:rPr>
-                <w:sz w:val="17"/>
-              </w:rPr>
               <w:t xml:space="preserve">124</w:t>
             </w:r>
           </w:p>
@@ -1809,7 +1582,6 @@
             <w:r>
               <w:rPr>
                 <w:rStyle w:val="VerbatimChar"/>
-                <w:sz w:val="17"/>
               </w:rPr>
               <w:t xml:space="preserve">judicial_review</w:t>
             </w:r>
@@ -1823,9 +1595,6 @@
               <w:jc w:val="left"/>
             </w:pPr>
             <w:r>
-              <w:rPr>
-                <w:sz w:val="17"/>
-              </w:rPr>
               <w:t xml:space="preserve">65</w:t>
             </w:r>
           </w:p>
@@ -1866,7 +1635,6 @@
             <w:r>
               <w:rPr>
                 <w:rStyle w:val="VerbatimChar"/>
-                <w:sz w:val="17"/>
               </w:rPr>
               <w:t xml:space="preserve">disconnection</w:t>
             </w:r>
@@ -1880,9 +1648,6 @@
               <w:jc w:val="left"/>
             </w:pPr>
             <w:r>
-              <w:rPr>
-                <w:sz w:val="17"/>
-              </w:rPr>
               <w:t xml:space="preserve">107</w:t>
             </w:r>
           </w:p>
@@ -1923,7 +1688,6 @@
             <w:r>
               <w:rPr>
                 <w:rStyle w:val="VerbatimChar"/>
-                <w:sz w:val="17"/>
               </w:rPr>
               <w:t xml:space="preserve">reconnection</w:t>
             </w:r>
@@ -1937,9 +1701,6 @@
               <w:jc w:val="left"/>
             </w:pPr>
             <w:r>
-              <w:rPr>
-                <w:sz w:val="17"/>
-              </w:rPr>
               <w:t xml:space="preserve">23</w:t>
             </w:r>
           </w:p>
@@ -2018,14 +1779,6 @@
         <w:tblW w:type="auto" w:w="0"/>
         <w:tblLook w:firstRow="1" w:lastRow="0" w:firstColumn="0" w:lastColumn="0" w:noHBand="0" w:noVBand="0" w:val="0020"/>
         <w:jc w:val="start"/>
-        <w:tblBorders>
-          <w:top w:val="single" w:sz="4" w:color="999999"/>
-          <w:left w:val="single" w:sz="4" w:color="999999"/>
-          <w:bottom w:val="single" w:sz="4" w:color="999999"/>
-          <w:right w:val="single" w:sz="4" w:color="999999"/>
-          <w:insideH w:val="single" w:sz="4" w:color="999999"/>
-          <w:insideV w:val="single" w:sz="4" w:color="999999"/>
-        </w:tblBorders>
       </w:tblPr>
       <w:tblGrid>
         <w:gridCol w:w="1980"/>
@@ -2045,10 +1798,6 @@
               <w:jc w:val="left"/>
             </w:pPr>
             <w:r>
-              <w:rPr>
-                <w:b/>
-                <w:sz w:val="17"/>
-              </w:rPr>
               <w:t xml:space="preserve">Family</w:t>
             </w:r>
           </w:p>
@@ -2061,10 +1810,6 @@
               <w:jc w:val="left"/>
             </w:pPr>
             <w:r>
-              <w:rPr>
-                <w:b/>
-                <w:sz w:val="17"/>
-              </w:rPr>
               <w:t xml:space="preserve">Studies</w:t>
             </w:r>
           </w:p>
@@ -2077,10 +1822,6 @@
               <w:jc w:val="left"/>
             </w:pPr>
             <w:r>
-              <w:rPr>
-                <w:b/>
-                <w:sz w:val="17"/>
-              </w:rPr>
               <w:t xml:space="preserve">Positive / negative / null / mixed (sign)</w:t>
             </w:r>
           </w:p>
@@ -2093,10 +1834,6 @@
               <w:jc w:val="left"/>
             </w:pPr>
             <w:r>
-              <w:rPr>
-                <w:b/>
-                <w:sz w:val="17"/>
-              </w:rPr>
               <w:t xml:space="preserve">Documents</w:t>
             </w:r>
           </w:p>
@@ -2111,9 +1848,6 @@
               <w:jc w:val="left"/>
             </w:pPr>
             <w:r>
-              <w:rPr>
-                <w:sz w:val="17"/>
-              </w:rPr>
               <w:t xml:space="preserve">A — legal recognition, eligibility and access</w:t>
             </w:r>
           </w:p>
@@ -2126,9 +1860,6 @@
               <w:jc w:val="left"/>
             </w:pPr>
             <w:r>
-              <w:rPr>
-                <w:sz w:val="17"/>
-              </w:rPr>
               <w:t xml:space="preserve">20</w:t>
             </w:r>
           </w:p>
@@ -2141,9 +1872,6 @@
               <w:jc w:val="left"/>
             </w:pPr>
             <w:r>
-              <w:rPr>
-                <w:sz w:val="17"/>
-              </w:rPr>
               <w:t xml:space="preserve">12 / 6 / 2 / 0</w:t>
             </w:r>
           </w:p>
@@ -2158,7 +1886,6 @@
             <w:r>
               <w:rPr>
                 <w:rStyle w:val="VerbatimChar"/>
-                <w:sz w:val="17"/>
               </w:rPr>
               <w:t xml:space="preserve">family_A_swim_synthesis_2026-09-28.md</w:t>
             </w:r>
@@ -2174,9 +1901,6 @@
               <w:jc w:val="left"/>
             </w:pPr>
             <w:r>
-              <w:rPr>
-                <w:sz w:val="17"/>
-              </w:rPr>
               <w:t xml:space="preserve">B — bureaucratic/administrative assistance</w:t>
             </w:r>
           </w:p>
@@ -2189,9 +1913,6 @@
               <w:jc w:val="left"/>
             </w:pPr>
             <w:r>
-              <w:rPr>
-                <w:sz w:val="17"/>
-              </w:rPr>
               <w:t xml:space="preserve">6</w:t>
             </w:r>
           </w:p>
@@ -2204,9 +1925,6 @@
               <w:jc w:val="left"/>
             </w:pPr>
             <w:r>
-              <w:rPr>
-                <w:sz w:val="17"/>
-              </w:rPr>
               <w:t xml:space="preserve">5 / 0 / 0 / 1</w:t>
             </w:r>
           </w:p>
@@ -2221,7 +1939,6 @@
             <w:r>
               <w:rPr>
                 <w:rStyle w:val="VerbatimChar"/>
-                <w:sz w:val="17"/>
               </w:rPr>
               <w:t xml:space="preserve">family_B_…</w:t>
             </w:r>
@@ -2237,9 +1954,6 @@
               <w:jc w:val="left"/>
             </w:pPr>
             <w:r>
-              <w:rPr>
-                <w:sz w:val="17"/>
-              </w:rPr>
               <w:t xml:space="preserve">C — administrative/legal barriers, ownership and price</w:t>
             </w:r>
           </w:p>
@@ -2252,9 +1966,6 @@
               <w:jc w:val="left"/>
             </w:pPr>
             <w:r>
-              <w:rPr>
-                <w:sz w:val="17"/>
-              </w:rPr>
               <w:t xml:space="preserve">20</w:t>
             </w:r>
           </w:p>
@@ -2267,9 +1978,6 @@
               <w:jc w:val="left"/>
             </w:pPr>
             <w:r>
-              <w:rPr>
-                <w:sz w:val="17"/>
-              </w:rPr>
               <w:t xml:space="preserve">7 / 9 / 0 / 4</w:t>
             </w:r>
           </w:p>
@@ -2284,7 +1992,6 @@
             <w:r>
               <w:rPr>
                 <w:rStyle w:val="VerbatimChar"/>
-                <w:sz w:val="17"/>
               </w:rPr>
               <w:t xml:space="preserve">family_C_…</w:t>
             </w:r>
@@ -2376,14 +2083,6 @@
         <w:tblW w:type="auto" w:w="0"/>
         <w:tblLook w:firstRow="1" w:lastRow="0" w:firstColumn="0" w:lastColumn="0" w:noHBand="0" w:noVBand="0" w:val="0020"/>
         <w:jc w:val="start"/>
-        <w:tblBorders>
-          <w:top w:val="single" w:sz="4" w:color="999999"/>
-          <w:left w:val="single" w:sz="4" w:color="999999"/>
-          <w:bottom w:val="single" w:sz="4" w:color="999999"/>
-          <w:right w:val="single" w:sz="4" w:color="999999"/>
-          <w:insideH w:val="single" w:sz="4" w:color="999999"/>
-          <w:insideV w:val="single" w:sz="4" w:color="999999"/>
-        </w:tblBorders>
       </w:tblPr>
       <w:tblGrid>
         <w:gridCol w:w="1584"/>
@@ -2404,10 +2103,6 @@
               <w:jc w:val="left"/>
             </w:pPr>
             <w:r>
-              <w:rPr>
-                <w:b/>
-                <w:sz w:val="17"/>
-              </w:rPr>
               <w:t xml:space="preserve">Study</w:t>
             </w:r>
           </w:p>
@@ -2420,10 +2115,6 @@
               <w:jc w:val="left"/>
             </w:pPr>
             <w:r>
-              <w:rPr>
-                <w:b/>
-                <w:sz w:val="17"/>
-              </w:rPr>
               <w:t xml:space="preserve">Country</w:t>
             </w:r>
           </w:p>
@@ -2436,10 +2127,6 @@
               <w:jc w:val="left"/>
             </w:pPr>
             <w:r>
-              <w:rPr>
-                <w:b/>
-                <w:sz w:val="17"/>
-              </w:rPr>
               <w:t xml:space="preserve">Tool</w:t>
             </w:r>
           </w:p>
@@ -2452,10 +2139,6 @@
               <w:jc w:val="left"/>
             </w:pPr>
             <w:r>
-              <w:rPr>
-                <w:b/>
-                <w:sz w:val="17"/>
-              </w:rPr>
               <w:t xml:space="preserve">Exposure (extracted)</w:t>
             </w:r>
           </w:p>
@@ -2468,10 +2151,6 @@
               <w:jc w:val="left"/>
             </w:pPr>
             <w:r>
-              <w:rPr>
-                <w:b/>
-                <w:sz w:val="17"/>
-              </w:rPr>
               <w:t xml:space="preserve">Direction (extracted)</w:t>
             </w:r>
           </w:p>
@@ -2486,9 +2165,6 @@
               <w:jc w:val="left"/>
             </w:pPr>
             <w:r>
-              <w:rPr>
-                <w:sz w:val="17"/>
-              </w:rPr>
               <w:t xml:space="preserve">S765</w:t>
             </w:r>
           </w:p>
@@ -2501,9 +2177,6 @@
               <w:jc w:val="left"/>
             </w:pPr>
             <w:r>
-              <w:rPr>
-                <w:sz w:val="17"/>
-              </w:rPr>
               <w:t xml:space="preserve">Peru</w:t>
             </w:r>
           </w:p>
@@ -2516,9 +2189,6 @@
               <w:jc w:val="left"/>
             </w:pPr>
             <w:r>
-              <w:rPr>
-                <w:sz w:val="17"/>
-              </w:rPr>
               <w:t xml:space="preserve">ROBINS-I</w:t>
             </w:r>
           </w:p>
@@ -2531,9 +2201,6 @@
               <w:jc w:val="left"/>
             </w:pPr>
             <w:r>
-              <w:rPr>
-                <w:sz w:val="17"/>
-              </w:rPr>
               <w:t xml:space="preserve">Household acquisition of a legal land title under Peru's PETT (Proyecto Especial de Titulacion…</w:t>
             </w:r>
           </w:p>
@@ -2546,9 +2213,6 @@
               <w:jc w:val="left"/>
             </w:pPr>
             <w:r>
-              <w:rPr>
-                <w:sz w:val="17"/>
-              </w:rPr>
               <w:t xml:space="preserve">positive (statistically significant)</w:t>
             </w:r>
           </w:p>
@@ -2563,9 +2227,6 @@
               <w:jc w:val="left"/>
             </w:pPr>
             <w:r>
-              <w:rPr>
-                <w:sz w:val="17"/>
-              </w:rPr>
               <w:t xml:space="preserve">S398</w:t>
             </w:r>
           </w:p>
@@ -2578,9 +2239,6 @@
               <w:jc w:val="left"/>
             </w:pPr>
             <w:r>
-              <w:rPr>
-                <w:sz w:val="17"/>
-              </w:rPr>
               <w:t xml:space="preserve">Brazil</w:t>
             </w:r>
           </w:p>
@@ -2593,9 +2251,6 @@
               <w:jc w:val="left"/>
             </w:pPr>
             <w:r>
-              <w:rPr>
-                <w:sz w:val="17"/>
-              </w:rPr>
               <w:t xml:space="preserve">ROBINS-I</w:t>
             </w:r>
           </w:p>
@@ -2608,9 +2263,6 @@
               <w:jc w:val="left"/>
             </w:pPr>
             <w:r>
-              <w:rPr>
-                <w:sz w:val="17"/>
-              </w:rPr>
               <w:t xml:space="preserve">Household census-tract location within an area designated ZEIS (Zona Especial de Interesse Soci…</w:t>
             </w:r>
           </w:p>
@@ -2623,9 +2275,6 @@
               <w:jc w:val="left"/>
             </w:pPr>
             <w:r>
-              <w:rPr>
-                <w:sz w:val="17"/>
-              </w:rPr>
               <w:t xml:space="preserve">positive (ZEIS designation associated with increased water/sewage-network access and homeownership)</w:t>
             </w:r>
           </w:p>
@@ -2640,9 +2289,6 @@
               <w:jc w:val="left"/>
             </w:pPr>
             <w:r>
-              <w:rPr>
-                <w:sz w:val="17"/>
-              </w:rPr>
               <w:t xml:space="preserve">S1122</w:t>
             </w:r>
           </w:p>
@@ -2655,9 +2301,6 @@
               <w:jc w:val="left"/>
             </w:pPr>
             <w:r>
-              <w:rPr>
-                <w:sz w:val="17"/>
-              </w:rPr>
               <w:t xml:space="preserve">Burkina Faso</w:t>
             </w:r>
           </w:p>
@@ -2670,9 +2313,6 @@
               <w:jc w:val="left"/>
             </w:pPr>
             <w:r>
-              <w:rPr>
-                <w:sz w:val="17"/>
-              </w:rPr>
               <w:t xml:space="preserve">ROBINS-I</w:t>
             </w:r>
           </w:p>
@@ -2685,9 +2325,6 @@
               <w:jc w:val="left"/>
             </w:pPr>
             <w:r>
-              <w:rPr>
-                <w:sz w:val="17"/>
-              </w:rPr>
               <w:t xml:space="preserve">Legal/administrative zoning status of residence (zoned vs. non-zoned/spontaneous-settlement lan…</w:t>
             </w:r>
           </w:p>
@@ -2700,9 +2337,6 @@
               <w:jc w:val="left"/>
             </w:pPr>
             <w:r>
-              <w:rPr>
-                <w:sz w:val="17"/>
-              </w:rPr>
               <w:t xml:space="preserve">negative (non-zoned/informal legal status sharply reduces hazard of gaining piped water access; effect compoun…</w:t>
             </w:r>
           </w:p>
@@ -2717,9 +2351,6 @@
               <w:jc w:val="left"/>
             </w:pPr>
             <w:r>
-              <w:rPr>
-                <w:sz w:val="17"/>
-              </w:rPr>
               <w:t xml:space="preserve">S142</w:t>
             </w:r>
           </w:p>
@@ -2732,9 +2363,6 @@
               <w:jc w:val="left"/>
             </w:pPr>
             <w:r>
-              <w:rPr>
-                <w:sz w:val="17"/>
-              </w:rPr>
               <w:t xml:space="preserve">United States</w:t>
             </w:r>
           </w:p>
@@ -2747,9 +2375,6 @@
               <w:jc w:val="left"/>
             </w:pPr>
             <w:r>
-              <w:rPr>
-                <w:sz w:val="17"/>
-              </w:rPr>
               <w:t xml:space="preserve">ROBINS-I</w:t>
             </w:r>
           </w:p>
@@ -2762,9 +2387,6 @@
               <w:jc w:val="left"/>
             </w:pPr>
             <w:r>
-              <w:rPr>
-                <w:sz w:val="17"/>
-              </w:rPr>
               <w:t xml:space="preserve">Municipal incorporation status (incorporated vs. unincorporated), which functions as the legal/…</w:t>
             </w:r>
           </w:p>
@@ -2777,9 +2399,6 @@
               <w:jc w:val="left"/>
             </w:pPr>
             <w:r>
-              <w:rPr>
-                <w:sz w:val="17"/>
-              </w:rPr>
               <w:t xml:space="preserve">negative (unincorporated/unrecognized jurisdictional status associated with reduced service access)</w:t>
             </w:r>
           </w:p>
@@ -2794,9 +2413,6 @@
               <w:jc w:val="left"/>
             </w:pPr>
             <w:r>
-              <w:rPr>
-                <w:sz w:val="17"/>
-              </w:rPr>
               <w:t xml:space="preserve">S057</w:t>
             </w:r>
           </w:p>
@@ -2809,9 +2425,6 @@
               <w:jc w:val="left"/>
             </w:pPr>
             <w:r>
-              <w:rPr>
-                <w:sz w:val="17"/>
-              </w:rPr>
               <w:t xml:space="preserve">Cambodia</w:t>
             </w:r>
           </w:p>
@@ -2824,9 +2437,6 @@
               <w:jc w:val="left"/>
             </w:pPr>
             <w:r>
-              <w:rPr>
-                <w:sz w:val="17"/>
-              </w:rPr>
               <w:t xml:space="preserve">RoB 2</w:t>
             </w:r>
           </w:p>
@@ -2839,9 +2449,6 @@
               <w:jc w:val="left"/>
             </w:pPr>
             <w:r>
-              <w:rPr>
-                <w:sz w:val="17"/>
-              </w:rPr>
               <w:t xml:space="preserve">Random offer of a targeted sanitation subsidy to households determined eligible via the Poverty…</w:t>
             </w:r>
           </w:p>
@@ -2854,9 +2461,6 @@
               <w:jc w:val="left"/>
             </w:pPr>
             <w:r>
-              <w:rPr>
-                <w:sz w:val="17"/>
-              </w:rPr>
               <w:t xml:space="preserve">positive (subsidy eligibility increases sanitation-product purchase)</w:t>
             </w:r>
           </w:p>
@@ -2871,9 +2475,6 @@
               <w:jc w:val="left"/>
             </w:pPr>
             <w:r>
-              <w:rPr>
-                <w:sz w:val="17"/>
-              </w:rPr>
               <w:t xml:space="preserve">S104</w:t>
             </w:r>
           </w:p>
@@ -2886,9 +2487,6 @@
               <w:jc w:val="left"/>
             </w:pPr>
             <w:r>
-              <w:rPr>
-                <w:sz w:val="17"/>
-              </w:rPr>
               <w:t xml:space="preserve">Zambia</w:t>
             </w:r>
           </w:p>
@@ -2901,9 +2499,6 @@
               <w:jc w:val="left"/>
             </w:pPr>
             <w:r>
-              <w:rPr>
-                <w:sz w:val="17"/>
-              </w:rPr>
               <w:t xml:space="preserve">JBI Cross-Sectional</w:t>
             </w:r>
           </w:p>
@@ -2916,9 +2511,6 @@
               <w:jc w:val="left"/>
             </w:pPr>
             <w:r>
-              <w:rPr>
-                <w:sz w:val="17"/>
-              </w:rPr>
               <w:t xml:space="preserve">Household home-ownership / tenure status (owner vs. non-owner) in a multilevel household-neighb…</w:t>
             </w:r>
           </w:p>
@@ -2931,9 +2523,6 @@
               <w:jc w:val="left"/>
             </w:pPr>
             <w:r>
-              <w:rPr>
-                <w:sz w:val="17"/>
-              </w:rPr>
               <w:t xml:space="preserve">positive (home ownership associated with higher odds of interruption -- direction counter to a simple "tenure…</w:t>
             </w:r>
           </w:p>
@@ -2948,9 +2537,6 @@
               <w:jc w:val="left"/>
             </w:pPr>
             <w:r>
-              <w:rPr>
-                <w:sz w:val="17"/>
-              </w:rPr>
               <w:t xml:space="preserve">S1020</w:t>
             </w:r>
           </w:p>
@@ -2963,9 +2549,6 @@
               <w:jc w:val="left"/>
             </w:pPr>
             <w:r>
-              <w:rPr>
-                <w:sz w:val="17"/>
-              </w:rPr>
               <w:t xml:space="preserve">India</w:t>
             </w:r>
           </w:p>
@@ -2978,9 +2561,6 @@
               <w:jc w:val="left"/>
             </w:pPr>
             <w:r>
-              <w:rPr>
-                <w:sz w:val="17"/>
-              </w:rPr>
               <w:t xml:space="preserve">ROBINS-I</w:t>
             </w:r>
           </w:p>
@@ -2993,9 +2573,6 @@
               <w:jc w:val="left"/>
             </w:pPr>
             <w:r>
-              <w:rPr>
-                <w:sz w:val="17"/>
-              </w:rPr>
               <w:t xml:space="preserve">Household residence in a treatment micro-watershed subject to a government watershed-developmen…</w:t>
             </w:r>
           </w:p>
@@ -3008,9 +2585,6 @@
               <w:jc w:val="left"/>
             </w:pPr>
             <w:r>
-              <w:rPr>
-                <w:sz w:val="17"/>
-              </w:rPr>
               <w:t xml:space="preserve">negative (watershed-development intervention associated with increased, i.e. worsened, domestic water collecti…</w:t>
             </w:r>
           </w:p>
@@ -3025,9 +2599,6 @@
               <w:jc w:val="left"/>
             </w:pPr>
             <w:r>
-              <w:rPr>
-                <w:sz w:val="17"/>
-              </w:rPr>
               <w:t xml:space="preserve">S1121</w:t>
             </w:r>
           </w:p>
@@ -3040,9 +2611,6 @@
               <w:jc w:val="left"/>
             </w:pPr>
             <w:r>
-              <w:rPr>
-                <w:sz w:val="17"/>
-              </w:rPr>
               <w:t xml:space="preserve">United States</w:t>
             </w:r>
           </w:p>
@@ -3055,9 +2623,6 @@
               <w:jc w:val="left"/>
             </w:pPr>
             <w:r>
-              <w:rPr>
-                <w:sz w:val="17"/>
-              </w:rPr>
               <w:t xml:space="preserve">ROBINS-I</w:t>
             </w:r>
           </w:p>
@@ -3070,9 +2635,6 @@
               <w:jc w:val="left"/>
             </w:pPr>
             <w:r>
-              <w:rPr>
-                <w:sz w:val="17"/>
-              </w:rPr>
               <w:t xml:space="preserve">Local government adoption of a water-adequacy screening policy (an administrative-review growth…</w:t>
             </w:r>
           </w:p>
@@ -3085,9 +2647,6 @@
               <w:jc w:val="left"/>
             </w:pPr>
             <w:r>
-              <w:rPr>
-                <w:sz w:val="17"/>
-              </w:rPr>
               <w:t xml:space="preserve">negative (water-adequacy screening reduces new residential water-connection permitting)</w:t>
             </w:r>
           </w:p>
@@ -3102,9 +2661,6 @@
               <w:jc w:val="left"/>
             </w:pPr>
             <w:r>
-              <w:rPr>
-                <w:sz w:val="17"/>
-              </w:rPr>
               <w:t xml:space="preserve">S085</w:t>
             </w:r>
           </w:p>
@@ -3117,9 +2673,6 @@
               <w:jc w:val="left"/>
             </w:pPr>
             <w:r>
-              <w:rPr>
-                <w:sz w:val="17"/>
-              </w:rPr>
               <w:t xml:space="preserve">India</w:t>
             </w:r>
           </w:p>
@@ -3132,9 +2685,6 @@
               <w:jc w:val="left"/>
             </w:pPr>
             <w:r>
-              <w:rPr>
-                <w:sz w:val="17"/>
-              </w:rPr>
               <w:t xml:space="preserve">RoB 2</w:t>
             </w:r>
           </w:p>
@@ -3147,9 +2697,6 @@
               <w:jc w:val="left"/>
             </w:pPr>
             <w:r>
-              <w:rPr>
-                <w:sz w:val="17"/>
-              </w:rPr>
               <w:t xml:space="preserve">Random assignment to bureaucratic-assistance treatment (T1: help completing formalization appli…</w:t>
             </w:r>
           </w:p>
@@ -3162,9 +2709,6 @@
               <w:jc w:val="left"/>
             </w:pPr>
             <w:r>
-              <w:rPr>
-                <w:sz w:val="17"/>
-              </w:rPr>
               <w:t xml:space="preserve">positive (bureaucratic assistance increases formalization, conditional on political coordination)</w:t>
             </w:r>
           </w:p>
@@ -3179,9 +2723,6 @@
               <w:jc w:val="left"/>
             </w:pPr>
             <w:r>
-              <w:rPr>
-                <w:sz w:val="17"/>
-              </w:rPr>
               <w:t xml:space="preserve">S294</w:t>
             </w:r>
           </w:p>
@@ -3194,9 +2735,6 @@
               <w:jc w:val="left"/>
             </w:pPr>
             <w:r>
-              <w:rPr>
-                <w:sz w:val="17"/>
-              </w:rPr>
               <w:t xml:space="preserve">Democratic Republic of Congo</w:t>
             </w:r>
           </w:p>
@@ -3209,9 +2747,6 @@
               <w:jc w:val="left"/>
             </w:pPr>
             <w:r>
-              <w:rPr>
-                <w:sz w:val="17"/>
-              </w:rPr>
               <w:t xml:space="preserve">RoB 2</w:t>
             </w:r>
           </w:p>
@@ -3224,9 +2759,6 @@
               <w:jc w:val="left"/>
             </w:pPr>
             <w:r>
-              <w:rPr>
-                <w:sz w:val="17"/>
-              </w:rPr>
               <w:t xml:space="preserve">Random assignment to a community-driven WASH intervention with an institutional-strengthening c…</w:t>
             </w:r>
           </w:p>
@@ -3239,9 +2771,6 @@
               <w:jc w:val="left"/>
             </w:pPr>
             <w:r>
-              <w:rPr>
-                <w:sz w:val="17"/>
-              </w:rPr>
               <w:t xml:space="preserve">null (health outcomes); positive (institutional-strengthening outcome)</w:t>
             </w:r>
           </w:p>
@@ -3256,9 +2785,6 @@
               <w:jc w:val="left"/>
             </w:pPr>
             <w:r>
-              <w:rPr>
-                <w:sz w:val="17"/>
-              </w:rPr>
               <w:t xml:space="preserve">S526</w:t>
             </w:r>
           </w:p>
@@ -3271,9 +2797,6 @@
               <w:jc w:val="left"/>
             </w:pPr>
             <w:r>
-              <w:rPr>
-                <w:sz w:val="17"/>
-              </w:rPr>
               <w:t xml:space="preserve">United States</w:t>
             </w:r>
           </w:p>
@@ -3286,9 +2809,6 @@
               <w:jc w:val="left"/>
             </w:pPr>
             <w:r>
-              <w:rPr>
-                <w:sz w:val="17"/>
-              </w:rPr>
               <w:t xml:space="preserve">JBI Cross-Sectional</w:t>
             </w:r>
           </w:p>
@@ -3301,9 +2821,6 @@
               <w:jc w:val="left"/>
             </w:pPr>
             <w:r>
-              <w:rPr>
-                <w:sz w:val="17"/>
-              </w:rPr>
               <w:t xml:space="preserve">Utility ownership/governance type: investor-owned (private) water utility with rates set by a s…</w:t>
             </w:r>
           </w:p>
@@ -3316,9 +2833,6 @@
               <w:jc w:val="left"/>
             </w:pPr>
             <w:r>
-              <w:rPr>
-                <w:sz w:val="17"/>
-              </w:rPr>
               <w:t xml:space="preserve">negative (private ownership associated with less progressive/more regressive water pricing)</w:t>
             </w:r>
           </w:p>
@@ -3333,9 +2847,6 @@
               <w:jc w:val="left"/>
             </w:pPr>
             <w:r>
-              <w:rPr>
-                <w:sz w:val="17"/>
-              </w:rPr>
               <w:t xml:space="preserve">S539</w:t>
             </w:r>
           </w:p>
@@ -3348,9 +2859,6 @@
               <w:jc w:val="left"/>
             </w:pPr>
             <w:r>
-              <w:rPr>
-                <w:sz w:val="17"/>
-              </w:rPr>
               <w:t xml:space="preserve">United States</w:t>
             </w:r>
           </w:p>
@@ -3363,9 +2871,6 @@
               <w:jc w:val="left"/>
             </w:pPr>
             <w:r>
-              <w:rPr>
-                <w:sz w:val="17"/>
-              </w:rPr>
               <w:t xml:space="preserve">JBI Cross-Sectional</w:t>
             </w:r>
           </w:p>
@@ -3378,9 +2883,6 @@
               <w:jc w:val="left"/>
             </w:pPr>
             <w:r>
-              <w:rPr>
-                <w:sz w:val="17"/>
-              </w:rPr>
               <w:t xml:space="preserve">Investor-owned (private) community water utility, with rates set via state Public Utility Commi…</w:t>
             </w:r>
           </w:p>
@@ -3393,9 +2895,6 @@
               <w:jc w:val="left"/>
             </w:pPr>
             <w:r>
-              <w:rPr>
-                <w:sz w:val="17"/>
-              </w:rPr>
               <w:t xml:space="preserve">positive (private ownership and pro-private regulation associated with higher price and lower affordability)</w:t>
             </w:r>
           </w:p>
@@ -3410,9 +2909,6 @@
               <w:jc w:val="left"/>
             </w:pPr>
             <w:r>
-              <w:rPr>
-                <w:sz w:val="17"/>
-              </w:rPr>
               <w:t xml:space="preserve">S749</w:t>
             </w:r>
           </w:p>
@@ -3425,9 +2921,6 @@
               <w:jc w:val="left"/>
             </w:pPr>
             <w:r>
-              <w:rPr>
-                <w:sz w:val="17"/>
-              </w:rPr>
               <w:t xml:space="preserve">Brazil</w:t>
             </w:r>
           </w:p>
@@ -3440,9 +2933,6 @@
               <w:jc w:val="left"/>
             </w:pPr>
             <w:r>
-              <w:rPr>
-                <w:sz w:val="17"/>
-              </w:rPr>
               <w:t xml:space="preserve">JBI Cross-Sectional</w:t>
             </w:r>
           </w:p>
@@ -3455,9 +2945,6 @@
               <w:jc w:val="left"/>
             </w:pPr>
             <w:r>
-              <w:rPr>
-                <w:sz w:val="17"/>
-              </w:rPr>
               <w:t xml:space="preserve">Private (vs. public) ownership of a Brazilian water and sanitation business corporation -- a go…</w:t>
             </w:r>
           </w:p>
@@ -3470,9 +2957,6 @@
               <w:jc w:val="left"/>
             </w:pPr>
             <w:r>
-              <w:rPr>
-                <w:sz w:val="17"/>
-              </w:rPr>
               <w:t xml:space="preserve">positive (private ownership associated with HIGHER water tariffs, i.e. lower affordability, relative to public…</w:t>
             </w:r>
           </w:p>
@@ -3487,9 +2971,6 @@
               <w:jc w:val="left"/>
             </w:pPr>
             <w:r>
-              <w:rPr>
-                <w:sz w:val="17"/>
-              </w:rPr>
               <w:t xml:space="preserve">S631</w:t>
             </w:r>
           </w:p>
@@ -3502,9 +2983,6 @@
               <w:jc w:val="left"/>
             </w:pPr>
             <w:r>
-              <w:rPr>
-                <w:sz w:val="17"/>
-              </w:rPr>
               <w:t xml:space="preserve">Indonesia</w:t>
             </w:r>
           </w:p>
@@ -3517,9 +2995,6 @@
               <w:jc w:val="left"/>
             </w:pPr>
             <w:r>
-              <w:rPr>
-                <w:sz w:val="17"/>
-              </w:rPr>
               <w:t xml:space="preserve">JBI Cross-Sectional</w:t>
             </w:r>
           </w:p>
@@ -3532,9 +3007,6 @@
               <w:jc w:val="left"/>
             </w:pPr>
             <w:r>
-              <w:rPr>
-                <w:sz w:val="17"/>
-              </w:rPr>
               <w:t xml:space="preserve">Creation of a new local government (kabupaten/kota) via pemekaran -- the legal/administrative s…</w:t>
             </w:r>
           </w:p>
@@ -3547,9 +3019,6 @@
               <w:jc w:val="left"/>
             </w:pPr>
             <w:r>
-              <w:rPr>
-                <w:sz w:val="17"/>
-              </w:rPr>
               <w:t xml:space="preserve">negative (local government proliferation associated with LOWER household water/sanitation access, relative to…</w:t>
             </w:r>
           </w:p>
@@ -3564,9 +3033,6 @@
               <w:jc w:val="left"/>
             </w:pPr>
             <w:r>
-              <w:rPr>
-                <w:sz w:val="17"/>
-              </w:rPr>
               <w:t xml:space="preserve">S947</w:t>
             </w:r>
           </w:p>
@@ -3579,9 +3045,6 @@
               <w:jc w:val="left"/>
             </w:pPr>
             <w:r>
-              <w:rPr>
-                <w:sz w:val="17"/>
-              </w:rPr>
               <w:t xml:space="preserve">44 African countries</w:t>
             </w:r>
           </w:p>
@@ -3594,9 +3057,6 @@
               <w:jc w:val="left"/>
             </w:pPr>
             <w:r>
-              <w:rPr>
-                <w:sz w:val="17"/>
-              </w:rPr>
               <w:t xml:space="preserve">ROBINS-I</w:t>
             </w:r>
           </w:p>
@@ -3609,9 +3069,6 @@
               <w:jc w:val="left"/>
             </w:pPr>
             <w:r>
-              <w:rPr>
-                <w:sz w:val="17"/>
-              </w:rPr>
               <w:t xml:space="preserve">Higher institutional/regulatory governance quality (World Bank Worldwide Governance Indicators…</w:t>
             </w:r>
           </w:p>
@@ -3624,9 +3081,6 @@
               <w:jc w:val="left"/>
             </w:pPr>
             <w:r>
-              <w:rPr>
-                <w:sz w:val="17"/>
-              </w:rPr>
               <w:t xml:space="preserve">positive (higher institutional/regulatory quality associated with greater water/sanitation access and smaller…</w:t>
             </w:r>
           </w:p>
@@ -3641,9 +3095,6 @@
               <w:jc w:val="left"/>
             </w:pPr>
             <w:r>
-              <w:rPr>
-                <w:sz w:val="17"/>
-              </w:rPr>
               <w:t xml:space="preserve">S1146</w:t>
             </w:r>
           </w:p>
@@ -3656,9 +3107,6 @@
               <w:jc w:val="left"/>
             </w:pPr>
             <w:r>
-              <w:rPr>
-                <w:sz w:val="17"/>
-              </w:rPr>
               <w:t xml:space="preserve">multi-country (Africa, Afrob</w:t>
             </w:r>
           </w:p>
@@ -3671,9 +3119,6 @@
               <w:jc w:val="left"/>
             </w:pPr>
             <w:r>
-              <w:rPr>
-                <w:sz w:val="17"/>
-              </w:rPr>
               <w:t xml:space="preserve">ROBINS-I</w:t>
             </w:r>
           </w:p>
@@ -3686,9 +3131,6 @@
               <w:jc w:val="left"/>
             </w:pPr>
             <w:r>
-              <w:rPr>
-                <w:sz w:val="17"/>
-              </w:rPr>
               <w:t xml:space="preserve">Regional incidence of utilities-sector corruption (Afrobarometer round 7, multi-country Africa…</w:t>
             </w:r>
           </w:p>
@@ -3701,9 +3143,6 @@
               <w:jc w:val="left"/>
             </w:pPr>
             <w:r>
-              <w:rPr>
-                <w:sz w:val="17"/>
-              </w:rPr>
               <w:t xml:space="preserve">negative (higher regional utilities-sector corruption reduces likelihood of reported adequate household water…</w:t>
             </w:r>
           </w:p>
@@ -3718,9 +3157,6 @@
               <w:jc w:val="left"/>
             </w:pPr>
             <w:r>
-              <w:rPr>
-                <w:sz w:val="17"/>
-              </w:rPr>
               <w:t xml:space="preserve">S879</w:t>
             </w:r>
           </w:p>
@@ -3733,9 +3169,6 @@
               <w:jc w:val="left"/>
             </w:pPr>
             <w:r>
-              <w:rPr>
-                <w:sz w:val="17"/>
-              </w:rPr>
               <w:t xml:space="preserve">Kenya</w:t>
             </w:r>
           </w:p>
@@ -3748,9 +3181,6 @@
               <w:jc w:val="left"/>
             </w:pPr>
             <w:r>
-              <w:rPr>
-                <w:sz w:val="17"/>
-              </w:rPr>
               <w:t xml:space="preserve">RoB 2</w:t>
             </w:r>
           </w:p>
@@ -3763,9 +3193,6 @@
               <w:jc w:val="left"/>
             </w:pPr>
             <w:r>
-              <w:rPr>
-                <w:sz w:val="17"/>
-              </w:rPr>
               <w:t xml:space="preserve">Randomized assignment to systematic contract enforcement (transparent, credible service-disconn…</w:t>
             </w:r>
           </w:p>
@@ -3778,9 +3205,6 @@
               <w:jc w:val="left"/>
             </w:pPr>
             <w:r>
-              <w:rPr>
-                <w:sz w:val="17"/>
-              </w:rPr>
               <w:t xml:space="preserve">positive and significant for payment compliance; null (no significant effect) for water access, connection rat…</w:t>
             </w:r>
           </w:p>
@@ -3795,9 +3219,6 @@
               <w:jc w:val="left"/>
             </w:pPr>
             <w:r>
-              <w:rPr>
-                <w:sz w:val="17"/>
-              </w:rPr>
               <w:t xml:space="preserve">S1062</w:t>
             </w:r>
           </w:p>
@@ -3810,9 +3231,6 @@
               <w:jc w:val="left"/>
             </w:pPr>
             <w:r>
-              <w:rPr>
-                <w:sz w:val="17"/>
-              </w:rPr>
               <w:t xml:space="preserve">multi-country (22 Sub-Sahara</w:t>
             </w:r>
           </w:p>
@@ -3825,9 +3243,6 @@
               <w:jc w:val="left"/>
             </w:pPr>
             <w:r>
-              <w:rPr>
-                <w:sz w:val="17"/>
-              </w:rPr>
               <w:t xml:space="preserve">ROBINS-I</w:t>
             </w:r>
           </w:p>
@@ -3840,9 +3255,6 @@
               <w:jc w:val="left"/>
             </w:pPr>
             <w:r>
-              <w:rPr>
-                <w:sz w:val="17"/>
-              </w:rPr>
               <w:t xml:space="preserve">Water-utility operation-and-maintenance (O&amp;M) cost-recovery ratio (a financial/regulatory insti…</w:t>
             </w:r>
           </w:p>
@@ -3855,9 +3267,6 @@
               <w:jc w:val="left"/>
             </w:pPr>
             <w:r>
-              <w:rPr>
-                <w:sz w:val="17"/>
-              </w:rPr>
               <w:t xml:space="preserve">positive up to a threshold, then negative (curvilinear/inverted-U)</w:t>
             </w:r>
           </w:p>
@@ -3939,14 +3348,6 @@
         <w:tblW w:type="auto" w:w="0"/>
         <w:tblLook w:firstRow="1" w:lastRow="0" w:firstColumn="0" w:lastColumn="0" w:noHBand="0" w:noVBand="0" w:val="0020"/>
         <w:jc w:val="start"/>
-        <w:tblBorders>
-          <w:top w:val="single" w:sz="4" w:color="999999"/>
-          <w:left w:val="single" w:sz="4" w:color="999999"/>
-          <w:bottom w:val="single" w:sz="4" w:color="999999"/>
-          <w:right w:val="single" w:sz="4" w:color="999999"/>
-          <w:insideH w:val="single" w:sz="4" w:color="999999"/>
-          <w:insideV w:val="single" w:sz="4" w:color="999999"/>
-        </w:tblBorders>
       </w:tblPr>
       <w:tblGrid>
         <w:gridCol w:w="1584"/>
@@ -3967,10 +3368,6 @@
               <w:jc w:val="left"/>
             </w:pPr>
             <w:r>
-              <w:rPr>
-                <w:b/>
-                <w:sz w:val="17"/>
-              </w:rPr>
               <w:t xml:space="preserve">Study</w:t>
             </w:r>
           </w:p>
@@ -3983,10 +3380,6 @@
               <w:jc w:val="left"/>
             </w:pPr>
             <w:r>
-              <w:rPr>
-                <w:b/>
-                <w:sz w:val="17"/>
-              </w:rPr>
               <w:t xml:space="preserve">Country</w:t>
             </w:r>
           </w:p>
@@ -3999,10 +3392,6 @@
               <w:jc w:val="left"/>
             </w:pPr>
             <w:r>
-              <w:rPr>
-                <w:b/>
-                <w:sz w:val="17"/>
-              </w:rPr>
               <w:t xml:space="preserve">Design</w:t>
             </w:r>
           </w:p>
@@ -4015,10 +3404,6 @@
               <w:jc w:val="left"/>
             </w:pPr>
             <w:r>
-              <w:rPr>
-                <w:b/>
-                <w:sz w:val="17"/>
-              </w:rPr>
               <w:t xml:space="preserve">Own recorded mechanism label → draft family</w:t>
             </w:r>
           </w:p>
@@ -4031,10 +3416,6 @@
               <w:jc w:val="left"/>
             </w:pPr>
             <w:r>
-              <w:rPr>
-                <w:b/>
-                <w:sz w:val="17"/>
-              </w:rPr>
               <w:t xml:space="preserve">Extracted finding (truncated)</w:t>
             </w:r>
           </w:p>
@@ -4049,9 +3430,6 @@
               <w:jc w:val="left"/>
             </w:pPr>
             <w:r>
-              <w:rPr>
-                <w:sz w:val="17"/>
-              </w:rPr>
               <w:t xml:space="preserve">S101</w:t>
             </w:r>
           </w:p>
@@ -4064,9 +3442,6 @@
               <w:jc w:val="left"/>
             </w:pPr>
             <w:r>
-              <w:rPr>
-                <w:sz w:val="17"/>
-              </w:rPr>
               <w:t xml:space="preserve">Kenya</w:t>
             </w:r>
           </w:p>
@@ -4079,9 +3454,6 @@
               <w:jc w:val="left"/>
             </w:pPr>
             <w:r>
-              <w:rPr>
-                <w:sz w:val="17"/>
-              </w:rPr>
               <w:t xml:space="preserve">qualitative</w:t>
             </w:r>
           </w:p>
@@ -4094,9 +3466,6 @@
               <w:jc w:val="left"/>
             </w:pPr>
             <w:r>
-              <w:rPr>
-                <w:sz w:val="17"/>
-              </w:rPr>
               <w:t xml:space="preserve">DISCRETION_ACCOMMODATION → discretion accommodation</w:t>
             </w:r>
           </w:p>
@@ -4109,9 +3478,6 @@
               <w:jc w:val="left"/>
             </w:pPr>
             <w:r>
-              <w:rPr>
-                <w:sz w:val="17"/>
-              </w:rPr>
               <w:t xml:space="preserve">Formal water connection through Nairobi's piped grid does not equal reliable water access: neighborhood disparities exist even among neighbors with formally equivalent connections, because water rights are 'con…</w:t>
             </w:r>
           </w:p>
@@ -4126,9 +3492,6 @@
               <w:jc w:val="left"/>
             </w:pPr>
             <w:r>
-              <w:rPr>
-                <w:sz w:val="17"/>
-              </w:rPr>
               <w:t xml:space="preserve">S253</w:t>
             </w:r>
           </w:p>
@@ -4141,9 +3504,6 @@
               <w:jc w:val="left"/>
             </w:pPr>
             <w:r>
-              <w:rPr>
-                <w:sz w:val="17"/>
-              </w:rPr>
               <w:t xml:space="preserve">United States</w:t>
             </w:r>
           </w:p>
@@ -4156,9 +3516,6 @@
               <w:jc w:val="left"/>
             </w:pPr>
             <w:r>
-              <w:rPr>
-                <w:sz w:val="17"/>
-              </w:rPr>
               <w:t xml:space="preserve">qualitative</w:t>
             </w:r>
           </w:p>
@@ -4171,9 +3528,6 @@
               <w:jc w:val="left"/>
             </w:pPr>
             <w:r>
-              <w:rPr>
-                <w:sz w:val="17"/>
-              </w:rPr>
               <w:t xml:space="preserve">ENFORCEMENT → enforcement sanctions</w:t>
             </w:r>
           </w:p>
@@ -4186,9 +3540,6 @@
               <w:jc w:val="left"/>
             </w:pPr>
             <w:r>
-              <w:rPr>
-                <w:sz w:val="17"/>
-              </w:rPr>
               <w:t xml:space="preserve">Community members and professionals engaged in environmental health literacy (EHL) efforts on Tribal lands face persistent challenges in skill-building, obtaining accessible information, and navigating the laye…</w:t>
             </w:r>
           </w:p>
@@ -4203,9 +3554,6 @@
               <w:jc w:val="left"/>
             </w:pPr>
             <w:r>
-              <w:rPr>
-                <w:sz w:val="17"/>
-              </w:rPr>
               <w:t xml:space="preserve">S305</w:t>
             </w:r>
           </w:p>
@@ -4218,9 +3566,6 @@
               <w:jc w:val="left"/>
             </w:pPr>
             <w:r>
-              <w:rPr>
-                <w:sz w:val="17"/>
-              </w:rPr>
               <w:t xml:space="preserve">multi-country (Ecuador,</w:t>
             </w:r>
           </w:p>
@@ -4233,9 +3578,6 @@
               <w:jc w:val="left"/>
             </w:pPr>
             <w:r>
-              <w:rPr>
-                <w:sz w:val="17"/>
-              </w:rPr>
               <w:t xml:space="preserve">qualitative</w:t>
             </w:r>
           </w:p>
@@ -4248,9 +3590,6 @@
               <w:jc w:val="left"/>
             </w:pPr>
             <w:r>
-              <w:rPr>
-                <w:sz w:val="17"/>
-              </w:rPr>
               <w:t xml:space="preserve">ELIGIBILITY → eligibility status documentation</w:t>
             </w:r>
           </w:p>
@@ -4263,9 +3602,6 @@
               <w:jc w:val="left"/>
             </w:pPr>
             <w:r>
-              <w:rPr>
-                <w:sz w:val="17"/>
-              </w:rPr>
               <w:t xml:space="preserve">Comparing successful (Ecuador 2008) and unsuccessful (Chile 2022) constitutional water-change processes, the article argues that where there is no agreement on either science or policy, politicization is requir…</w:t>
             </w:r>
           </w:p>
@@ -4280,9 +3616,6 @@
               <w:jc w:val="left"/>
             </w:pPr>
             <w:r>
-              <w:rPr>
-                <w:sz w:val="17"/>
-              </w:rPr>
               <w:t xml:space="preserve">S307</w:t>
             </w:r>
           </w:p>
@@ -4295,9 +3628,6 @@
               <w:jc w:val="left"/>
             </w:pPr>
             <w:r>
-              <w:rPr>
-                <w:sz w:val="17"/>
-              </w:rPr>
               <w:t xml:space="preserve">multi-country</w:t>
             </w:r>
           </w:p>
@@ -4310,9 +3640,6 @@
               <w:jc w:val="left"/>
             </w:pPr>
             <w:r>
-              <w:rPr>
-                <w:sz w:val="17"/>
-              </w:rPr>
               <w:t xml:space="preserve">qualitative</w:t>
             </w:r>
           </w:p>
@@ -4325,9 +3652,6 @@
               <w:jc w:val="left"/>
             </w:pPr>
             <w:r>
-              <w:rPr>
-                <w:sz w:val="17"/>
-              </w:rPr>
               <w:t xml:space="preserve">BURDEN → procedural burden</w:t>
             </w:r>
           </w:p>
@@ -4340,9 +3664,6 @@
               <w:jc w:val="left"/>
             </w:pPr>
             <w:r>
-              <w:rPr>
-                <w:sz w:val="17"/>
-              </w:rPr>
               <w:t xml:space="preserve">The dominant perceived driver of subscriber attrition from container-based sanitation services was economic challenges faced by subscribers, and the most common mitigation strategy was developing individual rep…</w:t>
             </w:r>
           </w:p>
@@ -4916,7 +4237,7 @@
         <w:pStyle w:val="Compact"/>
       </w:pPr>
       <w:r>
-        <w:t xml:space="preserve">Of the 23 that kept AMSTAR 2, each was classed as a secondary systematic review. The recorded fields (publication type, design, method text, sample) support that unevenly: 10 name a registration, PRISMA or JBI method, 16 state a count of included studies, and 2 (S052, S327) show at most one weak signal (the word "systematic" or a review type) — a way to order full-text checks, not a finding (</w:t>
+        <w:t xml:space="preserve">Of the 23 that kept AMSTAR 2, each was classed as a secondary systematic review. The recorded fields (publication type, design, method text, sample) support that unevenly: 12 name a registration, PRISMA or JBI method, 18 state a count of included studies, and 0 () show at most one weak signal (the word "systematic" or a review type) — a way to order full-text checks, not a finding (</w:t>
       </w:r>
       <w:r>
         <w:rPr>
@@ -4943,7 +4264,7 @@
         <w:t xml:space="preserve"> </w:t>
       </w:r>
       <w:r>
-        <w:t xml:space="preserve">once its full text was read; S697's number of included studies was not extracted.</w:t>
+        <w:t xml:space="preserve">once its full text was read; S418, S438, S697, S052 and S327 were read in full text on 2026-10-03 (S697, a meta-analysis, and S438, S052 and S327 all state a search, selection and synthesis, so all keep AMSTAR 2).</w:t>
       </w:r>
     </w:p>
     <w:p>
@@ -4959,13 +4280,13 @@
           <w:bCs/>
           <w:b/>
         </w:rPr>
-        <w:t xml:space="preserve">Only 9 of the 23 received a formal AMSTAR 2 confidence rating</w:t>
-      </w:r>
-      <w:r>
-        <w:t xml:space="preserve"> </w:t>
-      </w:r>
-      <w:r>
-        <w:t xml:space="preserve">(S319 Critically Low, S324 Critically Low, S325 Critically Low, S344 Critically Low, S370 Critically Low, S372 Critically Low, S418 Critically Low, S438 Critically Low, S697 Critically Low; every rating given so far is Critically Low, or provisionally so, because of missing protocols, single-database searches, no list of excluded studies or no appraisal of the included studies); the other 14 are "Not ratable" because their extraction lacks the information for the critical items.</w:t>
+        <w:t xml:space="preserve">Only 11 of the 23 received a formal AMSTAR 2 confidence rating</w:t>
+      </w:r>
+      <w:r>
+        <w:t xml:space="preserve"> </w:t>
+      </w:r>
+      <w:r>
+        <w:t xml:space="preserve">(S052 Critically Low, S319 Critically Low, S324 Critically Low, S325 Critically Low, S327 Low, S344 Critically Low, S370 Critically Low, S372 Critically Low, S418 Critically Low, S438 Critically Low, S697 Critically Low; 10 of the 11 are Critically Low (some provisionally); the others are S327 Low, mostly because of missing protocols, single-database searches, no list of excluded studies or no appraisal of the included studies); the other 12 are "Not ratable" because their extraction lacks the information for the critical items.</w:t>
       </w:r>
       <w:r>
         <w:t xml:space="preserve"> </w:t>
@@ -4975,7 +4296,7 @@
           <w:bCs/>
           <w:b/>
         </w:rPr>
-        <w:t xml:space="preserve">So AMSTAR 2 so far tells the reader little beyond "low confidence"; the 14 unrated reviews need their full texts.</w:t>
+        <w:t xml:space="preserve">So AMSTAR 2 so far tells the reader little beyond "low confidence"; the 12 unrated reviews need their full texts.</w:t>
       </w:r>
     </w:p>
     <w:p>
@@ -5435,7 +4756,7 @@
         <w:t xml:space="preserve">Obtain the full text of the abstract-only studies that carry the most weight</w:t>
       </w:r>
       <w:r>
-        <w:t xml:space="preserve">: (S366, the RoB 2 study, was re-extracted 2026-09-29; the four abstract-only AMSTAR 2 reviews on 2026-10-02), the 14 AMSTAR 2 reviews still unrated (start with the weakest-evidenced in the audit,</w:t>
+        <w:t xml:space="preserve">: (S366, the RoB 2 study, was re-extracted 2026-09-29; the four abstract-only AMSTAR 2 reviews on 2026-10-02), the 12 AMSTAR 2 reviews still unrated (start with the weakest-evidenced in the audit,</w:t>
       </w:r>
       <w:r>
         <w:t xml:space="preserve"> </w:t>
@@ -5775,7 +5096,7 @@
     <w:bookmarkEnd w:id="34"/>
     <w:bookmarkEnd w:id="35"/>
     <w:sectPr>
-      <w:pgMar w:left="1134" w:right="1134" w:top="1134" w:bottom="1134"/>
+      <w:pgMar w:bottom="1134" w:left="1134" w:right="1134" w:top="1134"/>
     </w:sectPr>
   </w:body>
 </w:document>
@@ -6619,7 +5940,7 @@
       <w:color w:themeColor="accent1" w:themeShade="BF" w:val="365F91"/>
     </w:rPr>
   </w:style>
-  <w:style w:type="paragraph" w:customStyle="1" w:styleId="SourceCode">
+  <w:style w:customStyle="1" w:styleId="SourceCode" w:type="paragraph">
     <w:name w:val="Source Code"/>
     <w:basedOn w:val="Normal"/>
     <w:link w:val="VerbatimChar"/>
@@ -6627,7 +5948,7 @@
       <w:wordWrap w:val="off"/>
     </w:pPr>
   </w:style>
-  <w:style w:type="character" w:customStyle="1" w:styleId="KeywordTok">
+  <w:style w:customStyle="1" w:styleId="KeywordTok" w:type="character">
     <w:name w:val="KeywordTok"/>
     <w:basedOn w:val="VerbatimChar"/>
     <w:rPr>
@@ -6635,77 +5956,77 @@
       <w:b/>
     </w:rPr>
   </w:style>
-  <w:style w:type="character" w:customStyle="1" w:styleId="DataTypeTok">
+  <w:style w:customStyle="1" w:styleId="DataTypeTok" w:type="character">
     <w:name w:val="DataTypeTok"/>
     <w:basedOn w:val="VerbatimChar"/>
     <w:rPr>
       <w:color w:val="902000"/>
     </w:rPr>
   </w:style>
-  <w:style w:type="character" w:customStyle="1" w:styleId="DecValTok">
+  <w:style w:customStyle="1" w:styleId="DecValTok" w:type="character">
     <w:name w:val="DecValTok"/>
     <w:basedOn w:val="VerbatimChar"/>
     <w:rPr>
       <w:color w:val="40a070"/>
     </w:rPr>
   </w:style>
-  <w:style w:type="character" w:customStyle="1" w:styleId="BaseNTok">
+  <w:style w:customStyle="1" w:styleId="BaseNTok" w:type="character">
     <w:name w:val="BaseNTok"/>
     <w:basedOn w:val="VerbatimChar"/>
     <w:rPr>
       <w:color w:val="40a070"/>
     </w:rPr>
   </w:style>
-  <w:style w:type="character" w:customStyle="1" w:styleId="FloatTok">
+  <w:style w:customStyle="1" w:styleId="FloatTok" w:type="character">
     <w:name w:val="FloatTok"/>
     <w:basedOn w:val="VerbatimChar"/>
     <w:rPr>
       <w:color w:val="40a070"/>
     </w:rPr>
   </w:style>
-  <w:style w:type="character" w:customStyle="1" w:styleId="ConstantTok">
+  <w:style w:customStyle="1" w:styleId="ConstantTok" w:type="character">
     <w:name w:val="ConstantTok"/>
     <w:basedOn w:val="VerbatimChar"/>
     <w:rPr>
       <w:color w:val="880000"/>
     </w:rPr>
   </w:style>
-  <w:style w:type="character" w:customStyle="1" w:styleId="CharTok">
+  <w:style w:customStyle="1" w:styleId="CharTok" w:type="character">
     <w:name w:val="CharTok"/>
     <w:basedOn w:val="VerbatimChar"/>
     <w:rPr>
       <w:color w:val="4070a0"/>
     </w:rPr>
   </w:style>
-  <w:style w:type="character" w:customStyle="1" w:styleId="SpecialCharTok">
+  <w:style w:customStyle="1" w:styleId="SpecialCharTok" w:type="character">
     <w:name w:val="SpecialCharTok"/>
     <w:basedOn w:val="VerbatimChar"/>
     <w:rPr>
       <w:color w:val="4070a0"/>
     </w:rPr>
   </w:style>
-  <w:style w:type="character" w:customStyle="1" w:styleId="StringTok">
+  <w:style w:customStyle="1" w:styleId="StringTok" w:type="character">
     <w:name w:val="StringTok"/>
     <w:basedOn w:val="VerbatimChar"/>
     <w:rPr>
       <w:color w:val="4070a0"/>
     </w:rPr>
   </w:style>
-  <w:style w:type="character" w:customStyle="1" w:styleId="VerbatimStringTok">
+  <w:style w:customStyle="1" w:styleId="VerbatimStringTok" w:type="character">
     <w:name w:val="VerbatimStringTok"/>
     <w:basedOn w:val="VerbatimChar"/>
     <w:rPr>
       <w:color w:val="4070a0"/>
     </w:rPr>
   </w:style>
-  <w:style w:type="character" w:customStyle="1" w:styleId="SpecialStringTok">
+  <w:style w:customStyle="1" w:styleId="SpecialStringTok" w:type="character">
     <w:name w:val="SpecialStringTok"/>
     <w:basedOn w:val="VerbatimChar"/>
     <w:rPr>
       <w:color w:val="bb6688"/>
     </w:rPr>
   </w:style>
-  <w:style w:type="character" w:customStyle="1" w:styleId="ImportTok">
+  <w:style w:customStyle="1" w:styleId="ImportTok" w:type="character">
     <w:name w:val="ImportTok"/>
     <w:basedOn w:val="VerbatimChar"/>
     <w:rPr>
@@ -6713,7 +6034,7 @@
       <w:b/>
     </w:rPr>
   </w:style>
-  <w:style w:type="character" w:customStyle="1" w:styleId="CommentTok">
+  <w:style w:customStyle="1" w:styleId="CommentTok" w:type="character">
     <w:name w:val="CommentTok"/>
     <w:basedOn w:val="VerbatimChar"/>
     <w:rPr>
@@ -6721,7 +6042,7 @@
       <w:i/>
     </w:rPr>
   </w:style>
-  <w:style w:type="character" w:customStyle="1" w:styleId="DocumentationTok">
+  <w:style w:customStyle="1" w:styleId="DocumentationTok" w:type="character">
     <w:name w:val="DocumentationTok"/>
     <w:basedOn w:val="VerbatimChar"/>
     <w:rPr>
@@ -6729,7 +6050,7 @@
       <w:i/>
     </w:rPr>
   </w:style>
-  <w:style w:type="character" w:customStyle="1" w:styleId="AnnotationTok">
+  <w:style w:customStyle="1" w:styleId="AnnotationTok" w:type="character">
     <w:name w:val="AnnotationTok"/>
     <w:basedOn w:val="VerbatimChar"/>
     <w:rPr>
@@ -6738,7 +6059,7 @@
       <w:i/>
     </w:rPr>
   </w:style>
-  <w:style w:type="character" w:customStyle="1" w:styleId="CommentVarTok">
+  <w:style w:customStyle="1" w:styleId="CommentVarTok" w:type="character">
     <w:name w:val="CommentVarTok"/>
     <w:basedOn w:val="VerbatimChar"/>
     <w:rPr>
@@ -6747,28 +6068,28 @@
       <w:i/>
     </w:rPr>
   </w:style>
-  <w:style w:type="character" w:customStyle="1" w:styleId="OtherTok">
+  <w:style w:customStyle="1" w:styleId="OtherTok" w:type="character">
     <w:name w:val="OtherTok"/>
     <w:basedOn w:val="VerbatimChar"/>
     <w:rPr>
       <w:color w:val="007020"/>
     </w:rPr>
   </w:style>
-  <w:style w:type="character" w:customStyle="1" w:styleId="FunctionTok">
+  <w:style w:customStyle="1" w:styleId="FunctionTok" w:type="character">
     <w:name w:val="FunctionTok"/>
     <w:basedOn w:val="VerbatimChar"/>
     <w:rPr>
       <w:color w:val="06287e"/>
     </w:rPr>
   </w:style>
-  <w:style w:type="character" w:customStyle="1" w:styleId="VariableTok">
+  <w:style w:customStyle="1" w:styleId="VariableTok" w:type="character">
     <w:name w:val="VariableTok"/>
     <w:basedOn w:val="VerbatimChar"/>
     <w:rPr>
       <w:color w:val="19177c"/>
     </w:rPr>
   </w:style>
-  <w:style w:type="character" w:customStyle="1" w:styleId="ControlFlowTok">
+  <w:style w:customStyle="1" w:styleId="ControlFlowTok" w:type="character">
     <w:name w:val="ControlFlowTok"/>
     <w:basedOn w:val="VerbatimChar"/>
     <w:rPr>
@@ -6776,45 +6097,45 @@
       <w:b/>
     </w:rPr>
   </w:style>
-  <w:style w:type="character" w:customStyle="1" w:styleId="OperatorTok">
+  <w:style w:customStyle="1" w:styleId="OperatorTok" w:type="character">
     <w:name w:val="OperatorTok"/>
     <w:basedOn w:val="VerbatimChar"/>
     <w:rPr>
       <w:color w:val="666666"/>
     </w:rPr>
   </w:style>
-  <w:style w:type="character" w:customStyle="1" w:styleId="BuiltInTok">
+  <w:style w:customStyle="1" w:styleId="BuiltInTok" w:type="character">
     <w:name w:val="BuiltInTok"/>
     <w:basedOn w:val="VerbatimChar"/>
     <w:rPr>
       <w:color w:val="008000"/>
     </w:rPr>
   </w:style>
-  <w:style w:type="character" w:customStyle="1" w:styleId="ExtensionTok">
+  <w:style w:customStyle="1" w:styleId="ExtensionTok" w:type="character">
     <w:name w:val="ExtensionTok"/>
     <w:basedOn w:val="VerbatimChar"/>
     <w:rPr/>
   </w:style>
-  <w:style w:type="character" w:customStyle="1" w:styleId="PreprocessorTok">
+  <w:style w:customStyle="1" w:styleId="PreprocessorTok" w:type="character">
     <w:name w:val="PreprocessorTok"/>
     <w:basedOn w:val="VerbatimChar"/>
     <w:rPr>
       <w:color w:val="bc7a00"/>
     </w:rPr>
   </w:style>
-  <w:style w:type="character" w:customStyle="1" w:styleId="AttributeTok">
+  <w:style w:customStyle="1" w:styleId="AttributeTok" w:type="character">
     <w:name w:val="AttributeTok"/>
     <w:basedOn w:val="VerbatimChar"/>
     <w:rPr>
       <w:color w:val="7d9029"/>
     </w:rPr>
   </w:style>
-  <w:style w:type="character" w:customStyle="1" w:styleId="RegionMarkerTok">
+  <w:style w:customStyle="1" w:styleId="RegionMarkerTok" w:type="character">
     <w:name w:val="RegionMarkerTok"/>
     <w:basedOn w:val="VerbatimChar"/>
     <w:rPr/>
   </w:style>
-  <w:style w:type="character" w:customStyle="1" w:styleId="InformationTok">
+  <w:style w:customStyle="1" w:styleId="InformationTok" w:type="character">
     <w:name w:val="InformationTok"/>
     <w:basedOn w:val="VerbatimChar"/>
     <w:rPr>
@@ -6823,7 +6144,7 @@
       <w:i/>
     </w:rPr>
   </w:style>
-  <w:style w:type="character" w:customStyle="1" w:styleId="WarningTok">
+  <w:style w:customStyle="1" w:styleId="WarningTok" w:type="character">
     <w:name w:val="WarningTok"/>
     <w:basedOn w:val="VerbatimChar"/>
     <w:rPr>
@@ -6832,7 +6153,7 @@
       <w:i/>
     </w:rPr>
   </w:style>
-  <w:style w:type="character" w:customStyle="1" w:styleId="AlertTok">
+  <w:style w:customStyle="1" w:styleId="AlertTok" w:type="character">
     <w:name w:val="AlertTok"/>
     <w:basedOn w:val="VerbatimChar"/>
     <w:rPr>
@@ -6840,7 +6161,7 @@
       <w:b/>
     </w:rPr>
   </w:style>
-  <w:style w:type="character" w:customStyle="1" w:styleId="ErrorTok">
+  <w:style w:customStyle="1" w:styleId="ErrorTok" w:type="character">
     <w:name w:val="ErrorTok"/>
     <w:basedOn w:val="VerbatimChar"/>
     <w:rPr>
@@ -6848,7 +6169,7 @@
       <w:b/>
     </w:rPr>
   </w:style>
-  <w:style w:type="character" w:customStyle="1" w:styleId="NormalTok">
+  <w:style w:customStyle="1" w:styleId="NormalTok" w:type="character">
     <w:name w:val="NormalTok"/>
     <w:basedOn w:val="VerbatimChar"/>
     <w:rPr/>

</xml_diff>

<commit_message>
Sparse-record audit, S001-S200 second-extractor sample, AMSTAR 2 overlap check, S324 final, evidence-map text refresh, code-review fixes
Co-Authored-By: Claude Sonnet 5.5 <noreply@anthropic.com>
Claude-Session: https://claude.ai/code/session_014MhMGnb8qDcM9MkpTmcbeG
</commit_message>
<xml_diff>
--- a/legal-last-mile-systematic-review/06_outputs/PRELIMINARY_RESULTS_REPORT_2026-09-29.docx
+++ b/legal-last-mile-systematic-review/06_outputs/PRELIMINARY_RESULTS_REPORT_2026-09-29.docx
@@ -563,7 +563,7 @@
         <w:t xml:space="preserve"> </w:t>
       </w:r>
       <w:r>
-        <w:t xml:space="preserve">is free text; 126 studies name several countries or a region and are not counted below): India 133, Brazil 87, South Africa 84, United States 71, Ghana 53, Kenya 49, Mexico 37, Indonesia 30, Nigeria 28, Bangladesh 27. The dissertation's comparison countries are unevenly covered:</w:t>
+        <w:t xml:space="preserve">is free text; 124 studies name several countries or a region and are not counted below): India 133, Brazil 87, South Africa 84, United States 71, Ghana 53, Kenya 49, Mexico 37, Indonesia 30, Nigeria 28, Bangladesh 27. The dissertation's comparison countries are unevenly covered:</w:t>
       </w:r>
       <w:r>
         <w:t xml:space="preserve"> </w:t>
@@ -3297,7 +3297,7 @@
         <w:t xml:space="preserve">05_analysis/sensitivity/SENSITIVITY_ANALYSIS_2026-09-28.md</w:t>
       </w:r>
       <w:r>
-        <w:t xml:space="preserve">): under every scenario tried — dropping abstract-only extractions, dropping S589 (an unadjusted descriptive comparison in an ineligible-flagged study), collapsing linked reports, and dropping Family A's two coding judgment calls — the pre-stated conclusion tests for A, B and C hold; Family A's concordant share ranges 70.6–75.0%.</w:t>
+        <w:t xml:space="preserve">): under every scenario tried — dropping abstract-only extractions, dropping the sparse-audit rows that carry effect sizes, dropping S589 (an unadjusted descriptive comparison in an ineligible-flagged study), collapsing linked reports, and dropping Family A's two coding judgment calls — the pre-stated conclusion tests for A, B and C hold; Family A's concordant share ranges 72.2–77.8%.</w:t>
       </w:r>
     </w:p>
     <w:bookmarkEnd w:id="23"/>
@@ -4105,7 +4105,32 @@
         <w:pStyle w:val="Compact"/>
       </w:pPr>
       <w:r>
-        <w:t xml:space="preserve">62 studies were extracted from abstract or metadata only (5.3%); none has an effect-size row, so the SWiM syntheses are unaffected, but descriptive counts and ratings include them. There is no second extractor: extracted values have not been checked against the source papers.</w:t>
+        <w:t xml:space="preserve">62 studies were extracted from abstract or metadata only (5.3%); none has an effect-size row, so the SWiM syntheses are unaffected by them, but descriptive counts and ratings include them.</w:t>
+      </w:r>
+      <w:r>
+        <w:t xml:space="preserve"> </w:t>
+      </w:r>
+      <w:r>
+        <w:rPr>
+          <w:bCs/>
+          <w:b/>
+        </w:rPr>
+        <w:t xml:space="preserve">That count is a floor:</w:t>
+      </w:r>
+      <w:r>
+        <w:t xml:space="preserve"> </w:t>
+      </w:r>
+      <w:r>
+        <w:t xml:space="preserve">it counts one note prefix, and a sparse-record audit (</w:t>
+      </w:r>
+      <w:r>
+        <w:rPr>
+          <w:rStyle w:val="VerbatimChar"/>
+        </w:rPr>
+        <w:t xml:space="preserve">05_analysis/descriptive/SPARSE_RECORD_AUDIT_2026-10-04.md</w:t>
+      </w:r>
+      <w:r>
+        <w:t xml:space="preserve">) found 128 more rows with at least one sign of shallow extraction — 14 whose own notes say only the abstract or citation was read and 67 whose recorded location cites the abstract alone (a verification queue, not proof) — of which 3 carry effect-size rows. There is no second extractor: extracted values have not been checked against the source papers.</w:t>
       </w:r>
     </w:p>
     <w:p>
@@ -4330,7 +4355,29 @@
         <w:pStyle w:val="Compact"/>
       </w:pPr>
       <w:r>
-        <w:t xml:space="preserve">Reviews are secondary evidence and are never pooled as if primary; their primary studies may also be in this corpus (a double-counting risk not yet checked).</w:t>
+        <w:t xml:space="preserve">Reviews are secondary evidence and are never pooled as if primary. Whether their primary studies are also separate rows in this corpus was checked on 2026-10-04 for only 7 of the 23 reviews (those whose PDFs were to hand): their reference lists cite 48 distinct corpus studies, S319 (21), S325 (19) cite ten or more. This is an upper bound (background citations count) and does not read the included-studies tables, so the real double-counting risk is</w:t>
+      </w:r>
+      <w:r>
+        <w:t xml:space="preserve"> </w:t>
+      </w:r>
+      <w:r>
+        <w:rPr>
+          <w:bCs/>
+          <w:b/>
+        </w:rPr>
+        <w:t xml:space="preserve">still unresolved</w:t>
+      </w:r>
+      <w:r>
+        <w:t xml:space="preserve">, and 16 reviews are unchecked (</w:t>
+      </w:r>
+      <w:r>
+        <w:rPr>
+          <w:rStyle w:val="VerbatimChar"/>
+        </w:rPr>
+        <w:t xml:space="preserve">05_analysis/descriptive/AMSTAR2_OVERLAP_CHECK_2026-10-04.md</w:t>
+      </w:r>
+      <w:r>
+        <w:t xml:space="preserve">).</w:t>
       </w:r>
     </w:p>
     <w:p>
@@ -4771,13 +4818,25 @@
         <w:t xml:space="preserve"> </w:t>
       </w:r>
       <w:r>
-        <w:t xml:space="preserve">§3), then the 62 remaining abstract-only studies; re-extract (</w:t>
+        <w:t xml:space="preserve">§3), then the 62 remaining abstract-only studies and the 14 further strong candidates from the sparse-record audit; re-extract (</w:t>
       </w:r>
       <w:r>
         <w:rPr>
           <w:rStyle w:val="VerbatimChar"/>
         </w:rPr>
         <w:t xml:space="preserve">03_extraction/extracted_data/abstract_only_fulltext_request_list_2026-09-29.csv</w:t>
+      </w:r>
+      <w:r>
+        <w:t xml:space="preserve">,</w:t>
+      </w:r>
+      <w:r>
+        <w:t xml:space="preserve"> </w:t>
+      </w:r>
+      <w:r>
+        <w:rPr>
+          <w:rStyle w:val="VerbatimChar"/>
+        </w:rPr>
+        <w:t xml:space="preserve">05_analysis/descriptive/sparse_record_audit_2026-10-04.csv</w:t>
       </w:r>
       <w:r>
         <w:t xml:space="preserve">).</w:t>

</xml_diff>

<commit_message>
Full manuscript draft, PRISMA checklist status, researcher decision brief, report wording fixes
Co-Authored-By: Claude Sonnet 5.5 <noreply@anthropic.com>
Claude-Session: https://claude.ai/code/session_014MhMGnb8qDcM9MkpTmcbeG
</commit_message>
<xml_diff>
--- a/legal-last-mile-systematic-review/06_outputs/PRELIMINARY_RESULTS_REPORT_2026-09-29.docx
+++ b/legal-last-mile-systematic-review/06_outputs/PRELIMINARY_RESULTS_REPORT_2026-09-29.docx
@@ -4262,7 +4262,7 @@
         <w:pStyle w:val="Compact"/>
       </w:pPr>
       <w:r>
-        <w:t xml:space="preserve">Of the 23 that kept AMSTAR 2, each was classed as a secondary systematic review. The recorded fields (publication type, design, method text, sample) support that unevenly: 12 name a registration, PRISMA or JBI method, 18 state a count of included studies, and 0 () show at most one weak signal (the word "systematic" or a review type) — a way to order full-text checks, not a finding (</w:t>
+        <w:t xml:space="preserve">Of the 23 that kept AMSTAR 2, each was classed as a secondary systematic review. The recorded fields (publication type, design, method text, sample) support that unevenly: 12 name a registration, PRISMA or JBI method, 18 state a count of included studies, and none is left with only one weak signal — a way to order full-text checks, not a finding (</w:t>
       </w:r>
       <w:r>
         <w:rPr>
@@ -4311,7 +4311,7 @@
         <w:t xml:space="preserve"> </w:t>
       </w:r>
       <w:r>
-        <w:t xml:space="preserve">(S052 Critically Low, S319 Critically Low, S324 Critically Low, S325 Critically Low, S327 Low, S344 Critically Low, S370 Critically Low, S372 Critically Low, S418 Critically Low, S438 Critically Low, S697 Critically Low; 10 of the 11 are Critically Low (some provisionally); the others are S327 Low, mostly because of missing protocols, single-database searches, no list of excluded studies or no appraisal of the included studies); the other 12 are "Not ratable" because their extraction lacks the information for the critical items.</w:t>
+        <w:t xml:space="preserve">(S052 Critically Low, S319 Critically Low, S324 Critically Low, S325 Critically Low, S327 Low, S344 Critically Low, S370 Critically Low, S372 Critically Low, S418 Critically Low, S438 Critically Low, S697 Critically Low; 10 of the 11 are Critically Low; the others are S327 Low, mostly because of missing protocols, single-database searches, no list of excluded studies or no appraisal of the included studies); the other 12 are "Not ratable" because their extraction lacks the information for the critical items.</w:t>
       </w:r>
       <w:r>
         <w:t xml:space="preserve"> </w:t>
@@ -4880,7 +4880,7 @@
         <w:t xml:space="preserve">Decide the AMSTAR 2 question</w:t>
       </w:r>
       <w:r>
-        <w:t xml:space="preserve">: keep it (and obtain full texts so the 22 "Not ratable" reviews can be rated) or replace it for realist/scoping/mapping reviews; decide how to handle the non-systematic reviews now labelled</w:t>
+        <w:t xml:space="preserve">: keep it (and obtain full texts so the 12 "Not ratable" reviews can be rated) or replace it for realist/scoping/mapping reviews; decide how to handle the non-systematic reviews now labelled</w:t>
       </w:r>
       <w:r>
         <w:t xml:space="preserve"> </w:t>
@@ -4892,7 +4892,7 @@
         <w:t xml:space="preserve">NONE</w:t>
       </w:r>
       <w:r>
-        <w:t xml:space="preserve">. Check whether these reviews' primary studies are also in the corpus.</w:t>
+        <w:t xml:space="preserve">. Finish the check of whether these reviews' primary studies are also in the corpus (so far 7 of 23 reviews, reference lists only).</w:t>
       </w:r>
     </w:p>
     <w:p>
@@ -4908,13 +4908,25 @@
           <w:bCs/>
           <w:b/>
         </w:rPr>
-        <w:t xml:space="preserve">Second-extract a sample</w:t>
-      </w:r>
-      <w:r>
-        <w:t xml:space="preserve"> </w:t>
-      </w:r>
-      <w:r>
-        <w:t xml:space="preserve">(for example the 62 effect-size studies and the 47 no-reviewer includes) against the source papers to estimate extraction error.</w:t>
+        <w:t xml:space="preserve">Second-extract the prepared sample</w:t>
+      </w:r>
+      <w:r>
+        <w:t xml:space="preserve"> </w:t>
+      </w:r>
+      <w:r>
+        <w:t xml:space="preserve">(60 studies from S001–S200,</w:t>
+      </w:r>
+      <w:r>
+        <w:t xml:space="preserve"> </w:t>
+      </w:r>
+      <w:r>
+        <w:rPr>
+          <w:rStyle w:val="VerbatimChar"/>
+        </w:rPr>
+        <w:t xml:space="preserve">03_extraction/second_extractor/</w:t>
+      </w:r>
+      <w:r>
+        <w:t xml:space="preserve">) against the source papers to estimate extraction error; the sample cannot speak for later extractions, so a second sample from S201 onward is needed before any whole-corpus claim.</w:t>
       </w:r>
     </w:p>
     <w:p>

</xml_diff>

<commit_message>
Re-extract 12 more abstract-only studies from Drive full texts (S257-S288, S318, S338-S346); campaign notes; abstract-only 62 -> 37
Co-Authored-By: Claude Sonnet 5.5 <noreply@anthropic.com>
Claude-Session: https://claude.ai/code/session_014MhMGnb8qDcM9MkpTmcbeG
</commit_message>
<xml_diff>
--- a/legal-last-mile-systematic-review/06_outputs/PRELIMINARY_RESULTS_REPORT_2026-09-29.docx
+++ b/legal-last-mile-systematic-review/06_outputs/PRELIMINARY_RESULTS_REPORT_2026-09-29.docx
@@ -2,7 +2,7 @@
 <file path=word/document.xml><?xml version="1.0" encoding="utf-8"?>
 <w:document xmlns:w="http://schemas.openxmlformats.org/wordprocessingml/2006/main" xmlns:m="http://schemas.openxmlformats.org/officeDocument/2006/math" xmlns:r="http://schemas.openxmlformats.org/officeDocument/2006/relationships" xmlns:o="urn:schemas-microsoft-com:office:office" xmlns:v="urn:schemas-microsoft-com:vml" xmlns:w10="urn:schemas-microsoft-com:office:word" xmlns:a="http://schemas.openxmlformats.org/drawingml/2006/main" xmlns:pic="http://schemas.openxmlformats.org/drawingml/2006/picture" xmlns:wp="http://schemas.openxmlformats.org/drawingml/2006/wordprocessingDrawing">
   <w:body>
-    <w:bookmarkStart w:id="35" w:name="Xe60bbd2e07494804a12b927e464b940c6a770a1"/>
+    <w:bookmarkStart w:id="35" w:name="X81f507f4c8daf3e0472a965ec294b247f751ba1"/>
     <w:p>
       <w:pPr>
         <w:pStyle w:val="Heading1"/>
@@ -32,7 +32,7 @@
         <w:t xml:space="preserve"> </w:t>
       </w:r>
       <w:r>
-        <w:t xml:space="preserve">repository's own databases, with no human verification of extracted values against the source papers (</w:t>
+        <w:t xml:space="preserve">repository’s own databases, with no human verification of extracted values against the source papers (</w:t>
       </w:r>
       <w:r>
         <w:rPr>
@@ -95,7 +95,7 @@
         <w:t xml:space="preserve">and is labelled as such. No pooled effect exists and none is claimed.</w:t>
       </w:r>
     </w:p>
-    <w:bookmarkStart w:id="20" w:name="X6b536b7c9e4d7ae816764694dc1de0d2b4a50fa"/>
+    <w:bookmarkStart w:id="20" w:name="methods-and-progress-in-brief"/>
     <w:p>
       <w:pPr>
         <w:pStyle w:val="Heading2"/>
@@ -107,7 +107,7 @@
     <w:tbl>
       <w:tblPr>
         <w:tblStyle w:val="Table"/>
-        <w:tblW w:type="auto" w:w="0"/>
+        <w:tblW w:type="pct" w:w="5000"/>
         <w:tblLook w:firstRow="1" w:lastRow="0" w:firstColumn="0" w:lastColumn="0" w:noHBand="0" w:noVBand="0" w:val="0020"/>
         <w:jc w:val="start"/>
       </w:tblPr>
@@ -291,7 +291,19 @@
               <w:t xml:space="preserve">1,159 include / 1,117 exclude</w:t>
             </w:r>
             <w:r>
-              <w:t xml:space="preserve">; 1,383 never assessed. 151 of the excludes are E10 ("full text inaccessible"), so only</w:t>
+              <w:t xml:space="preserve">; 1,383 never assessed. 151 of the excludes are E10 (</w:t>
+            </w:r>
+            <w:r>
+              <w:t xml:space="preserve">“</w:t>
+            </w:r>
+            <w:r>
+              <w:t xml:space="preserve">full text inaccessible</w:t>
+            </w:r>
+            <w:r>
+              <w:t xml:space="preserve">”</w:t>
+            </w:r>
+            <w:r>
+              <w:t xml:space="preserve">), so only</w:t>
             </w:r>
             <w:r>
               <w:t xml:space="preserve"> </w:t>
@@ -333,7 +345,7 @@
               <w:jc w:val="left"/>
             </w:pPr>
             <w:r>
-              <w:t xml:space="preserve">1,159 studies, 92 codebook fields, by the AI; 62 from abstract/metadata only; no second extractor</w:t>
+              <w:t xml:space="preserve">1,159 studies, 92 codebook fields, by the AI; 37 from abstract/metadata only; no second extractor</w:t>
             </w:r>
           </w:p>
         </w:tc>
@@ -359,7 +371,7 @@
               <w:jc w:val="left"/>
             </w:pPr>
             <w:r>
-              <w:t xml:space="preserve">Rule-based batch ratings from extracted fields with design-matched tools: RoB 2 5, ROBINS-I 63, JBI Cross-Sectional 140, MMAT 205, CASP Qualitative 263, AMSTAR 2 23, Legal Framework 447, NONE 13. Legal Framework is the project's own</w:t>
+              <w:t xml:space="preserve">Rule-based batch ratings from extracted fields with design-matched tools: RoB 2 5, ROBINS-I 63, JBI Cross-Sectional 140, MMAT 205, CASP Qualitative 263, AMSTAR 2 23, Legal Framework 447, NONE 13. Legal Framework is the project’s own</w:t>
             </w:r>
             <w:r>
               <w:t xml:space="preserve"> </w:t>
@@ -408,7 +420,7 @@
       </w:tr>
     </w:tbl>
     <w:bookmarkEnd w:id="20"/>
-    <w:bookmarkStart w:id="26" w:name="X18f39e8df3d13dbd8b7dde05546b067742f8b0f"/>
+    <w:bookmarkStart w:id="26" w:name="X751e6fc843610c592b3525afb933fd2d4be0a8c"/>
     <w:p>
       <w:pPr>
         <w:pStyle w:val="Heading2"/>
@@ -417,7 +429,7 @@
         <w:t xml:space="preserve">2A. Preliminary findings drawn from the extracted evidence</w:t>
       </w:r>
     </w:p>
-    <w:bookmarkStart w:id="21" w:name="X2296c66291615a592759a3fcca287d743183726"/>
+    <w:bookmarkStart w:id="21" w:name="a.1-what-the-evidence-base-looks-like"/>
     <w:p>
       <w:pPr>
         <w:pStyle w:val="Heading3"/>
@@ -479,7 +491,22 @@
         <w:t xml:space="preserve">study_design_class</w:t>
       </w:r>
       <w:r>
-        <w:t xml:space="preserve">; 349 studies carry free-text values outside the 8-value enum — the commonest are variants of "case study", e.g. ethnographic case study (16); qualitative case study (10); they are not in the counts that follow): qualitative 267, mixed-methods 207, observational 147, quasi-experimental 65, doctrinal 44, jurimetric 39, secondary systematic reviews 36, experimental 5. By appraisal tool: RoB 2 5, ROBINS-I 63, JBI Cross-Sectional 140, MMAT 205, CASP Qualitative 263, AMSTAR 2 23, Legal Framework 447, NONE 13.</w:t>
+        <w:t xml:space="preserve">; 349 studies carry free-text values outside the 8-value enum — the commonest are variants of</w:t>
+      </w:r>
+      <w:r>
+        <w:t xml:space="preserve"> </w:t>
+      </w:r>
+      <w:r>
+        <w:t xml:space="preserve">“</w:t>
+      </w:r>
+      <w:r>
+        <w:t xml:space="preserve">case study</w:t>
+      </w:r>
+      <w:r>
+        <w:t xml:space="preserve">”</w:t>
+      </w:r>
+      <w:r>
+        <w:t xml:space="preserve">, e.g. ethnographic case study (16); qualitative case study (10); they are not in the counts that follow): qualitative 267, mixed-methods 207, observational 147, quasi-experimental 65, doctrinal 44, jurimetric 39, secondary systematic reviews 36, experimental 5. By appraisal tool: RoB 2 5, ROBINS-I 63, JBI Cross-Sectional 140, MMAT 205, CASP Qualitative 263, AMSTAR 2 23, Legal Framework 447, NONE 13.</w:t>
       </w:r>
     </w:p>
     <w:p>
@@ -501,7 +528,7 @@
         <w:t xml:space="preserve"> </w:t>
       </w:r>
       <w:r>
-        <w:t xml:space="preserve">68 (6%) — 63 quasi-experimental studies and 5 randomised trials (which are 4 distinct trials, see §3.4). 35 studies carry a numeric mechanism-certainty of 3 or 4 (the codebook's quasi-experimental or experimental evidence),</w:t>
+        <w:t xml:space="preserve">68 (6%) — 63 quasi-experimental studies and 5 randomised trials (which are 4 distinct trials, see §3.4). 35 studies carry a numeric mechanism-certainty of 3 or 4 (the codebook’s quasi-experimental or experimental evidence),</w:t>
       </w:r>
       <w:r>
         <w:t xml:space="preserve"> </w:t>
@@ -563,7 +590,7 @@
         <w:t xml:space="preserve"> </w:t>
       </w:r>
       <w:r>
-        <w:t xml:space="preserve">is free text; 124 studies name several countries or a region and are not counted below): India 133, Brazil 87, South Africa 84, United States 71, Ghana 53, Kenya 49, Mexico 37, Indonesia 30, Nigeria 28, Bangladesh 27. The dissertation's comparison countries are unevenly covered:</w:t>
+        <w:t xml:space="preserve">is free text; 124 studies name several countries or a region and are not counted below): India 133, Brazil 87, South Africa 84, United States 71, Ghana 53, Kenya 50, Mexico 37, Indonesia 30, Nigeria 28, Bangladesh 27. The dissertation’s comparison countries are unevenly covered:</w:t>
       </w:r>
       <w:r>
         <w:t xml:space="preserve"> </w:t>
@@ -617,11 +644,11 @@
         <w:t xml:space="preserve"> </w:t>
       </w:r>
       <w:r>
-        <w:t xml:space="preserve">urban (incl. informal settlements) 525, rural 298, mixed/both 270, peri-urban 29, blank/other 37; English 1073 of 1,159 studies, Spanish 32, Portuguese 22, French 6.</w:t>
+        <w:t xml:space="preserve">urban (incl. informal settlements) 525, rural 298, mixed/both 270, peri-urban 29, blank/other 37; English 1073 of 1,159 studies, Spanish 32, Portuguese 22, French 6.</w:t>
       </w:r>
     </w:p>
     <w:bookmarkEnd w:id="21"/>
-    <w:bookmarkStart w:id="22" w:name="Xe4897628cc72d7068e1ac24a35e6fdf8945df69"/>
+    <w:bookmarkStart w:id="22" w:name="X7fef767b73a561f4f0c86160beceb6d792673e0"/>
     <w:p>
       <w:pPr>
         <w:pStyle w:val="Heading3"/>
@@ -774,7 +801,7 @@
               <w:jc w:val="left"/>
             </w:pPr>
             <w:r>
-              <w:t xml:space="preserve">663</w:t>
+              <w:t xml:space="preserve">664</w:t>
             </w:r>
           </w:p>
         </w:tc>
@@ -873,7 +900,7 @@
               <w:jc w:val="left"/>
             </w:pPr>
             <w:r>
-              <w:t xml:space="preserve">577</w:t>
+              <w:t xml:space="preserve">579</w:t>
             </w:r>
           </w:p>
         </w:tc>
@@ -902,7 +929,7 @@
               <w:jc w:val="left"/>
             </w:pPr>
             <w:r>
-              <w:t xml:space="preserve">542</w:t>
+              <w:t xml:space="preserve">543</w:t>
             </w:r>
           </w:p>
         </w:tc>
@@ -1030,7 +1057,7 @@
               <w:jc w:val="left"/>
             </w:pPr>
             <w:r>
-              <w:t xml:space="preserve">475</w:t>
+              <w:t xml:space="preserve">481</w:t>
             </w:r>
           </w:p>
         </w:tc>
@@ -1094,7 +1121,7 @@
               <w:jc w:val="left"/>
             </w:pPr>
             <w:r>
-              <w:t xml:space="preserve">455</w:t>
+              <w:t xml:space="preserve">460</w:t>
             </w:r>
           </w:p>
         </w:tc>
@@ -1129,7 +1156,7 @@
               <w:jc w:val="left"/>
             </w:pPr>
             <w:r>
-              <w:t xml:space="preserve">381</w:t>
+              <w:t xml:space="preserve">382</w:t>
             </w:r>
           </w:p>
         </w:tc>
@@ -1158,7 +1185,7 @@
               <w:jc w:val="left"/>
             </w:pPr>
             <w:r>
-              <w:t xml:space="preserve">440</w:t>
+              <w:t xml:space="preserve">445</w:t>
             </w:r>
           </w:p>
         </w:tc>
@@ -1193,7 +1220,7 @@
               <w:jc w:val="left"/>
             </w:pPr>
             <w:r>
-              <w:t xml:space="preserve">301</w:t>
+              <w:t xml:space="preserve">302</w:t>
             </w:r>
           </w:p>
         </w:tc>
@@ -1257,7 +1284,7 @@
               <w:jc w:val="left"/>
             </w:pPr>
             <w:r>
-              <w:t xml:space="preserve">250</w:t>
+              <w:t xml:space="preserve">251</w:t>
             </w:r>
           </w:p>
         </w:tc>
@@ -1350,7 +1377,7 @@
               <w:jc w:val="left"/>
             </w:pPr>
             <w:r>
-              <w:t xml:space="preserve">260</w:t>
+              <w:t xml:space="preserve">262</w:t>
             </w:r>
           </w:p>
         </w:tc>
@@ -1478,7 +1505,7 @@
               <w:jc w:val="left"/>
             </w:pPr>
             <w:r>
-              <w:t xml:space="preserve">69</w:t>
+              <w:t xml:space="preserve">70</w:t>
             </w:r>
           </w:p>
         </w:tc>
@@ -1701,7 +1728,7 @@
               <w:jc w:val="left"/>
             </w:pPr>
             <w:r>
-              <w:t xml:space="preserve">23</w:t>
+              <w:t xml:space="preserve">24</w:t>
             </w:r>
           </w:p>
         </w:tc>
@@ -1736,11 +1763,11 @@
         <w:pStyle w:val="BodyText"/>
       </w:pPr>
       <w:r>
-        <w:t xml:space="preserve">Institutional fragmentation (663), official discretion/accommodation (597) and fees/tariffs (542) are the most frequently coded mechanisms; formal-connection (577) and affordability (507) outcomes are well represented, while sanitation access (457) is coded about half as often as water access (1,013). Mechanisms concerning redress and review — administrative review (69), judicial review (65), complaint (124), reconnection (23) — and application outcomes (refusal 107, delay 95, success 75) are coded far less often.</w:t>
+        <w:t xml:space="preserve">Institutional fragmentation (664), official discretion/accommodation (597) and fees/tariffs (543) are the most frequently coded mechanisms; formal-connection (579) and affordability (507) outcomes are well represented, while sanitation access (457) is coded about half as often as water access (1,013). Mechanisms concerning redress and review — administrative review (70), judicial review (65), complaint (124), reconnection (24) — and application outcomes (refusal 107, delay 95, success 75) are coded far less often.</w:t>
       </w:r>
     </w:p>
     <w:bookmarkEnd w:id="22"/>
-    <w:bookmarkStart w:id="23" w:name="X00c0f767203968f2c632e4777fb64c9b51e79f4"/>
+    <w:bookmarkStart w:id="23" w:name="X9b5020d61ce1f0ef12f61be6de13cd90e8bf114"/>
     <w:p>
       <w:pPr>
         <w:pStyle w:val="Heading3"/>
@@ -1764,7 +1791,7 @@
           <w:bCs/>
           <w:b/>
         </w:rPr>
-        <w:t xml:space="preserve">sign of each study's extracted association</w:t>
+        <w:t xml:space="preserve">sign of each study’s extracted association</w:t>
       </w:r>
       <w:r>
         <w:t xml:space="preserve"> </w:t>
@@ -1776,7 +1803,7 @@
     <w:tbl>
       <w:tblPr>
         <w:tblStyle w:val="Table"/>
-        <w:tblW w:type="auto" w:w="0"/>
+        <w:tblW w:type="pct" w:w="5000"/>
         <w:tblLook w:firstRow="1" w:lastRow="0" w:firstColumn="0" w:lastColumn="0" w:noHBand="0" w:noVBand="0" w:val="0020"/>
         <w:jc w:val="start"/>
       </w:tblPr>
@@ -2014,7 +2041,25 @@
         <w:t xml:space="preserve"> </w:t>
       </w:r>
       <w:r>
-        <w:t xml:space="preserve">In Family A, 15 of 20 (75.0%) are concordant with "legal/institutional recognition or eligibility is associated with better access" on a substantive reading (11 positive-sign studies plus 4 negative-sign studies in which unrecognised or informal status is associated with worse access). All 6 Family B studies report a positive or mixed association between administrative assistance/institutional trust and access, and none is negative. Three studies of private versus public ownership (S526, S539, S749; US ×2 and Brazil) all associate private ownership with worse affordability or progressivity.</w:t>
+        <w:t xml:space="preserve">In Family A, 15 of 20 (75.0%) are concordant with</w:t>
+      </w:r>
+      <w:r>
+        <w:t xml:space="preserve"> </w:t>
+      </w:r>
+      <w:r>
+        <w:t xml:space="preserve">“</w:t>
+      </w:r>
+      <w:r>
+        <w:t xml:space="preserve">legal/institutional recognition or eligibility is associated with better access</w:t>
+      </w:r>
+      <w:r>
+        <w:t xml:space="preserve">”</w:t>
+      </w:r>
+      <w:r>
+        <w:t xml:space="preserve"> </w:t>
+      </w:r>
+      <w:r>
+        <w:t xml:space="preserve">on a substantive reading (11 positive-sign studies plus 4 negative-sign studies in which unrecognised or informal status is associated with worse access). All 6 Family B studies report a positive or mixed association between administrative assistance/institutional trust and access, and none is negative. Three studies of private versus public ownership (S526, S539, S749; US ×2 and Brazil) all associate private ownership with worse affordability or progressivity.</w:t>
       </w:r>
     </w:p>
     <w:p>
@@ -2080,7 +2125,7 @@
     <w:tbl>
       <w:tblPr>
         <w:tblStyle w:val="Table"/>
-        <w:tblW w:type="auto" w:w="0"/>
+        <w:tblW w:type="pct" w:w="5000"/>
         <w:tblLook w:firstRow="1" w:lastRow="0" w:firstColumn="0" w:lastColumn="0" w:noHBand="0" w:noVBand="0" w:val="0020"/>
         <w:jc w:val="start"/>
       </w:tblPr>
@@ -2201,7 +2246,7 @@
               <w:jc w:val="left"/>
             </w:pPr>
             <w:r>
-              <w:t xml:space="preserve">Household acquisition of a legal land title under Peru's PETT (Proyecto Especial de Titulacion…</w:t>
+              <w:t xml:space="preserve">Household acquisition of a legal land title under Peru’s PETT (Proyecto Especial de Titulacion…</w:t>
             </w:r>
           </w:p>
         </w:tc>
@@ -2325,7 +2370,7 @@
               <w:jc w:val="left"/>
             </w:pPr>
             <w:r>
-              <w:t xml:space="preserve">Legal/administrative zoning status of residence (zoned vs. non-zoned/spontaneous-settlement lan…</w:t>
+              <w:t xml:space="preserve">Legal/administrative zoning status of residence (zoned vs. non-zoned/spontaneous-settlement lan…</w:t>
             </w:r>
           </w:p>
         </w:tc>
@@ -2387,7 +2432,7 @@
               <w:jc w:val="left"/>
             </w:pPr>
             <w:r>
-              <w:t xml:space="preserve">Municipal incorporation status (incorporated vs. unincorporated), which functions as the legal/…</w:t>
+              <w:t xml:space="preserve">Municipal incorporation status (incorporated vs. unincorporated), which functions as the legal/…</w:t>
             </w:r>
           </w:p>
         </w:tc>
@@ -2511,19 +2556,19 @@
               <w:jc w:val="left"/>
             </w:pPr>
             <w:r>
-              <w:t xml:space="preserve">Household home-ownership / tenure status (owner vs. non-owner) in a multilevel household-neighb…</w:t>
-            </w:r>
-          </w:p>
-        </w:tc>
-        <w:tc>
-          <w:tcPr/>
-          <w:p>
-            <w:pPr>
-              <w:pStyle w:val="Compact"/>
-              <w:jc w:val="left"/>
-            </w:pPr>
-            <w:r>
-              <w:t xml:space="preserve">positive (home ownership associated with higher odds of interruption -- direction counter to a simple "tenure…</w:t>
+              <w:t xml:space="preserve">Household home-ownership / tenure status (owner vs. non-owner) in a multilevel household-neighb…</w:t>
+            </w:r>
+          </w:p>
+        </w:tc>
+        <w:tc>
+          <w:tcPr/>
+          <w:p>
+            <w:pPr>
+              <w:pStyle w:val="Compact"/>
+              <w:jc w:val="left"/>
+            </w:pPr>
+            <w:r>
+              <w:t xml:space="preserve">positive (home ownership associated with higher odds of interruption – direction counter to a simple “tenure…</w:t>
             </w:r>
           </w:p>
         </w:tc>
@@ -2585,7 +2630,7 @@
               <w:jc w:val="left"/>
             </w:pPr>
             <w:r>
-              <w:t xml:space="preserve">negative (watershed-development intervention associated with increased, i.e. worsened, domestic water collecti…</w:t>
+              <w:t xml:space="preserve">negative (watershed-development intervention associated with increased, i.e. worsened, domestic water collecti…</w:t>
             </w:r>
           </w:p>
         </w:tc>
@@ -2945,19 +2990,19 @@
               <w:jc w:val="left"/>
             </w:pPr>
             <w:r>
-              <w:t xml:space="preserve">Private (vs. public) ownership of a Brazilian water and sanitation business corporation -- a go…</w:t>
-            </w:r>
-          </w:p>
-        </w:tc>
-        <w:tc>
-          <w:tcPr/>
-          <w:p>
-            <w:pPr>
-              <w:pStyle w:val="Compact"/>
-              <w:jc w:val="left"/>
-            </w:pPr>
-            <w:r>
-              <w:t xml:space="preserve">positive (private ownership associated with HIGHER water tariffs, i.e. lower affordability, relative to public…</w:t>
+              <w:t xml:space="preserve">Private (vs. public) ownership of a Brazilian water and sanitation business corporation – a go…</w:t>
+            </w:r>
+          </w:p>
+        </w:tc>
+        <w:tc>
+          <w:tcPr/>
+          <w:p>
+            <w:pPr>
+              <w:pStyle w:val="Compact"/>
+              <w:jc w:val="left"/>
+            </w:pPr>
+            <w:r>
+              <w:t xml:space="preserve">positive (private ownership associated with HIGHER water tariffs, i.e. lower affordability, relative to public…</w:t>
             </w:r>
           </w:p>
         </w:tc>
@@ -3007,7 +3052,7 @@
               <w:jc w:val="left"/>
             </w:pPr>
             <w:r>
-              <w:t xml:space="preserve">Creation of a new local government (kabupaten/kota) via pemekaran -- the legal/administrative s…</w:t>
+              <w:t xml:space="preserve">Creation of a new local government (kabupaten/kota) via pemekaran – the legal/administrative s…</w:t>
             </w:r>
           </w:p>
         </w:tc>
@@ -3297,11 +3342,11 @@
         <w:t xml:space="preserve">05_analysis/sensitivity/SENSITIVITY_ANALYSIS_2026-09-28.md</w:t>
       </w:r>
       <w:r>
-        <w:t xml:space="preserve">): under every scenario tried — dropping abstract-only extractions, dropping the sparse-audit rows that carry effect sizes, dropping S589 (an unadjusted descriptive comparison in an ineligible-flagged study), collapsing linked reports, and dropping Family A's two coding judgment calls — the pre-stated conclusion tests for A, B and C hold; Family A's concordant share ranges 72.2–77.8%.</w:t>
+        <w:t xml:space="preserve">): under every scenario tried — dropping abstract-only extractions, dropping the sparse-audit rows that carry effect sizes, dropping S589 (an unadjusted descriptive comparison in an ineligible-flagged study), collapsing linked reports, and dropping Family A’s two coding judgment calls — the pre-stated conclusion tests for A, B and C hold; Family A’s concordant share ranges 72.2–77.8%.</w:t>
       </w:r>
     </w:p>
     <w:bookmarkEnd w:id="23"/>
-    <w:bookmarkStart w:id="24" w:name="Xb4eed7b4d8c8ba5634212395df253e414bfffa5"/>
+    <w:bookmarkStart w:id="24" w:name="Xda4e275e3d1dee22274a76f92232a59474d36fb"/>
     <w:p>
       <w:pPr>
         <w:pStyle w:val="Heading3"/>
@@ -3339,13 +3384,28 @@
         <w:t xml:space="preserve"> </w:t>
       </w:r>
       <w:r>
-        <w:t xml:space="preserve">2 or higher ("mechanism directly observed" or above), showing the study's own recorded mechanism label beside the draft family, and the AI-extracted finding text:</w:t>
+        <w:t xml:space="preserve">2 or higher (</w:t>
+      </w:r>
+      <w:r>
+        <w:t xml:space="preserve">“</w:t>
+      </w:r>
+      <w:r>
+        <w:t xml:space="preserve">mechanism directly observed</w:t>
+      </w:r>
+      <w:r>
+        <w:t xml:space="preserve">”</w:t>
+      </w:r>
+      <w:r>
+        <w:t xml:space="preserve"> </w:t>
+      </w:r>
+      <w:r>
+        <w:t xml:space="preserve">or above), showing the study’s own recorded mechanism label beside the draft family, and the AI-extracted finding text:</w:t>
       </w:r>
     </w:p>
     <w:tbl>
       <w:tblPr>
         <w:tblStyle w:val="Table"/>
-        <w:tblW w:type="auto" w:w="0"/>
+        <w:tblW w:type="pct" w:w="5000"/>
         <w:tblLook w:firstRow="1" w:lastRow="0" w:firstColumn="0" w:lastColumn="0" w:noHBand="0" w:noVBand="0" w:val="0020"/>
         <w:jc w:val="start"/>
       </w:tblPr>
@@ -3478,7 +3538,7 @@
               <w:jc w:val="left"/>
             </w:pPr>
             <w:r>
-              <w:t xml:space="preserve">Formal water connection through Nairobi's piped grid does not equal reliable water access: neighborhood disparities exist even among neighbors with formally equivalent connections, because water rights are 'con…</w:t>
+              <w:t xml:space="preserve">Formal water connection through Nairobi’s piped grid does not equal reliable water access: neighborhood disparities exist even among neighbors with formally equivalent connections, because water rights are ’con…</w:t>
             </w:r>
           </w:p>
         </w:tc>
@@ -3671,7 +3731,7 @@
       </w:tr>
     </w:tbl>
     <w:bookmarkEnd w:id="24"/>
-    <w:bookmarkStart w:id="25" w:name="X63e47cac8a5fa259f5d713280c550b90111cd9c"/>
+    <w:bookmarkStart w:id="25" w:name="a.5-gaps-visible-in-the-records"/>
     <w:p>
       <w:pPr>
         <w:pStyle w:val="Heading3"/>
@@ -3699,7 +3759,7 @@
         <w:t xml:space="preserve"> </w:t>
       </w:r>
       <w:r>
-        <w:t xml:space="preserve">the Netherlands (1 single-country study) and Canada (15) — two of the dissertation's three comparison jurisdictions — are barely represented against Brazil (87); 599 (52%) of studies sit in the ten commonest single countries.</w:t>
+        <w:t xml:space="preserve">the Netherlands (1 single-country study) and Canada (15) — two of the dissertation’s three comparison jurisdictions — are barely represented against Brazil (87); 600 (52%) of studies sit in the ten commonest single countries.</w:t>
       </w:r>
     </w:p>
     <w:p>
@@ -3721,7 +3781,7 @@
         <w:t xml:space="preserve"> </w:t>
       </w:r>
       <w:r>
-        <w:t xml:space="preserve">5 randomised trials (4 distinct) and 63 quasi-experimental studies against 447 (39%) studies appraised with the project's own non-validated framework (the residual category for designs no published instrument fits, including doctrinal and documentary studies).</w:t>
+        <w:t xml:space="preserve">5 randomised trials (4 distinct) and 63 quasi-experimental studies against 447 (39%) studies appraised with the project’s own non-validated framework (the residual category for designs no published instrument fits, including doctrinal and documentary studies).</w:t>
       </w:r>
     </w:p>
     <w:p>
@@ -3770,7 +3830,7 @@
     </w:p>
     <w:bookmarkEnd w:id="25"/>
     <w:bookmarkEnd w:id="26"/>
-    <w:bookmarkStart w:id="27" w:name="X7825791a0ad70ad35da03ebcb91818c198d06b0"/>
+    <w:bookmarkStart w:id="27" w:name="X3dc13ec5543d1b932efa448cfb504a71c5a26cc"/>
     <w:p>
       <w:pPr>
         <w:pStyle w:val="Heading2"/>
@@ -3959,14 +4019,14 @@
           <w:bCs/>
           <w:b/>
         </w:rPr>
-        <w:t xml:space="preserve">The dissertation's comparative frame (Netherlands, Canada, Brazil) cannot be tested from this base as it stands</w:t>
+        <w:t xml:space="preserve">The dissertation’s comparative frame (Netherlands, Canada, Brazil) cannot be tested from this base as it stands</w:t>
       </w:r>
       <w:r>
         <w:t xml:space="preserve">: one Dutch and 15 Canadian single-country studies.</w:t>
       </w:r>
     </w:p>
     <w:bookmarkEnd w:id="27"/>
-    <w:bookmarkStart w:id="33" w:name="Xdbc4c41aa365aa65907d0e3d0b062329402c2bd"/>
+    <w:bookmarkStart w:id="33" w:name="confidence-and-limitations"/>
     <w:p>
       <w:pPr>
         <w:pStyle w:val="Heading2"/>
@@ -3975,7 +4035,7 @@
         <w:t xml:space="preserve">3. Confidence and limitations</w:t>
       </w:r>
     </w:p>
-    <w:bookmarkStart w:id="28" w:name="Xa0b8ecb7d593747e7673714312279d5d91bd4eb"/>
+    <w:bookmarkStart w:id="28" w:name="Xceb2f328da0f29a9ce86b72da2d0aeebe6ff921"/>
     <w:p>
       <w:pPr>
         <w:pStyle w:val="Heading3"/>
@@ -3989,11 +4049,11 @@
         <w:pStyle w:val="FirstParagraph"/>
       </w:pPr>
       <w:r>
-        <w:t xml:space="preserve">This is the author's tentative characterisation, not a GRADE judgment (none has been made): the direction-of-association statements rest on a small quantitative subset (20, 6 and 20 studies), AI-extracted and AI-coded values, mostly observational designs, and a screening stage that closed early. Reasons follow.</w:t>
+        <w:t xml:space="preserve">This is the author’s tentative characterisation, not a GRADE judgment (none has been made): the direction-of-association statements rest on a small quantitative subset (20, 6 and 20 studies), AI-extracted and AI-coded values, mostly observational designs, and a screening stage that closed early. Reasons follow.</w:t>
       </w:r>
     </w:p>
     <w:bookmarkEnd w:id="28"/>
-    <w:bookmarkStart w:id="29" w:name="X298a8ba920c94b80f6c6039f6ebba51dd81b3ef"/>
+    <w:bookmarkStart w:id="29" w:name="incomplete-screening"/>
     <w:p>
       <w:pPr>
         <w:pStyle w:val="Heading3"/>
@@ -4023,7 +4083,7 @@
         <w:pStyle w:val="Compact"/>
       </w:pPr>
       <w:r>
-        <w:t xml:space="preserve">151 of the 1,117 full-text excludes are E10 (inaccessible text), i.e. never judged on content.</w:t>
+        <w:t xml:space="preserve">151 of the 1,117 full-text excludes are E10 (inaccessible text), i.e. never judged on content.</w:t>
       </w:r>
     </w:p>
     <w:p>
@@ -4035,7 +4095,7 @@
         <w:pStyle w:val="Compact"/>
       </w:pPr>
       <w:r>
-        <w:t xml:space="preserve">Every full-text decision is the AI's; a human confirmed 200 includes (S001–S200) and no excludes; 73 decided rows carry no reviewer label. A prioritised queue for human review exists (</w:t>
+        <w:t xml:space="preserve">Every full-text decision is the AI’s; a human confirmed 200 includes (S001–S200) and no excludes; 73 decided rows carry no reviewer label. A prioritised queue for human review exists (</w:t>
       </w:r>
       <w:r>
         <w:rPr>
@@ -4083,11 +4143,26 @@
         <w:t xml:space="preserve"> </w:t>
       </w:r>
       <w:r>
-        <w:t xml:space="preserve">say "all records"; that wording should be checked against the README, which is narrower.)</w:t>
+        <w:t xml:space="preserve">say</w:t>
+      </w:r>
+      <w:r>
+        <w:t xml:space="preserve"> </w:t>
+      </w:r>
+      <w:r>
+        <w:t xml:space="preserve">“</w:t>
+      </w:r>
+      <w:r>
+        <w:t xml:space="preserve">all records</w:t>
+      </w:r>
+      <w:r>
+        <w:t xml:space="preserve">”</w:t>
+      </w:r>
+      <w:r>
+        <w:t xml:space="preserve">; that wording should be checked against the README, which is narrower.)</w:t>
       </w:r>
     </w:p>
     <w:bookmarkEnd w:id="29"/>
-    <w:bookmarkStart w:id="30" w:name="X2eaf1102d08f9c449bf1cbd38d4315f0860a56a"/>
+    <w:bookmarkStart w:id="30" w:name="missing-or-thin-data"/>
     <w:p>
       <w:pPr>
         <w:pStyle w:val="Heading3"/>
@@ -4105,7 +4180,7 @@
         <w:pStyle w:val="Compact"/>
       </w:pPr>
       <w:r>
-        <w:t xml:space="preserve">62 studies were extracted from abstract or metadata only (5.3%); none has an effect-size row, so the SWiM syntheses are unaffected by them, but descriptive counts and ratings include them.</w:t>
+        <w:t xml:space="preserve">37 studies were extracted from abstract or metadata only (3.2%); none has an effect-size row, so the SWiM syntheses are unaffected by them, but descriptive counts and ratings include them.</w:t>
       </w:r>
       <w:r>
         <w:t xml:space="preserve"> </w:t>
@@ -4142,7 +4217,40 @@
         <w:pStyle w:val="Compact"/>
       </w:pPr>
       <w:r>
-        <w:t xml:space="preserve">59 of 140 JBI ratings are "High concern", which here means sparse extraction rather than a poor study. For CASP and MMAT, several items are "Can't tell" for every study (for example CASP item 3, research design justified) because extraction did not capture methodological reporting. Ratings are rule-based and unreviewed by a human.</w:t>
+        <w:t xml:space="preserve">55 of 140 JBI ratings are</w:t>
+      </w:r>
+      <w:r>
+        <w:t xml:space="preserve"> </w:t>
+      </w:r>
+      <w:r>
+        <w:t xml:space="preserve">“</w:t>
+      </w:r>
+      <w:r>
+        <w:t xml:space="preserve">High concern</w:t>
+      </w:r>
+      <w:r>
+        <w:t xml:space="preserve">”</w:t>
+      </w:r>
+      <w:r>
+        <w:t xml:space="preserve">, which here means sparse extraction rather than a poor study. For CASP and MMAT, several items are</w:t>
+      </w:r>
+      <w:r>
+        <w:t xml:space="preserve"> </w:t>
+      </w:r>
+      <w:r>
+        <w:t xml:space="preserve">“</w:t>
+      </w:r>
+      <w:r>
+        <w:t xml:space="preserve">Can’t tell</w:t>
+      </w:r>
+      <w:r>
+        <w:t xml:space="preserve">”</w:t>
+      </w:r>
+      <w:r>
+        <w:t xml:space="preserve"> </w:t>
+      </w:r>
+      <w:r>
+        <w:t xml:space="preserve">for every study (for example CASP item 3, research design justified) because extraction did not capture methodological reporting. Ratings are rule-based and unreviewed by a human.</w:t>
       </w:r>
     </w:p>
     <w:p>
@@ -4158,7 +4266,7 @@
       </w:r>
     </w:p>
     <w:bookmarkEnd w:id="30"/>
-    <w:bookmarkStart w:id="31" w:name="X94fb04d2f3738b55cf492f5fd29e797c5c8dd9c"/>
+    <w:bookmarkStart w:id="31" w:name="X668d9b60d790f70df58f7087f254c5447e03037"/>
     <w:p>
       <w:pPr>
         <w:pStyle w:val="Heading3"/>
@@ -4274,7 +4382,40 @@
         <w:t xml:space="preserve"> </w:t>
       </w:r>
       <w:r>
-        <w:t xml:space="preserve">§3). None of them is now extracted from abstract or metadata only; S319, S324, S325 and S344 were read in full text on 2026-10-02 (S324 is a registered, well-reported review; S319 searched one database; S325 and S344 are single-author reviews with weak methods, but all four state a search, a selection process and a synthesis, so all keep AMSTAR 2); S329 is described as a "narrative review with systematic search" and S418 as a narrative/scoping review with a documented search (hybrids kept eligible with a noted caveat); S326, first flagged as an "evidence survey", was moved to</w:t>
+        <w:t xml:space="preserve">§3). None of them is now extracted from abstract or metadata only; S319, S324, S325 and S344 were read in full text on 2026-10-02 (S324 is a registered, well-reported review; S319 searched one database; S325 and S344 are single-author reviews with weak methods, but all four state a search, a selection process and a synthesis, so all keep AMSTAR 2); S329 is described as a</w:t>
+      </w:r>
+      <w:r>
+        <w:t xml:space="preserve"> </w:t>
+      </w:r>
+      <w:r>
+        <w:t xml:space="preserve">“</w:t>
+      </w:r>
+      <w:r>
+        <w:t xml:space="preserve">narrative review with systematic search</w:t>
+      </w:r>
+      <w:r>
+        <w:t xml:space="preserve">”</w:t>
+      </w:r>
+      <w:r>
+        <w:t xml:space="preserve"> </w:t>
+      </w:r>
+      <w:r>
+        <w:t xml:space="preserve">and S418 as a narrative/scoping review with a documented search (hybrids kept eligible with a noted caveat); S326, first flagged as an</w:t>
+      </w:r>
+      <w:r>
+        <w:t xml:space="preserve"> </w:t>
+      </w:r>
+      <w:r>
+        <w:t xml:space="preserve">“</w:t>
+      </w:r>
+      <w:r>
+        <w:t xml:space="preserve">evidence survey</w:t>
+      </w:r>
+      <w:r>
+        <w:t xml:space="preserve">”</w:t>
+      </w:r>
+      <w:r>
+        <w:t xml:space="preserve">, was moved to</w:t>
       </w:r>
       <w:r>
         <w:t xml:space="preserve"> </w:t>
@@ -4311,7 +4452,25 @@
         <w:t xml:space="preserve"> </w:t>
       </w:r>
       <w:r>
-        <w:t xml:space="preserve">(S052 Critically Low, S319 Critically Low, S324 Critically Low, S325 Critically Low, S327 Low, S344 Critically Low, S370 Critically Low, S372 Critically Low, S418 Critically Low, S438 Critically Low, S697 Critically Low; 10 of the 11 are Critically Low; the others are S327 Low, mostly because of missing protocols, single-database searches, no list of excluded studies or no appraisal of the included studies); the other 12 are "Not ratable" because their extraction lacks the information for the critical items.</w:t>
+        <w:t xml:space="preserve">(S052 Critically Low, S319 Critically Low, S324 Critically Low, S325 Critically Low, S327 Low, S344 Critically Low, S370 Critically Low, S372 Critically Low, S418 Critically Low, S438 Critically Low, S697 Critically Low; 10 of the 11 are Critically Low; the others are S327 Low, mostly because of missing protocols, single-database searches, no list of excluded studies or no appraisal of the included studies); the other 12 are</w:t>
+      </w:r>
+      <w:r>
+        <w:t xml:space="preserve"> </w:t>
+      </w:r>
+      <w:r>
+        <w:t xml:space="preserve">“</w:t>
+      </w:r>
+      <w:r>
+        <w:t xml:space="preserve">Not ratable</w:t>
+      </w:r>
+      <w:r>
+        <w:t xml:space="preserve">”</w:t>
+      </w:r>
+      <w:r>
+        <w:t xml:space="preserve"> </w:t>
+      </w:r>
+      <w:r>
+        <w:t xml:space="preserve">because their extraction lacks the information for the critical items.</w:t>
       </w:r>
       <w:r>
         <w:t xml:space="preserve"> </w:t>
@@ -4321,7 +4480,42 @@
           <w:bCs/>
           <w:b/>
         </w:rPr>
-        <w:t xml:space="preserve">So AMSTAR 2 so far tells the reader little beyond "low confidence"; the 12 unrated reviews need their full texts.</w:t>
+        <w:t xml:space="preserve">So AMSTAR 2 so far tells the reader little beyond</w:t>
+      </w:r>
+      <w:r>
+        <w:rPr>
+          <w:bCs/>
+          <w:b/>
+        </w:rPr>
+        <w:t xml:space="preserve"> </w:t>
+      </w:r>
+      <w:r>
+        <w:rPr>
+          <w:bCs/>
+          <w:b/>
+        </w:rPr>
+        <w:t xml:space="preserve">“</w:t>
+      </w:r>
+      <w:r>
+        <w:rPr>
+          <w:bCs/>
+          <w:b/>
+        </w:rPr>
+        <w:t xml:space="preserve">low confidence</w:t>
+      </w:r>
+      <w:r>
+        <w:rPr>
+          <w:bCs/>
+          <w:b/>
+        </w:rPr>
+        <w:t xml:space="preserve">”</w:t>
+      </w:r>
+      <w:r>
+        <w:rPr>
+          <w:bCs/>
+          <w:b/>
+        </w:rPr>
+        <w:t xml:space="preserve">; the 12 unrated reviews need their full texts.</w:t>
       </w:r>
     </w:p>
     <w:p>
@@ -4337,7 +4531,7 @@
           <w:iCs/>
           <w:i/>
         </w:rPr>
-        <w:t xml:space="preserve">Tentative flag (this report's own observation, not a project ruling):</w:t>
+        <w:t xml:space="preserve">Tentative flag (this report’s own observation, not a project ruling):</w:t>
       </w:r>
       <w:r>
         <w:t xml:space="preserve"> </w:t>
@@ -4445,7 +4639,22 @@
         <w:t xml:space="preserve"> </w:t>
       </w:r>
       <w:r>
-        <w:t xml:space="preserve">(Kenya) records only "randomized controlled trial"; cluster randomisation at compound level is</w:t>
+        <w:t xml:space="preserve">(Kenya) records only</w:t>
+      </w:r>
+      <w:r>
+        <w:t xml:space="preserve"> </w:t>
+      </w:r>
+      <w:r>
+        <w:t xml:space="preserve">“</w:t>
+      </w:r>
+      <w:r>
+        <w:t xml:space="preserve">randomized controlled trial</w:t>
+      </w:r>
+      <w:r>
+        <w:t xml:space="preserve">”</w:t>
+      </w:r>
+      <w:r>
+        <w:t xml:space="preserve">; cluster randomisation at compound level is</w:t>
       </w:r>
       <w:r>
         <w:t xml:space="preserve"> </w:t>
@@ -4461,7 +4670,25 @@
         <w:t xml:space="preserve"> </w:t>
       </w:r>
       <w:r>
-        <w:t xml:space="preserve">from the recorded unit of intervention and flagged "verify against source paper before finalizing rating" in its own tool field. Its rating is provisional.</w:t>
+        <w:t xml:space="preserve">from the recorded unit of intervention and flagged</w:t>
+      </w:r>
+      <w:r>
+        <w:t xml:space="preserve"> </w:t>
+      </w:r>
+      <w:r>
+        <w:t xml:space="preserve">“</w:t>
+      </w:r>
+      <w:r>
+        <w:t xml:space="preserve">verify against source paper before finalizing rating</w:t>
+      </w:r>
+      <w:r>
+        <w:t xml:space="preserve">”</w:t>
+      </w:r>
+      <w:r>
+        <w:t xml:space="preserve"> </w:t>
+      </w:r>
+      <w:r>
+        <w:t xml:space="preserve">in its own tool field. Its rating is provisional.</w:t>
       </w:r>
     </w:p>
     <w:p>
@@ -4499,7 +4726,43 @@
         <w:t xml:space="preserve"> </w:t>
       </w:r>
       <w:r>
-        <w:t xml:space="preserve">(but different surveys: 1,312 households in S366, 3,283 in S294). All five rate "Some concerns" overall; S057, S085, S294 and S879 still use many "No information" answers because extraction did not capture trial-conduct details.</w:t>
+        <w:t xml:space="preserve">(but different surveys: 1,312 households in S366, 3,283 in S294). All five rate</w:t>
+      </w:r>
+      <w:r>
+        <w:t xml:space="preserve"> </w:t>
+      </w:r>
+      <w:r>
+        <w:t xml:space="preserve">“</w:t>
+      </w:r>
+      <w:r>
+        <w:t xml:space="preserve">Some concerns</w:t>
+      </w:r>
+      <w:r>
+        <w:t xml:space="preserve">”</w:t>
+      </w:r>
+      <w:r>
+        <w:t xml:space="preserve"> </w:t>
+      </w:r>
+      <w:r>
+        <w:t xml:space="preserve">overall; S057, S085, S294 and S879 still use many</w:t>
+      </w:r>
+      <w:r>
+        <w:t xml:space="preserve"> </w:t>
+      </w:r>
+      <w:r>
+        <w:t xml:space="preserve">“</w:t>
+      </w:r>
+      <w:r>
+        <w:t xml:space="preserve">No information</w:t>
+      </w:r>
+      <w:r>
+        <w:t xml:space="preserve">”</w:t>
+      </w:r>
+      <w:r>
+        <w:t xml:space="preserve"> </w:t>
+      </w:r>
+      <w:r>
+        <w:t xml:space="preserve">answers because extraction did not capture trial-conduct details.</w:t>
       </w:r>
     </w:p>
     <w:p>
@@ -4527,11 +4790,29 @@
         <w:t xml:space="preserve"> </w:t>
       </w:r>
       <w:r>
-        <w:t xml:space="preserve">is a process evaluation conducted "in connection with a randomised controlled trial" (Orissa, India); it was appraised with ROBINS-I as a quasi-experimental study, and its full appraisal form covers the confounding domain only. Whether the parent trial itself is in the corpus, and whether any of its outcomes belong under RoB 2 cluster, is worth confirming. (The scan covered design and measure fields only, not full texts.)</w:t>
+        <w:t xml:space="preserve">is a process evaluation conducted</w:t>
+      </w:r>
+      <w:r>
+        <w:t xml:space="preserve"> </w:t>
+      </w:r>
+      <w:r>
+        <w:t xml:space="preserve">“</w:t>
+      </w:r>
+      <w:r>
+        <w:t xml:space="preserve">in connection with a randomised controlled trial</w:t>
+      </w:r>
+      <w:r>
+        <w:t xml:space="preserve">”</w:t>
+      </w:r>
+      <w:r>
+        <w:t xml:space="preserve"> </w:t>
+      </w:r>
+      <w:r>
+        <w:t xml:space="preserve">(Orissa, India); it was appraised with ROBINS-I as a quasi-experimental study, and its full appraisal form covers the confounding domain only. Whether the parent trial itself is in the corpus, and whether any of its outcomes belong under RoB 2 cluster, is worth confirming. (The scan covered design and measure fields only, not full texts.)</w:t>
       </w:r>
     </w:p>
     <w:bookmarkEnd w:id="31"/>
-    <w:bookmarkStart w:id="32" w:name="Xb828119e65871b4195cde448f7235a3fc3496cf"/>
+    <w:bookmarkStart w:id="32" w:name="other-unresolved-items-that-may-matter"/>
     <w:p>
       <w:pPr>
         <w:pStyle w:val="Heading3"/>
@@ -4677,13 +4958,55 @@
           <w:bCs/>
           <w:b/>
         </w:rPr>
-        <w:t xml:space="preserve">The "quantitative-synthesis-eligible" flag looks generous.</w:t>
-      </w:r>
-      <w:r>
-        <w:t xml:space="preserve"> </w:t>
-      </w:r>
-      <w:r>
-        <w:t xml:space="preserve">Of 247 studies flagged, 114 show nothing inferential in their extraction (descriptive or unclear), 29 name an inferential model but hold no interval, SE or p-value, and 104 carry some uncertainty information (heuristic;</w:t>
+        <w:t xml:space="preserve">The</w:t>
+      </w:r>
+      <w:r>
+        <w:rPr>
+          <w:bCs/>
+          <w:b/>
+        </w:rPr>
+        <w:t xml:space="preserve"> </w:t>
+      </w:r>
+      <w:r>
+        <w:rPr>
+          <w:bCs/>
+          <w:b/>
+        </w:rPr>
+        <w:t xml:space="preserve">“</w:t>
+      </w:r>
+      <w:r>
+        <w:rPr>
+          <w:bCs/>
+          <w:b/>
+        </w:rPr>
+        <w:t xml:space="preserve">quantitative-synthesis-eligible</w:t>
+      </w:r>
+      <w:r>
+        <w:rPr>
+          <w:bCs/>
+          <w:b/>
+        </w:rPr>
+        <w:t xml:space="preserve">”</w:t>
+      </w:r>
+      <w:r>
+        <w:rPr>
+          <w:bCs/>
+          <w:b/>
+        </w:rPr>
+        <w:t xml:space="preserve"> </w:t>
+      </w:r>
+      <w:r>
+        <w:rPr>
+          <w:bCs/>
+          <w:b/>
+        </w:rPr>
+        <w:t xml:space="preserve">flag looks generous.</w:t>
+      </w:r>
+      <w:r>
+        <w:t xml:space="preserve"> </w:t>
+      </w:r>
+      <w:r>
+        <w:t xml:space="preserve">Of 247 studies flagged, 112 show nothing inferential in their extraction (descriptive or unclear), 28 name an inferential model but hold no interval, SE or p-value, and 107 carry some uncertainty information (heuristic;</w:t>
       </w:r>
       <w:r>
         <w:t xml:space="preserve"> </w:t>
@@ -4744,7 +5067,7 @@
     </w:p>
     <w:bookmarkEnd w:id="32"/>
     <w:bookmarkEnd w:id="33"/>
-    <w:bookmarkStart w:id="34" w:name="Xd86374608330cc7d653d167e071e6b79cc9867b"/>
+    <w:bookmarkStart w:id="34" w:name="most-useful-next-steps-in-order"/>
     <w:p>
       <w:pPr>
         <w:pStyle w:val="Heading2"/>
@@ -4766,7 +5089,7 @@
           <w:bCs/>
           <w:b/>
         </w:rPr>
-        <w:t xml:space="preserve">Human check of the AI's screening</w:t>
+        <w:t xml:space="preserve">Human check of the AI’s screening</w:t>
       </w:r>
       <w:r>
         <w:t xml:space="preserve">: work</w:t>
@@ -4818,7 +5141,7 @@
         <w:t xml:space="preserve"> </w:t>
       </w:r>
       <w:r>
-        <w:t xml:space="preserve">§3), then the 62 remaining abstract-only studies and the 14 further strong candidates from the sparse-record audit; re-extract (</w:t>
+        <w:t xml:space="preserve">§3), then the 37 remaining abstract-only studies and the 14 further strong candidates from the sparse-record audit; re-extract (</w:t>
       </w:r>
       <w:r>
         <w:rPr>
@@ -4855,13 +5178,13 @@
           <w:bCs/>
           <w:b/>
         </w:rPr>
-        <w:t xml:space="preserve">Verify S879's randomisation unit against the paper</w:t>
-      </w:r>
-      <w:r>
-        <w:t xml:space="preserve"> </w:t>
-      </w:r>
-      <w:r>
-        <w:t xml:space="preserve">and confirm S189's parent-trial handling; then finalise or revise the RoB 2 cluster ratings.</w:t>
+        <w:t xml:space="preserve">Verify S879’s randomisation unit against the paper</w:t>
+      </w:r>
+      <w:r>
+        <w:t xml:space="preserve"> </w:t>
+      </w:r>
+      <w:r>
+        <w:t xml:space="preserve">and confirm S189’s parent-trial handling; then finalise or revise the RoB 2 cluster ratings.</w:t>
       </w:r>
     </w:p>
     <w:p>
@@ -4880,7 +5203,25 @@
         <w:t xml:space="preserve">Decide the AMSTAR 2 question</w:t>
       </w:r>
       <w:r>
-        <w:t xml:space="preserve">: keep it (and obtain full texts so the 12 "Not ratable" reviews can be rated) or replace it for realist/scoping/mapping reviews; decide how to handle the non-systematic reviews now labelled</w:t>
+        <w:t xml:space="preserve">: keep it (and obtain full texts so the 12</w:t>
+      </w:r>
+      <w:r>
+        <w:t xml:space="preserve"> </w:t>
+      </w:r>
+      <w:r>
+        <w:t xml:space="preserve">“</w:t>
+      </w:r>
+      <w:r>
+        <w:t xml:space="preserve">Not ratable</w:t>
+      </w:r>
+      <w:r>
+        <w:t xml:space="preserve">”</w:t>
+      </w:r>
+      <w:r>
+        <w:t xml:space="preserve"> </w:t>
+      </w:r>
+      <w:r>
+        <w:t xml:space="preserve">reviews can be rated) or replace it for realist/scoping/mapping reviews; decide how to handle the non-systematic reviews now labelled</w:t>
       </w:r>
       <w:r>
         <w:t xml:space="preserve"> </w:t>
@@ -4892,7 +5233,7 @@
         <w:t xml:space="preserve">NONE</w:t>
       </w:r>
       <w:r>
-        <w:t xml:space="preserve">. Finish the check of whether these reviews' primary studies are also in the corpus (so far 7 of 23 reviews, reference lists only).</w:t>
+        <w:t xml:space="preserve">. Finish the check of whether these reviews’ primary studies are also in the corpus (so far 7 of 23 reviews, reference lists only).</w:t>
       </w:r>
     </w:p>
     <w:p>

</xml_diff>

<commit_message>
Sparse-audit sweep: 47 rows re-extracted from Drive full texts; campaign notes generator; docs updated (sparse audit 165 -> 117 rows)
Co-Authored-By: Claude Sonnet 5.5 <noreply@anthropic.com>
Claude-Session: https://claude.ai/code/session_014MhMGnb8qDcM9MkpTmcbeG
</commit_message>
<xml_diff>
--- a/legal-last-mile-systematic-review/06_outputs/PRELIMINARY_RESULTS_REPORT_2026-09-29.docx
+++ b/legal-last-mile-systematic-review/06_outputs/PRELIMINARY_RESULTS_REPORT_2026-09-29.docx
@@ -4205,7 +4205,7 @@
         <w:t xml:space="preserve">05_analysis/descriptive/SPARSE_RECORD_AUDIT_2026-10-04.md</w:t>
       </w:r>
       <w:r>
-        <w:t xml:space="preserve">) found 128 more rows with at least one sign of shallow extraction — 14 whose own notes say only the abstract or citation was read and 67 whose recorded location cites the abstract alone (a verification queue, not proof) — of which 3 carry effect-size rows. There is no second extractor: extracted values have not been checked against the source papers.</w:t>
+        <w:t xml:space="preserve">) found 80 more rows with at least one sign of shallow extraction — 12 whose own notes say only the abstract or citation was read and 21 whose recorded location cites the abstract alone (a verification queue, not proof) — of which 2 carry effect-size rows. There is no second extractor: extracted values have not been checked against the source papers.</w:t>
       </w:r>
     </w:p>
     <w:p>
@@ -4370,7 +4370,7 @@
         <w:pStyle w:val="Compact"/>
       </w:pPr>
       <w:r>
-        <w:t xml:space="preserve">Of the 23 that kept AMSTAR 2, each was classed as a secondary systematic review. The recorded fields (publication type, design, method text, sample) support that unevenly: 12 name a registration, PRISMA or JBI method, 18 state a count of included studies, and none is left with only one weak signal — a way to order full-text checks, not a finding (</w:t>
+        <w:t xml:space="preserve">Of the 23 that kept AMSTAR 2, each was classed as a secondary systematic review. The recorded fields (publication type, design, method text, sample) support that unevenly: 12 name a registration, PRISMA or JBI method, 19 state a count of included studies, and none is left with only one weak signal — a way to order full-text checks, not a finding (</w:t>
       </w:r>
       <w:r>
         <w:rPr>
@@ -4446,13 +4446,13 @@
           <w:bCs/>
           <w:b/>
         </w:rPr>
-        <w:t xml:space="preserve">Only 11 of the 23 received a formal AMSTAR 2 confidence rating</w:t>
-      </w:r>
-      <w:r>
-        <w:t xml:space="preserve"> </w:t>
-      </w:r>
-      <w:r>
-        <w:t xml:space="preserve">(S052 Critically Low, S319 Critically Low, S324 Critically Low, S325 Critically Low, S327 Low, S344 Critically Low, S370 Critically Low, S372 Critically Low, S418 Critically Low, S438 Critically Low, S697 Critically Low; 10 of the 11 are Critically Low; the others are S327 Low, mostly because of missing protocols, single-database searches, no list of excluded studies or no appraisal of the included studies); the other 12 are</w:t>
+        <w:t xml:space="preserve">Only 12 of the 23 received a formal AMSTAR 2 confidence rating</w:t>
+      </w:r>
+      <w:r>
+        <w:t xml:space="preserve"> </w:t>
+      </w:r>
+      <w:r>
+        <w:t xml:space="preserve">(S052 Critically Low, S319 Critically Low, S324 Critically Low, S325 Critically Low, S327 Low, S328 Critically Low, S344 Critically Low, S370 Critically Low, S372 Critically Low, S418 Critically Low, S438 Critically Low, S697 Critically Low; 11 of the 12 are Critically Low; the others are S327 Low, mostly because of missing protocols, single-database searches, no list of excluded studies or no appraisal of the included studies); the other 11 are</w:t>
       </w:r>
       <w:r>
         <w:t xml:space="preserve"> </w:t>
@@ -4515,7 +4515,7 @@
           <w:bCs/>
           <w:b/>
         </w:rPr>
-        <w:t xml:space="preserve">; the 12 unrated reviews need their full texts.</w:t>
+        <w:t xml:space="preserve">; the 11 unrated reviews need their full texts.</w:t>
       </w:r>
     </w:p>
     <w:p>
@@ -5006,7 +5006,7 @@
         <w:t xml:space="preserve"> </w:t>
       </w:r>
       <w:r>
-        <w:t xml:space="preserve">Of 247 studies flagged, 112 show nothing inferential in their extraction (descriptive or unclear), 28 name an inferential model but hold no interval, SE or p-value, and 107 carry some uncertainty information (heuristic;</w:t>
+        <w:t xml:space="preserve">Of 247 studies flagged, 113 show nothing inferential in their extraction (descriptive or unclear), 27 name an inferential model but hold no interval, SE or p-value, and 107 carry some uncertainty information (heuristic;</w:t>
       </w:r>
       <w:r>
         <w:t xml:space="preserve"> </w:t>
@@ -5126,7 +5126,7 @@
         <w:t xml:space="preserve">Obtain the full text of the abstract-only studies that carry the most weight</w:t>
       </w:r>
       <w:r>
-        <w:t xml:space="preserve">: (S366, the RoB 2 study, was re-extracted 2026-09-29; the four abstract-only AMSTAR 2 reviews on 2026-10-02), the 12 AMSTAR 2 reviews still unrated (start with the weakest-evidenced in the audit,</w:t>
+        <w:t xml:space="preserve">: (S366, the RoB 2 study, was re-extracted 2026-09-29; the four abstract-only AMSTAR 2 reviews on 2026-10-02), the 11 AMSTAR 2 reviews still unrated (start with the weakest-evidenced in the audit,</w:t>
       </w:r>
       <w:r>
         <w:t xml:space="preserve"> </w:t>
@@ -5141,7 +5141,7 @@
         <w:t xml:space="preserve"> </w:t>
       </w:r>
       <w:r>
-        <w:t xml:space="preserve">§3), then the 37 remaining abstract-only studies and the 14 further strong candidates from the sparse-record audit; re-extract (</w:t>
+        <w:t xml:space="preserve">§3), then the 37 remaining abstract-only studies and the 12 further strong candidates from the sparse-record audit; re-extract (</w:t>
       </w:r>
       <w:r>
         <w:rPr>
@@ -5203,7 +5203,7 @@
         <w:t xml:space="preserve">Decide the AMSTAR 2 question</w:t>
       </w:r>
       <w:r>
-        <w:t xml:space="preserve">: keep it (and obtain full texts so the 12</w:t>
+        <w:t xml:space="preserve">: keep it (and obtain full texts so the 11</w:t>
       </w:r>
       <w:r>
         <w:t xml:space="preserve"> </w:t>

</xml_diff>

<commit_message>
A16: exposure/outcome columns in the adjudication sheet; the AI-versus-AI excludes finding added to generated limitations and the preliminary report
Co-Authored-By: Claude Sonnet 5.5 <noreply@anthropic.com>
Claude-Session: https://claude.ai/code/session_014MhMGnb8qDcM9MkpTmcbeG
</commit_message>
<xml_diff>
--- a/legal-last-mile-systematic-review/06_outputs/PRELIMINARY_RESULTS_REPORT_2026-09-29.docx
+++ b/legal-last-mile-systematic-review/06_outputs/PRELIMINARY_RESULTS_REPORT_2026-09-29.docx
@@ -4116,6 +4116,43 @@
         <w:pStyle w:val="Compact"/>
       </w:pPr>
       <w:r>
+        <w:rPr>
+          <w:bCs/>
+          <w:b/>
+        </w:rPr>
+        <w:t xml:space="preserve">An AI-versus-AI check found many contested excludes.</w:t>
+      </w:r>
+      <w:r>
+        <w:t xml:space="preserve"> </w:t>
+      </w:r>
+      <w:r>
+        <w:t xml:space="preserve">Two non-Claude models (Codex, Gemini), blind to the original decision, re-read 99 full-text decisions whose PDF was available; of the 70 the AI had excluded, 34 were judged includes (concentrated in E01 wrong topic and E06 engineering only). This was not human-adjudicated, the models may read the criteria too loosely, and nothing was changed; if even a fraction are eligible, the exclusion log and every count built on it are understated. The researcher’s reading list is</w:t>
+      </w:r>
+      <w:r>
+        <w:t xml:space="preserve"> </w:t>
+      </w:r>
+      <w:r>
+        <w:rPr>
+          <w:rStyle w:val="VerbatimChar"/>
+        </w:rPr>
+        <w:t xml:space="preserve">02_screening/full_text/A16_ADJUDICATION_SHEET_2026-10-04.md</w:t>
+      </w:r>
+      <w:r>
+        <w:t xml:space="preserve"> </w:t>
+      </w:r>
+      <w:r>
+        <w:t xml:space="preserve">(open item A16).</w:t>
+      </w:r>
+    </w:p>
+    <w:p>
+      <w:pPr>
+        <w:numPr>
+          <w:ilvl w:val="0"/>
+          <w:numId w:val="1005"/>
+        </w:numPr>
+        <w:pStyle w:val="Compact"/>
+      </w:pPr>
+      <w:r>
         <w:t xml:space="preserve">At title/abstract stage the human second pass covered the 3,665 include-plus-unsure records only; the 22,557 records the AI excluded were not human-checked, so any wrongly excluded record is invisible to this review. The 99.8% agreement on the reviewed set is unusually high and was flagged by the project itself. (</w:t>
       </w:r>
       <w:r>
@@ -4262,7 +4299,7 @@
         <w:pStyle w:val="Compact"/>
       </w:pPr>
       <w:r>
-        <w:t xml:space="preserve">Of 62 effect-size rows, 7 give a confidence interval and 25 a standard error; estimates are as the papers report them and none is pooled.</w:t>
+        <w:t xml:space="preserve">Of 62 effect-size rows, 8 give a confidence interval and 25 a standard error; estimates are as the papers report them and none is pooled.</w:t>
       </w:r>
     </w:p>
     <w:bookmarkEnd w:id="30"/>
@@ -5040,7 +5077,7 @@
         <w:t xml:space="preserve"> </w:t>
       </w:r>
       <w:r>
-        <w:t xml:space="preserve">found 1 new item(s) besides the known S589 row (S312 adjusted_blank); but an interval could be checked for only 5 of 62 rows, so this is weak assurance.</w:t>
+        <w:t xml:space="preserve">found 0 new item(s) besides the known S589 row (none); but an interval could be checked for only 6 of 62 rows, so this is weak assurance.</w:t>
       </w:r>
     </w:p>
     <w:p>

</xml_diff>

<commit_message>
A16: stratified projection of the blind-reviewer rate (about 468 implied includes if the models were right), computed into the drafts
Co-Authored-By: Claude Opus 5.5 <noreply@anthropic.com>
Claude-Session: https://claude.ai/code/session_014MhMGnb8qDcM9MkpTmcbeG
</commit_message>
<xml_diff>
--- a/legal-last-mile-systematic-review/06_outputs/PRELIMINARY_RESULTS_REPORT_2026-09-29.docx
+++ b/legal-last-mile-systematic-review/06_outputs/PRELIMINARY_RESULTS_REPORT_2026-09-29.docx
@@ -3600,7 +3600,7 @@
               <w:jc w:val="left"/>
             </w:pPr>
             <w:r>
-              <w:t xml:space="preserve">Community members and professionals engaged in environmental health literacy (EHL) efforts on Tribal lands face persistent challenges in skill-building, obtaining accessible information, and navigating the laye…</w:t>
+              <w:t xml:space="preserve">Each case illustrates one literacy level in tribal water-quality contexts: Apsaalooke (functional EHL: accessible information and skills), Anishinaabe (interactive EHL), Hoopa Valley (critical EHL; the tribal o…</w:t>
             </w:r>
           </w:p>
         </w:tc>
@@ -4126,7 +4126,7 @@
         <w:t xml:space="preserve"> </w:t>
       </w:r>
       <w:r>
-        <w:t xml:space="preserve">Two non-Claude models (Codex, Gemini), blind to the original decision, re-read 99 full-text decisions whose PDF was available; of the 70 the AI had excluded, 34 were judged includes (concentrated in E01 wrong topic and E06 engineering only). This was not human-adjudicated, the models may read the criteria too loosely, and nothing was changed; if even a fraction are eligible, the exclusion log and every count built on it are understated. The researcher’s reading list is</w:t>
+        <w:t xml:space="preserve">Two non-Claude models (Codex, Gemini), blind to the original decision, re-read 99 full-text decisions whose PDF was available; of the 70 the AI had excluded, 34 were judged includes (concentrated in E01 wrong topic and E06 engineering only). This was not human-adjudicated, the models may read the criteria too loosely, and nothing was changed; scaled by exclusion code the rate would imply roughly 468 further includes if the models were right (arithmetic only, against 1,159 current includes); if even a fraction are eligible, the exclusion log and every count built on it are understated. The researcher’s reading list is</w:t>
       </w:r>
       <w:r>
         <w:t xml:space="preserve"> </w:t>
@@ -4242,7 +4242,7 @@
         <w:t xml:space="preserve">05_analysis/descriptive/SPARSE_RECORD_AUDIT_2026-10-04.md</w:t>
       </w:r>
       <w:r>
-        <w:t xml:space="preserve">) found 80 more rows with at least one sign of shallow extraction — 12 whose own notes say only the abstract or citation was read and 21 whose recorded location cites the abstract alone (a verification queue, not proof) — of which 2 carry effect-size rows. There is no second extractor: extracted values have not been checked against the source papers.</w:t>
+        <w:t xml:space="preserve">) found 73 more rows with at least one sign of shallow extraction — 12 whose own notes say only the abstract or citation was read and 21 whose recorded location cites the abstract alone (a verification queue, not proof) — of which 2 carry effect-size rows. There is no second extractor: extracted values have not been checked against the source papers.</w:t>
       </w:r>
     </w:p>
     <w:p>
@@ -5043,7 +5043,7 @@
         <w:t xml:space="preserve"> </w:t>
       </w:r>
       <w:r>
-        <w:t xml:space="preserve">Of 247 studies flagged, 113 show nothing inferential in their extraction (descriptive or unclear), 27 name an inferential model but hold no interval, SE or p-value, and 107 carry some uncertainty information (heuristic;</w:t>
+        <w:t xml:space="preserve">Of 247 studies flagged, 111 show nothing inferential in their extraction (descriptive or unclear), 28 name an inferential model but hold no interval, SE or p-value, and 108 carry some uncertainty information (heuristic;</w:t>
       </w:r>
       <w:r>
         <w:t xml:space="preserve"> </w:t>

</xml_diff>